<commit_message>
backend pretty much done
just no testing yet
</commit_message>
<xml_diff>
--- a/03-documentation/documentation.docx
+++ b/03-documentation/documentation.docx
@@ -2,276 +2,6 @@
 <file path=word/document.xml><?xml version="1.0" encoding="utf-8"?>
 <w:document xmlns:wpc="http://schemas.microsoft.com/office/word/2010/wordprocessingCanvas" xmlns:cx="http://schemas.microsoft.com/office/drawing/2014/chartex" xmlns:cx1="http://schemas.microsoft.com/office/drawing/2015/9/8/chartex" xmlns:cx2="http://schemas.microsoft.com/office/drawing/2015/10/21/chartex" xmlns:cx3="http://schemas.microsoft.com/office/drawing/2016/5/9/chartex" xmlns:cx4="http://schemas.microsoft.com/office/drawing/2016/5/10/chartex" xmlns:cx5="http://schemas.microsoft.com/office/drawing/2016/5/11/chartex" xmlns:cx6="http://schemas.microsoft.com/office/drawing/2016/5/12/chartex" xmlns:cx7="http://schemas.microsoft.com/office/drawing/2016/5/13/chartex" xmlns:cx8="http://schemas.microsoft.com/office/drawing/2016/5/14/chartex" xmlns:mc="http://schemas.openxmlformats.org/markup-compatibility/2006" xmlns:aink="http://schemas.microsoft.com/office/drawing/2016/ink" xmlns:am3d="http://schemas.microsoft.com/office/drawing/2017/model3d" xmlns:o="urn:schemas-microsoft-com:office:office" xmlns:oel="http://schemas.microsoft.com/office/2019/extlst" xmlns:r="http://schemas.openxmlformats.org/officeDocument/2006/relationships" xmlns:m="http://schemas.openxmlformats.org/officeDocument/2006/math" xmlns:v="urn:schemas-microsoft-com:vml" xmlns:wp14="http://schemas.microsoft.com/office/word/2010/wordprocessingDrawing" xmlns:wp="http://schemas.openxmlformats.org/drawingml/2006/wordprocessingDrawing" xmlns:w10="urn:schemas-microsoft-com:office:word" xmlns:w="http://schemas.openxmlformats.org/wordprocessingml/2006/main" xmlns:w14="http://schemas.microsoft.com/office/word/2010/wordml" xmlns:w15="http://schemas.microsoft.com/office/word/2012/wordml" xmlns:w16cex="http://schemas.microsoft.com/office/word/2018/wordml/cex" xmlns:w16cid="http://schemas.microsoft.com/office/word/2016/wordml/cid" xmlns:w16="http://schemas.microsoft.com/office/word/2018/wordml" xmlns:w16du="http://schemas.microsoft.com/office/word/2023/wordml/word16du" xmlns:w16sdtdh="http://schemas.microsoft.com/office/word/2020/wordml/sdtdatahash" xmlns:w16sdtfl="http://schemas.microsoft.com/office/word/2024/wordml/sdtformatlock" xmlns:w16se="http://schemas.microsoft.com/office/word/2015/wordml/symex" xmlns:wpg="http://schemas.microsoft.com/office/word/2010/wordprocessingGroup" xmlns:wpi="http://schemas.microsoft.com/office/word/2010/wordprocessingInk" xmlns:wne="http://schemas.microsoft.com/office/word/2006/wordml" xmlns:wps="http://schemas.microsoft.com/office/word/2010/wordprocessingShape" mc:Ignorable="w14 w15 w16se w16cid w16 w16cex w16sdtdh w16sdtfl w16du wp14">
   <w:body>
-    <w:sdt>
-      <w:sdtPr>
-        <w:rPr>
-          <w:sz w:val="36"/>
-          <w:szCs w:val="36"/>
-        </w:rPr>
-        <w:alias w:val="Titel"/>
-        <w:tag w:val=""/>
-        <w:id w:val="-933740756"/>
-        <w:placeholder>
-          <w:docPart w:val="C5304EA0CA654A5986347505373CA065"/>
-        </w:placeholder>
-        <w:dataBinding w:prefixMappings="xmlns:ns0='http://purl.org/dc/elements/1.1/' xmlns:ns1='http://schemas.openxmlformats.org/package/2006/metadata/core-properties' " w:xpath="/ns1:coreProperties[1]/ns0:title[1]" w:storeItemID="{6C3C8BC8-F283-45AE-878A-BAB7291924A1}"/>
-        <w:text/>
-      </w:sdtPr>
-      <w:sdtContent>
-        <w:p>
-          <w:pPr>
-            <w:pStyle w:val="Titel"/>
-            <w:spacing w:after="1000"/>
-            <w:jc w:val="both"/>
-            <w:rPr>
-              <w:sz w:val="36"/>
-              <w:szCs w:val="36"/>
-            </w:rPr>
-          </w:pPr>
-          <w:r>
-            <w:rPr>
-              <w:sz w:val="36"/>
-              <w:szCs w:val="36"/>
-            </w:rPr>
-            <w:t xml:space="preserve">Concert </w:t>
-          </w:r>
-          <w:r>
-            <w:rPr>
-              <w:sz w:val="36"/>
-              <w:szCs w:val="36"/>
-            </w:rPr>
-            <w:t>Ticket Watcher</w:t>
-          </w:r>
-        </w:p>
-      </w:sdtContent>
-    </w:sdt>
-    <w:p>
-      <w:pPr>
-        <w:pStyle w:val="UntertitelnichtIndexiert"/>
-      </w:pPr>
-      <w:r>
-        <w:t xml:space="preserve">Thema: </w:t>
-      </w:r>
-      <w:sdt>
-        <w:sdtPr>
-          <w:alias w:val="Betreff"/>
-          <w:tag w:val=""/>
-          <w:id w:val="687183049"/>
-          <w:placeholder>
-            <w:docPart w:val="D51AD77C775644BAB5DB722052C415C6"/>
-          </w:placeholder>
-          <w:dataBinding w:prefixMappings="xmlns:ns0='http://purl.org/dc/elements/1.1/' xmlns:ns1='http://schemas.openxmlformats.org/package/2006/metadata/core-properties' " w:xpath="/ns1:coreProperties[1]/ns0:subject[1]" w:storeItemID="{6C3C8BC8-F283-45AE-878A-BAB7291924A1}"/>
-          <w:text/>
-        </w:sdtPr>
-        <w:sdtContent>
-          <w:r>
-            <w:t>Geschäftsprozesse mit Caumunda-Plattform</w:t>
-          </w:r>
-        </w:sdtContent>
-      </w:sdt>
-    </w:p>
-    <w:p>
-      <w:pPr>
-        <w:pStyle w:val="UntertitelnichtIndexiert"/>
-      </w:pPr>
-      <w:r>
-        <w:t>Dokumentinformationen</w:t>
-      </w:r>
-    </w:p>
-    <w:p>
-      <w:pPr>
-        <w:pStyle w:val="KeinLeerraum"/>
-        <w:tabs>
-          <w:tab w:val="left" w:pos="1701"/>
-        </w:tabs>
-        <w:ind w:left="0" w:firstLine="0"/>
-        <w:rPr>
-          <w:sz w:val="20"/>
-          <w:szCs w:val="20"/>
-        </w:rPr>
-      </w:pPr>
-      <w:r>
-        <w:rPr>
-          <w:sz w:val="20"/>
-          <w:szCs w:val="20"/>
-        </w:rPr>
-        <w:t>Dateiname:</w:t>
-      </w:r>
-      <w:r>
-        <w:rPr>
-          <w:sz w:val="20"/>
-          <w:szCs w:val="20"/>
-        </w:rPr>
-        <w:tab/>
-      </w:r>
-      <w:r>
-        <w:rPr>
-          <w:sz w:val="20"/>
-          <w:szCs w:val="20"/>
-        </w:rPr>
-        <w:t>documentation.docx</w:t>
-      </w:r>
-    </w:p>
-    <w:p>
-      <w:pPr>
-        <w:pStyle w:val="KeinLeerraum"/>
-        <w:tabs>
-          <w:tab w:val="left" w:pos="1701"/>
-        </w:tabs>
-        <w:ind w:left="0" w:firstLine="0"/>
-        <w:rPr>
-          <w:sz w:val="20"/>
-          <w:szCs w:val="20"/>
-        </w:rPr>
-      </w:pPr>
-      <w:r>
-        <w:rPr>
-          <w:sz w:val="20"/>
-          <w:szCs w:val="20"/>
-        </w:rPr>
-        <w:t>Speicherdatum:</w:t>
-      </w:r>
-      <w:r>
-        <w:rPr>
-          <w:sz w:val="20"/>
-          <w:szCs w:val="20"/>
-        </w:rPr>
-        <w:tab/>
-      </w:r>
-      <w:r>
-        <w:rPr>
-          <w:sz w:val="20"/>
-          <w:szCs w:val="20"/>
-        </w:rPr>
-        <w:t>31.03.2026</w:t>
-      </w:r>
-    </w:p>
-    <w:p>
-      <w:pPr>
-        <w:pStyle w:val="UntertitelnichtIndexiert"/>
-      </w:pPr>
-      <w:r>
-        <w:t>Autoreninformationen</w:t>
-      </w:r>
-    </w:p>
-    <w:p>
-      <w:pPr>
-        <w:pStyle w:val="KeinLeerraum"/>
-        <w:tabs>
-          <w:tab w:val="left" w:pos="1701"/>
-        </w:tabs>
-        <w:ind w:left="0" w:firstLine="0"/>
-        <w:rPr>
-          <w:sz w:val="20"/>
-          <w:szCs w:val="20"/>
-        </w:rPr>
-      </w:pPr>
-      <w:r>
-        <w:rPr>
-          <w:sz w:val="20"/>
-          <w:szCs w:val="20"/>
-        </w:rPr>
-        <w:t>Autor:</w:t>
-      </w:r>
-      <w:r>
-        <w:rPr>
-          <w:sz w:val="20"/>
-          <w:szCs w:val="20"/>
-        </w:rPr>
-        <w:tab/>
-      </w:r>
-      <w:sdt>
-        <w:sdtPr>
-          <w:rPr>
-            <w:sz w:val="20"/>
-            <w:szCs w:val="20"/>
-          </w:rPr>
-          <w:alias w:val="Autor"/>
-          <w:tag w:val=""/>
-          <w:id w:val="2028292643"/>
-          <w:placeholder>
-            <w:docPart w:val="190E91473F86429896951F5616D59CD5"/>
-          </w:placeholder>
-          <w:dataBinding w:prefixMappings="xmlns:ns0='http://purl.org/dc/elements/1.1/' xmlns:ns1='http://schemas.openxmlformats.org/package/2006/metadata/core-properties' " w:xpath="/ns1:coreProperties[1]/ns0:creator[1]" w:storeItemID="{6C3C8BC8-F283-45AE-878A-BAB7291924A1}"/>
-          <w:text/>
-        </w:sdtPr>
-        <w:sdtContent>
-          <w:r>
-            <w:rPr>
-              <w:sz w:val="20"/>
-              <w:szCs w:val="20"/>
-            </w:rPr>
-            <w:t>Luka Grujic</w:t>
-          </w:r>
-        </w:sdtContent>
-      </w:sdt>
-    </w:p>
-    <w:p>
-      <w:pPr>
-        <w:pStyle w:val="KeinLeerraum"/>
-        <w:tabs>
-          <w:tab w:val="left" w:pos="1701"/>
-        </w:tabs>
-        <w:ind w:left="0" w:firstLine="0"/>
-        <w:rPr>
-          <w:sz w:val="20"/>
-          <w:szCs w:val="20"/>
-        </w:rPr>
-      </w:pPr>
-      <w:r>
-        <w:rPr>
-          <w:sz w:val="20"/>
-          <w:szCs w:val="20"/>
-        </w:rPr>
-        <w:tab/>
-      </w:r>
-      <w:sdt>
-        <w:sdtPr>
-          <w:rPr>
-            <w:sz w:val="20"/>
-            <w:szCs w:val="20"/>
-          </w:rPr>
-          <w:alias w:val="Firmen-E-Mail-Adresse"/>
-          <w:tag w:val=""/>
-          <w:id w:val="-573276769"/>
-          <w:placeholder>
-            <w:docPart w:val="4C60AFF0BB7841C189B9723E28273B32"/>
-          </w:placeholder>
-          <w:dataBinding w:prefixMappings="xmlns:ns0='http://schemas.microsoft.com/office/2006/coverPageProps' " w:xpath="/ns0:CoverPageProperties[1]/ns0:CompanyEmail[1]" w:storeItemID="{55AF091B-3C7A-41E3-B477-F2FDAA23CFDA}"/>
-          <w:text/>
-        </w:sdtPr>
-        <w:sdtContent>
-          <w:r>
-            <w:rPr>
-              <w:sz w:val="20"/>
-              <w:szCs w:val="20"/>
-            </w:rPr>
-            <w:t>Elif B</w:t>
-          </w:r>
-          <w:r>
-            <w:rPr>
-              <w:sz w:val="20"/>
-              <w:szCs w:val="20"/>
-            </w:rPr>
-            <w:t xml:space="preserve">erra </w:t>
-          </w:r>
-          <w:proofErr w:type="spellStart"/>
-          <w:r>
-            <w:rPr>
-              <w:sz w:val="20"/>
-              <w:szCs w:val="20"/>
-            </w:rPr>
-            <w:t>Canmaya</w:t>
-          </w:r>
-          <w:proofErr w:type="spellEnd"/>
-        </w:sdtContent>
-      </w:sdt>
-    </w:p>
-    <w:p>
-      <w:pPr>
-        <w:spacing w:after="200" w:line="276" w:lineRule="auto"/>
-      </w:pPr>
-    </w:p>
     <w:p>
       <w:pPr>
         <w:spacing w:after="200" w:line="276" w:lineRule="auto"/>
@@ -285,6 +15,824 @@
           <w:docGrid w:linePitch="360"/>
         </w:sectPr>
       </w:pPr>
+      <w:r>
+        <w:rPr>
+          <w:noProof/>
+        </w:rPr>
+        <mc:AlternateContent>
+          <mc:Choice Requires="wps">
+            <w:drawing>
+              <wp:anchor distT="0" distB="0" distL="114300" distR="114300" simplePos="0" relativeHeight="251662336" behindDoc="0" locked="0" layoutInCell="1" allowOverlap="1" wp14:anchorId="5ED57F02" wp14:editId="7F49F31B">
+                <wp:simplePos x="0" y="0"/>
+                <wp:positionH relativeFrom="column">
+                  <wp:posOffset>261620</wp:posOffset>
+                </wp:positionH>
+                <wp:positionV relativeFrom="paragraph">
+                  <wp:posOffset>-2125980</wp:posOffset>
+                </wp:positionV>
+                <wp:extent cx="5426710" cy="1691640"/>
+                <wp:effectExtent l="0" t="0" r="0" b="3810"/>
+                <wp:wrapNone/>
+                <wp:docPr id="1196794552" name="Textfeld 6"/>
+                <wp:cNvGraphicFramePr/>
+                <a:graphic xmlns:a="http://schemas.openxmlformats.org/drawingml/2006/main">
+                  <a:graphicData uri="http://schemas.microsoft.com/office/word/2010/wordprocessingShape">
+                    <wps:wsp>
+                      <wps:cNvSpPr txBox="1"/>
+                      <wps:spPr>
+                        <a:xfrm>
+                          <a:off x="0" y="0"/>
+                          <a:ext cx="5426710" cy="1691640"/>
+                        </a:xfrm>
+                        <a:prstGeom prst="rect">
+                          <a:avLst/>
+                        </a:prstGeom>
+                        <a:noFill/>
+                        <a:ln w="6350">
+                          <a:noFill/>
+                        </a:ln>
+                      </wps:spPr>
+                      <wps:txbx>
+                        <w:txbxContent>
+                          <w:p>
+                            <w:pPr>
+                              <w:rPr>
+                                <w:b/>
+                                <w:color w:val="000099"/>
+                                <w:sz w:val="24"/>
+                                <w:szCs w:val="24"/>
+                              </w:rPr>
+                            </w:pPr>
+                            <w:r>
+                              <w:rPr>
+                                <w:b/>
+                                <w:color w:val="000099"/>
+                                <w:sz w:val="24"/>
+                                <w:szCs w:val="24"/>
+                              </w:rPr>
+                              <w:t xml:space="preserve">Thema: </w:t>
+                            </w:r>
+                            <w:sdt>
+                              <w:sdtPr>
+                                <w:rPr>
+                                  <w:b/>
+                                  <w:color w:val="000099"/>
+                                  <w:sz w:val="24"/>
+                                  <w:szCs w:val="24"/>
+                                </w:rPr>
+                                <w:alias w:val="Betreff"/>
+                                <w:id w:val="687183049"/>
+                                <w:placeholder>
+                                  <w:docPart w:val="31D0E08FBBED47499BDA367AC219F700"/>
+                                </w:placeholder>
+                                <w:dataBinding w:prefixMappings="xmlns:ns0='http://purl.org/dc/elements/1.1/' xmlns:ns1='http://schemas.openxmlformats.org/package/2006/metadata/core-properties' " w:xpath="/ns1:coreProperties[1]/ns0:subject[1]" w:storeItemID="{6C3C8BC8-F283-45AE-878A-BAB7291924A1}"/>
+                                <w:text/>
+                              </w:sdtPr>
+                              <w:sdtContent>
+                                <w:r>
+                                  <w:rPr>
+                                    <w:b/>
+                                    <w:color w:val="000099"/>
+                                    <w:sz w:val="24"/>
+                                    <w:szCs w:val="24"/>
+                                  </w:rPr>
+                                  <w:t>Geschäftsprozesse mit Camunda-Plattform</w:t>
+                                </w:r>
+                              </w:sdtContent>
+                            </w:sdt>
+                          </w:p>
+                          <w:p>
+                            <w:pPr>
+                              <w:rPr>
+                                <w:b/>
+                                <w:bCs/>
+                                <w:color w:val="000099"/>
+                                <w:sz w:val="24"/>
+                                <w:szCs w:val="24"/>
+                              </w:rPr>
+                            </w:pPr>
+                          </w:p>
+                          <w:p>
+                            <w:pPr>
+                              <w:rPr>
+                                <w:b/>
+                                <w:bCs/>
+                                <w:color w:val="000099"/>
+                                <w:sz w:val="24"/>
+                                <w:szCs w:val="24"/>
+                              </w:rPr>
+                            </w:pPr>
+                            <w:r>
+                              <w:rPr>
+                                <w:b/>
+                                <w:bCs/>
+                                <w:color w:val="000099"/>
+                                <w:sz w:val="24"/>
+                                <w:szCs w:val="24"/>
+                              </w:rPr>
+                              <w:t>Dokumentinformationen</w:t>
+                            </w:r>
+                          </w:p>
+                          <w:p>
+                            <w:pPr>
+                              <w:rPr>
+                                <w:color w:val="000099"/>
+                                <w:sz w:val="24"/>
+                                <w:szCs w:val="24"/>
+                              </w:rPr>
+                            </w:pPr>
+                            <w:r>
+                              <w:rPr>
+                                <w:color w:val="000099"/>
+                                <w:sz w:val="24"/>
+                                <w:szCs w:val="24"/>
+                              </w:rPr>
+                              <w:t>Dateiname:</w:t>
+                            </w:r>
+                            <w:r>
+                              <w:rPr>
+                                <w:color w:val="000099"/>
+                                <w:sz w:val="24"/>
+                                <w:szCs w:val="24"/>
+                              </w:rPr>
+                              <w:tab/>
+                              <w:t>documentation.docx</w:t>
+                            </w:r>
+                          </w:p>
+                          <w:p>
+                            <w:pPr>
+                              <w:rPr>
+                                <w:color w:val="000099"/>
+                                <w:sz w:val="24"/>
+                                <w:szCs w:val="24"/>
+                              </w:rPr>
+                            </w:pPr>
+                            <w:r>
+                              <w:rPr>
+                                <w:color w:val="000099"/>
+                                <w:sz w:val="24"/>
+                                <w:szCs w:val="24"/>
+                              </w:rPr>
+                              <w:t>Speicherdatum:</w:t>
+                            </w:r>
+                            <w:r>
+                              <w:rPr>
+                                <w:color w:val="000099"/>
+                                <w:sz w:val="24"/>
+                                <w:szCs w:val="24"/>
+                              </w:rPr>
+                              <w:tab/>
+                              <w:t>31.03.2026</w:t>
+                            </w:r>
+                          </w:p>
+                          <w:p>
+                            <w:pPr>
+                              <w:rPr>
+                                <w:color w:val="000099"/>
+                                <w:sz w:val="24"/>
+                                <w:szCs w:val="24"/>
+                              </w:rPr>
+                            </w:pPr>
+                            <w:r>
+                              <w:rPr>
+                                <w:color w:val="000099"/>
+                                <w:sz w:val="24"/>
+                                <w:szCs w:val="24"/>
+                              </w:rPr>
+                              <w:t>Autor</w:t>
+                            </w:r>
+                            <w:r>
+                              <w:rPr>
+                                <w:color w:val="000099"/>
+                                <w:sz w:val="24"/>
+                                <w:szCs w:val="24"/>
+                              </w:rPr>
+                              <w:t>en</w:t>
+                            </w:r>
+                            <w:r>
+                              <w:rPr>
+                                <w:color w:val="000099"/>
+                                <w:sz w:val="24"/>
+                                <w:szCs w:val="24"/>
+                              </w:rPr>
+                              <w:t>:</w:t>
+                            </w:r>
+                            <w:r>
+                              <w:rPr>
+                                <w:color w:val="000099"/>
+                                <w:sz w:val="24"/>
+                                <w:szCs w:val="24"/>
+                              </w:rPr>
+                              <w:tab/>
+                              <w:t>Luka Grujic, Elif Berra</w:t>
+                            </w:r>
+                            <w:r>
+                              <w:rPr>
+                                <w:color w:val="000099"/>
+                                <w:sz w:val="24"/>
+                                <w:szCs w:val="24"/>
+                              </w:rPr>
+                              <w:t xml:space="preserve"> </w:t>
+                            </w:r>
+                            <w:r>
+                              <w:rPr>
+                                <w:color w:val="000099"/>
+                                <w:sz w:val="24"/>
+                                <w:szCs w:val="24"/>
+                              </w:rPr>
+                              <w:t>Canmaya</w:t>
+                            </w:r>
+                          </w:p>
+                          <w:p>
+                            <w:pPr>
+                              <w:rPr>
+                                <w:color w:val="000000" w:themeColor="text1"/>
+                                <w:sz w:val="24"/>
+                                <w:szCs w:val="24"/>
+                                <w14:shadow w14:blurRad="50800" w14:dist="50800" w14:dir="5400000" w14:sx="0" w14:sy="0" w14:kx="0" w14:ky="0" w14:algn="ctr">
+                                  <w14:schemeClr w14:val="bg1"/>
+                                </w14:shadow>
+                              </w:rPr>
+                            </w:pPr>
+                          </w:p>
+                        </w:txbxContent>
+                      </wps:txbx>
+                      <wps:bodyPr rot="0" spcFirstLastPara="0" vertOverflow="overflow" horzOverflow="overflow" vert="horz" wrap="square" lIns="91440" tIns="45720" rIns="91440" bIns="45720" numCol="1" spcCol="0" rtlCol="0" fromWordArt="0" anchor="t" anchorCtr="0" forceAA="0" compatLnSpc="1">
+                        <a:prstTxWarp prst="textNoShape">
+                          <a:avLst/>
+                        </a:prstTxWarp>
+                        <a:noAutofit/>
+                      </wps:bodyPr>
+                    </wps:wsp>
+                  </a:graphicData>
+                </a:graphic>
+                <wp14:sizeRelH relativeFrom="margin">
+                  <wp14:pctWidth>0</wp14:pctWidth>
+                </wp14:sizeRelH>
+                <wp14:sizeRelV relativeFrom="margin">
+                  <wp14:pctHeight>0</wp14:pctHeight>
+                </wp14:sizeRelV>
+              </wp:anchor>
+            </w:drawing>
+          </mc:Choice>
+          <mc:Fallback>
+            <w:pict>
+              <v:shapetype w14:anchorId="5ED57F02" id="_x0000_t202" coordsize="21600,21600" o:spt="202" path="m,l,21600r21600,l21600,xe">
+                <v:stroke joinstyle="miter"/>
+                <v:path gradientshapeok="t" o:connecttype="rect"/>
+              </v:shapetype>
+              <v:shape id="Textfeld 6" o:spid="_x0000_s1026" type="#_x0000_t202" style="position:absolute;left:0;text-align:left;margin-left:20.6pt;margin-top:-167.4pt;width:427.3pt;height:133.2pt;z-index:251662336;visibility:visible;mso-wrap-style:square;mso-width-percent:0;mso-height-percent:0;mso-wrap-distance-left:9pt;mso-wrap-distance-top:0;mso-wrap-distance-right:9pt;mso-wrap-distance-bottom:0;mso-position-horizontal:absolute;mso-position-horizontal-relative:text;mso-position-vertical:absolute;mso-position-vertical-relative:text;mso-width-percent:0;mso-height-percent:0;mso-width-relative:margin;mso-height-relative:margin;v-text-anchor:top" o:gfxdata="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" filled="f" stroked="f" strokeweight=".5pt">
+                <v:textbox>
+                  <w:txbxContent>
+                    <w:p>
+                      <w:pPr>
+                        <w:rPr>
+                          <w:b/>
+                          <w:color w:val="000099"/>
+                          <w:sz w:val="24"/>
+                          <w:szCs w:val="24"/>
+                        </w:rPr>
+                      </w:pPr>
+                      <w:r>
+                        <w:rPr>
+                          <w:b/>
+                          <w:color w:val="000099"/>
+                          <w:sz w:val="24"/>
+                          <w:szCs w:val="24"/>
+                        </w:rPr>
+                        <w:t xml:space="preserve">Thema: </w:t>
+                      </w:r>
+                      <w:sdt>
+                        <w:sdtPr>
+                          <w:rPr>
+                            <w:b/>
+                            <w:color w:val="000099"/>
+                            <w:sz w:val="24"/>
+                            <w:szCs w:val="24"/>
+                          </w:rPr>
+                          <w:alias w:val="Betreff"/>
+                          <w:id w:val="687183049"/>
+                          <w:placeholder>
+                            <w:docPart w:val="31D0E08FBBED47499BDA367AC219F700"/>
+                          </w:placeholder>
+                          <w:dataBinding w:prefixMappings="xmlns:ns0='http://purl.org/dc/elements/1.1/' xmlns:ns1='http://schemas.openxmlformats.org/package/2006/metadata/core-properties' " w:xpath="/ns1:coreProperties[1]/ns0:subject[1]" w:storeItemID="{6C3C8BC8-F283-45AE-878A-BAB7291924A1}"/>
+                          <w:text/>
+                        </w:sdtPr>
+                        <w:sdtContent>
+                          <w:r>
+                            <w:rPr>
+                              <w:b/>
+                              <w:color w:val="000099"/>
+                              <w:sz w:val="24"/>
+                              <w:szCs w:val="24"/>
+                            </w:rPr>
+                            <w:t>Geschäftsprozesse mit Camunda-Plattform</w:t>
+                          </w:r>
+                        </w:sdtContent>
+                      </w:sdt>
+                    </w:p>
+                    <w:p>
+                      <w:pPr>
+                        <w:rPr>
+                          <w:b/>
+                          <w:bCs/>
+                          <w:color w:val="000099"/>
+                          <w:sz w:val="24"/>
+                          <w:szCs w:val="24"/>
+                        </w:rPr>
+                      </w:pPr>
+                    </w:p>
+                    <w:p>
+                      <w:pPr>
+                        <w:rPr>
+                          <w:b/>
+                          <w:bCs/>
+                          <w:color w:val="000099"/>
+                          <w:sz w:val="24"/>
+                          <w:szCs w:val="24"/>
+                        </w:rPr>
+                      </w:pPr>
+                      <w:r>
+                        <w:rPr>
+                          <w:b/>
+                          <w:bCs/>
+                          <w:color w:val="000099"/>
+                          <w:sz w:val="24"/>
+                          <w:szCs w:val="24"/>
+                        </w:rPr>
+                        <w:t>Dokumentinformationen</w:t>
+                      </w:r>
+                    </w:p>
+                    <w:p>
+                      <w:pPr>
+                        <w:rPr>
+                          <w:color w:val="000099"/>
+                          <w:sz w:val="24"/>
+                          <w:szCs w:val="24"/>
+                        </w:rPr>
+                      </w:pPr>
+                      <w:r>
+                        <w:rPr>
+                          <w:color w:val="000099"/>
+                          <w:sz w:val="24"/>
+                          <w:szCs w:val="24"/>
+                        </w:rPr>
+                        <w:t>Dateiname:</w:t>
+                      </w:r>
+                      <w:r>
+                        <w:rPr>
+                          <w:color w:val="000099"/>
+                          <w:sz w:val="24"/>
+                          <w:szCs w:val="24"/>
+                        </w:rPr>
+                        <w:tab/>
+                        <w:t>documentation.docx</w:t>
+                      </w:r>
+                    </w:p>
+                    <w:p>
+                      <w:pPr>
+                        <w:rPr>
+                          <w:color w:val="000099"/>
+                          <w:sz w:val="24"/>
+                          <w:szCs w:val="24"/>
+                        </w:rPr>
+                      </w:pPr>
+                      <w:r>
+                        <w:rPr>
+                          <w:color w:val="000099"/>
+                          <w:sz w:val="24"/>
+                          <w:szCs w:val="24"/>
+                        </w:rPr>
+                        <w:t>Speicherdatum:</w:t>
+                      </w:r>
+                      <w:r>
+                        <w:rPr>
+                          <w:color w:val="000099"/>
+                          <w:sz w:val="24"/>
+                          <w:szCs w:val="24"/>
+                        </w:rPr>
+                        <w:tab/>
+                        <w:t>31.03.2026</w:t>
+                      </w:r>
+                    </w:p>
+                    <w:p>
+                      <w:pPr>
+                        <w:rPr>
+                          <w:color w:val="000099"/>
+                          <w:sz w:val="24"/>
+                          <w:szCs w:val="24"/>
+                        </w:rPr>
+                      </w:pPr>
+                      <w:r>
+                        <w:rPr>
+                          <w:color w:val="000099"/>
+                          <w:sz w:val="24"/>
+                          <w:szCs w:val="24"/>
+                        </w:rPr>
+                        <w:t>Autor</w:t>
+                      </w:r>
+                      <w:r>
+                        <w:rPr>
+                          <w:color w:val="000099"/>
+                          <w:sz w:val="24"/>
+                          <w:szCs w:val="24"/>
+                        </w:rPr>
+                        <w:t>en</w:t>
+                      </w:r>
+                      <w:r>
+                        <w:rPr>
+                          <w:color w:val="000099"/>
+                          <w:sz w:val="24"/>
+                          <w:szCs w:val="24"/>
+                        </w:rPr>
+                        <w:t>:</w:t>
+                      </w:r>
+                      <w:r>
+                        <w:rPr>
+                          <w:color w:val="000099"/>
+                          <w:sz w:val="24"/>
+                          <w:szCs w:val="24"/>
+                        </w:rPr>
+                        <w:tab/>
+                        <w:t>Luka Grujic, Elif Berra</w:t>
+                      </w:r>
+                      <w:r>
+                        <w:rPr>
+                          <w:color w:val="000099"/>
+                          <w:sz w:val="24"/>
+                          <w:szCs w:val="24"/>
+                        </w:rPr>
+                        <w:t xml:space="preserve"> </w:t>
+                      </w:r>
+                      <w:r>
+                        <w:rPr>
+                          <w:color w:val="000099"/>
+                          <w:sz w:val="24"/>
+                          <w:szCs w:val="24"/>
+                        </w:rPr>
+                        <w:t>Canmaya</w:t>
+                      </w:r>
+                    </w:p>
+                    <w:p>
+                      <w:pPr>
+                        <w:rPr>
+                          <w:color w:val="000000" w:themeColor="text1"/>
+                          <w:sz w:val="24"/>
+                          <w:szCs w:val="24"/>
+                          <w14:shadow w14:blurRad="50800" w14:dist="50800" w14:dir="5400000" w14:sx="0" w14:sy="0" w14:kx="0" w14:ky="0" w14:algn="ctr">
+                            <w14:schemeClr w14:val="bg1"/>
+                          </w14:shadow>
+                        </w:rPr>
+                      </w:pPr>
+                    </w:p>
+                  </w:txbxContent>
+                </v:textbox>
+              </v:shape>
+            </w:pict>
+          </mc:Fallback>
+        </mc:AlternateContent>
+      </w:r>
+      <w:r>
+        <w:rPr>
+          <w:noProof/>
+          <w:color w:val="1F497D" w:themeColor="text2"/>
+        </w:rPr>
+        <w:drawing>
+          <wp:anchor distT="0" distB="0" distL="114300" distR="114300" simplePos="0" relativeHeight="251663360" behindDoc="0" locked="0" layoutInCell="1" allowOverlap="1" wp14:anchorId="6C9C1171" wp14:editId="06803AE5">
+            <wp:simplePos x="0" y="0"/>
+            <wp:positionH relativeFrom="column">
+              <wp:posOffset>4549140</wp:posOffset>
+            </wp:positionH>
+            <wp:positionV relativeFrom="paragraph">
+              <wp:posOffset>-7115175</wp:posOffset>
+            </wp:positionV>
+            <wp:extent cx="521970" cy="521970"/>
+            <wp:effectExtent l="0" t="0" r="0" b="0"/>
+            <wp:wrapNone/>
+            <wp:docPr id="507960565" name="Grafik 7" descr="4-pointed Star (Used in Nonpu__ flags) by Pride-Flags on DeviantArt"/>
+            <wp:cNvGraphicFramePr>
+              <a:graphicFrameLocks xmlns:a="http://schemas.openxmlformats.org/drawingml/2006/main" noChangeAspect="1"/>
+            </wp:cNvGraphicFramePr>
+            <a:graphic xmlns:a="http://schemas.openxmlformats.org/drawingml/2006/main">
+              <a:graphicData uri="http://schemas.openxmlformats.org/drawingml/2006/picture">
+                <pic:pic xmlns:pic="http://schemas.openxmlformats.org/drawingml/2006/picture">
+                  <pic:nvPicPr>
+                    <pic:cNvPr id="0" name="Picture 1" descr="4-pointed Star (Used in Nonpu__ flags) by Pride-Flags on DeviantArt"/>
+                    <pic:cNvPicPr>
+                      <a:picLocks noChangeAspect="1" noChangeArrowheads="1"/>
+                    </pic:cNvPicPr>
+                  </pic:nvPicPr>
+                  <pic:blipFill>
+                    <a:blip r:embed="rId14" cstate="print">
+                      <a:alphaModFix amt="70000"/>
+                      <a:extLst>
+                        <a:ext uri="{BEBA8EAE-BF5A-486C-A8C5-ECC9F3942E4B}">
+                          <a14:imgProps xmlns:a14="http://schemas.microsoft.com/office/drawing/2010/main">
+                            <a14:imgLayer r:embed="rId15">
+                              <a14:imgEffect>
+                                <a14:artisticBlur/>
+                              </a14:imgEffect>
+                            </a14:imgLayer>
+                          </a14:imgProps>
+                        </a:ext>
+                        <a:ext uri="{28A0092B-C50C-407E-A947-70E740481C1C}">
+                          <a14:useLocalDpi xmlns:a14="http://schemas.microsoft.com/office/drawing/2010/main" val="0"/>
+                        </a:ext>
+                      </a:extLst>
+                    </a:blip>
+                    <a:srcRect/>
+                    <a:stretch>
+                      <a:fillRect/>
+                    </a:stretch>
+                  </pic:blipFill>
+                  <pic:spPr bwMode="auto">
+                    <a:xfrm>
+                      <a:off x="0" y="0"/>
+                      <a:ext cx="521970" cy="521970"/>
+                    </a:xfrm>
+                    <a:prstGeom prst="rect">
+                      <a:avLst/>
+                    </a:prstGeom>
+                    <a:noFill/>
+                    <a:ln>
+                      <a:noFill/>
+                    </a:ln>
+                  </pic:spPr>
+                </pic:pic>
+              </a:graphicData>
+            </a:graphic>
+            <wp14:sizeRelH relativeFrom="margin">
+              <wp14:pctWidth>0</wp14:pctWidth>
+            </wp14:sizeRelH>
+            <wp14:sizeRelV relativeFrom="margin">
+              <wp14:pctHeight>0</wp14:pctHeight>
+            </wp14:sizeRelV>
+          </wp:anchor>
+        </w:drawing>
+      </w:r>
+      <w:r>
+        <w:rPr>
+          <w:noProof/>
+        </w:rPr>
+        <mc:AlternateContent>
+          <mc:Choice Requires="wps">
+            <w:drawing>
+              <wp:anchor distT="0" distB="0" distL="114300" distR="114300" simplePos="0" relativeHeight="251659264" behindDoc="1" locked="0" layoutInCell="1" allowOverlap="1" wp14:anchorId="281CC49E" wp14:editId="6331F11A">
+                <wp:simplePos x="0" y="0"/>
+                <wp:positionH relativeFrom="column">
+                  <wp:posOffset>-52705</wp:posOffset>
+                </wp:positionH>
+                <wp:positionV relativeFrom="paragraph">
+                  <wp:posOffset>-7745730</wp:posOffset>
+                </wp:positionV>
+                <wp:extent cx="5994400" cy="7610475"/>
+                <wp:effectExtent l="0" t="0" r="6350" b="9525"/>
+                <wp:wrapNone/>
+                <wp:docPr id="952246794" name="Rechteck 2"/>
+                <wp:cNvGraphicFramePr/>
+                <a:graphic xmlns:a="http://schemas.openxmlformats.org/drawingml/2006/main">
+                  <a:graphicData uri="http://schemas.microsoft.com/office/word/2010/wordprocessingShape">
+                    <wps:wsp>
+                      <wps:cNvSpPr/>
+                      <wps:spPr>
+                        <a:xfrm>
+                          <a:off x="0" y="0"/>
+                          <a:ext cx="5994400" cy="7610475"/>
+                        </a:xfrm>
+                        <a:prstGeom prst="rect">
+                          <a:avLst/>
+                        </a:prstGeom>
+                        <a:gradFill>
+                          <a:gsLst>
+                            <a:gs pos="0">
+                              <a:srgbClr val="DEEFFF">
+                                <a:lumMod val="0"/>
+                                <a:lumOff val="100000"/>
+                                <a:alpha val="6000"/>
+                              </a:srgbClr>
+                            </a:gs>
+                            <a:gs pos="89000">
+                              <a:srgbClr val="0078A2"/>
+                            </a:gs>
+                            <a:gs pos="59000">
+                              <a:srgbClr val="00B2E1"/>
+                            </a:gs>
+                            <a:gs pos="58000">
+                              <a:srgbClr val="91DEF2"/>
+                            </a:gs>
+                            <a:gs pos="65125">
+                              <a:srgbClr val="31C1E7"/>
+                            </a:gs>
+                            <a:gs pos="100000">
+                              <a:srgbClr val="004A98"/>
+                            </a:gs>
+                          </a:gsLst>
+                          <a:lin ang="2700000" scaled="1"/>
+                        </a:gradFill>
+                        <a:ln>
+                          <a:noFill/>
+                        </a:ln>
+                      </wps:spPr>
+                      <wps:style>
+                        <a:lnRef idx="2">
+                          <a:schemeClr val="accent1">
+                            <a:shade val="15000"/>
+                          </a:schemeClr>
+                        </a:lnRef>
+                        <a:fillRef idx="1">
+                          <a:schemeClr val="accent1"/>
+                        </a:fillRef>
+                        <a:effectRef idx="0">
+                          <a:schemeClr val="accent1"/>
+                        </a:effectRef>
+                        <a:fontRef idx="minor">
+                          <a:schemeClr val="lt1"/>
+                        </a:fontRef>
+                      </wps:style>
+                      <wps:bodyPr rot="0" spcFirstLastPara="0" vertOverflow="overflow" horzOverflow="overflow" vert="horz" wrap="square" lIns="91440" tIns="45720" rIns="91440" bIns="45720" numCol="1" spcCol="0" rtlCol="0" fromWordArt="0" anchor="ctr" anchorCtr="0" forceAA="0" compatLnSpc="1">
+                        <a:prstTxWarp prst="textNoShape">
+                          <a:avLst/>
+                        </a:prstTxWarp>
+                        <a:noAutofit/>
+                      </wps:bodyPr>
+                    </wps:wsp>
+                  </a:graphicData>
+                </a:graphic>
+                <wp14:sizeRelH relativeFrom="margin">
+                  <wp14:pctWidth>0</wp14:pctWidth>
+                </wp14:sizeRelH>
+                <wp14:sizeRelV relativeFrom="margin">
+                  <wp14:pctHeight>0</wp14:pctHeight>
+                </wp14:sizeRelV>
+              </wp:anchor>
+            </w:drawing>
+          </mc:Choice>
+          <mc:Fallback>
+            <w:pict>
+              <v:rect w14:anchorId="32830EEC" id="Rechteck 2" o:spid="_x0000_s1026" style="position:absolute;margin-left:-4.15pt;margin-top:-609.9pt;width:472pt;height:599.25pt;z-index:-251657216;visibility:visible;mso-wrap-style:square;mso-width-percent:0;mso-height-percent:0;mso-wrap-distance-left:9pt;mso-wrap-distance-top:0;mso-wrap-distance-right:9pt;mso-wrap-distance-bottom:0;mso-position-horizontal:absolute;mso-position-horizontal-relative:text;mso-position-vertical:absolute;mso-position-vertical-relative:text;mso-width-percent:0;mso-height-percent:0;mso-width-relative:margin;mso-height-relative:margin;v-text-anchor:middle" o:gfxdata="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" stroked="f" strokeweight="2pt">
+                <v:fill color2="#004a98" o:opacity2="3932f" angle="45" colors="0 white;38011f #91def2;38666f #00b2e1;42680f #31c1e7;58327f #0078a2;1 #004a98" focus="100%" type="gradient"/>
+              </v:rect>
+            </w:pict>
+          </mc:Fallback>
+        </mc:AlternateContent>
+      </w:r>
+      <w:r>
+        <w:rPr>
+          <w:noProof/>
+        </w:rPr>
+        <mc:AlternateContent>
+          <mc:Choice Requires="wps">
+            <w:drawing>
+              <wp:anchor distT="0" distB="0" distL="114300" distR="114300" simplePos="0" relativeHeight="251660288" behindDoc="1" locked="0" layoutInCell="1" allowOverlap="1" wp14:anchorId="5795C052" wp14:editId="2AB01811">
+                <wp:simplePos x="0" y="0"/>
+                <wp:positionH relativeFrom="column">
+                  <wp:posOffset>-55880</wp:posOffset>
+                </wp:positionH>
+                <wp:positionV relativeFrom="paragraph">
+                  <wp:posOffset>-7042785</wp:posOffset>
+                </wp:positionV>
+                <wp:extent cx="5234940" cy="927735"/>
+                <wp:effectExtent l="0" t="0" r="0" b="5715"/>
+                <wp:wrapNone/>
+                <wp:docPr id="1258736317" name="Textfeld 3"/>
+                <wp:cNvGraphicFramePr/>
+                <a:graphic xmlns:a="http://schemas.openxmlformats.org/drawingml/2006/main">
+                  <a:graphicData uri="http://schemas.microsoft.com/office/word/2010/wordprocessingShape">
+                    <wps:wsp>
+                      <wps:cNvSpPr txBox="1"/>
+                      <wps:spPr>
+                        <a:xfrm>
+                          <a:off x="0" y="0"/>
+                          <a:ext cx="5234940" cy="927735"/>
+                        </a:xfrm>
+                        <a:prstGeom prst="rect">
+                          <a:avLst/>
+                        </a:prstGeom>
+                        <a:noFill/>
+                        <a:ln w="6350">
+                          <a:noFill/>
+                        </a:ln>
+                      </wps:spPr>
+                      <wps:txbx>
+                        <w:txbxContent>
+                          <w:p>
+                            <w:pPr>
+                              <w:ind w:left="432"/>
+                              <w:rPr>
+                                <w:rFonts w:ascii="Eras Demi ITC" w:hAnsi="Eras Demi ITC"/>
+                                <w:color w:val="004A98"/>
+                                <w:sz w:val="96"/>
+                                <w:szCs w:val="96"/>
+                              </w:rPr>
+                            </w:pPr>
+                            <w:r>
+                              <w:rPr>
+                                <w:rFonts w:ascii="Eras Demi ITC" w:hAnsi="Eras Demi ITC"/>
+                                <w:b/>
+                                <w:bCs/>
+                                <w:color w:val="004A98"/>
+                                <w:sz w:val="96"/>
+                                <w:szCs w:val="96"/>
+                              </w:rPr>
+                              <w:t>Ticket-Watcher</w:t>
+                            </w:r>
+                            <w:r>
+                              <w:rPr>
+                                <w:rFonts w:ascii="Eras Demi ITC" w:hAnsi="Eras Demi ITC"/>
+                                <w:color w:val="004A98"/>
+                                <w:sz w:val="96"/>
+                                <w:szCs w:val="96"/>
+                              </w:rPr>
+                              <w:t> </w:t>
+                            </w:r>
+                          </w:p>
+                          <w:p>
+                            <w:pPr>
+                              <w:rPr>
+                                <w:rFonts w:ascii="Eras Demi ITC" w:hAnsi="Eras Demi ITC"/>
+                                <w:b/>
+                                <w:bCs/>
+                                <w:color w:val="004A98"/>
+                                <w:sz w:val="96"/>
+                                <w:szCs w:val="96"/>
+                              </w:rPr>
+                            </w:pPr>
+                          </w:p>
+                        </w:txbxContent>
+                      </wps:txbx>
+                      <wps:bodyPr rot="0" spcFirstLastPara="0" vertOverflow="overflow" horzOverflow="overflow" vert="horz" wrap="square" lIns="91440" tIns="45720" rIns="91440" bIns="45720" numCol="1" spcCol="0" rtlCol="0" fromWordArt="0" anchor="t" anchorCtr="0" forceAA="0" compatLnSpc="1">
+                        <a:prstTxWarp prst="textNoShape">
+                          <a:avLst/>
+                        </a:prstTxWarp>
+                        <a:noAutofit/>
+                      </wps:bodyPr>
+                    </wps:wsp>
+                  </a:graphicData>
+                </a:graphic>
+                <wp14:sizeRelH relativeFrom="margin">
+                  <wp14:pctWidth>0</wp14:pctWidth>
+                </wp14:sizeRelH>
+                <wp14:sizeRelV relativeFrom="margin">
+                  <wp14:pctHeight>0</wp14:pctHeight>
+                </wp14:sizeRelV>
+              </wp:anchor>
+            </w:drawing>
+          </mc:Choice>
+          <mc:Fallback>
+            <w:pict>
+              <v:shape w14:anchorId="5795C052" id="Textfeld 3" o:spid="_x0000_s1027" type="#_x0000_t202" style="position:absolute;left:0;text-align:left;margin-left:-4.4pt;margin-top:-554.55pt;width:412.2pt;height:73.05pt;z-index:-251656192;visibility:visible;mso-wrap-style:square;mso-width-percent:0;mso-height-percent:0;mso-wrap-distance-left:9pt;mso-wrap-distance-top:0;mso-wrap-distance-right:9pt;mso-wrap-distance-bottom:0;mso-position-horizontal:absolute;mso-position-horizontal-relative:text;mso-position-vertical:absolute;mso-position-vertical-relative:text;mso-width-percent:0;mso-height-percent:0;mso-width-relative:margin;mso-height-relative:margin;v-text-anchor:top" o:gfxdata="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" filled="f" stroked="f" strokeweight=".5pt">
+                <v:textbox>
+                  <w:txbxContent>
+                    <w:p>
+                      <w:pPr>
+                        <w:ind w:left="432"/>
+                        <w:rPr>
+                          <w:rFonts w:ascii="Eras Demi ITC" w:hAnsi="Eras Demi ITC"/>
+                          <w:color w:val="004A98"/>
+                          <w:sz w:val="96"/>
+                          <w:szCs w:val="96"/>
+                        </w:rPr>
+                      </w:pPr>
+                      <w:r>
+                        <w:rPr>
+                          <w:rFonts w:ascii="Eras Demi ITC" w:hAnsi="Eras Demi ITC"/>
+                          <w:b/>
+                          <w:bCs/>
+                          <w:color w:val="004A98"/>
+                          <w:sz w:val="96"/>
+                          <w:szCs w:val="96"/>
+                        </w:rPr>
+                        <w:t>Ticket-Watcher</w:t>
+                      </w:r>
+                      <w:r>
+                        <w:rPr>
+                          <w:rFonts w:ascii="Eras Demi ITC" w:hAnsi="Eras Demi ITC"/>
+                          <w:color w:val="004A98"/>
+                          <w:sz w:val="96"/>
+                          <w:szCs w:val="96"/>
+                        </w:rPr>
+                        <w:t> </w:t>
+                      </w:r>
+                    </w:p>
+                    <w:p>
+                      <w:pPr>
+                        <w:rPr>
+                          <w:rFonts w:ascii="Eras Demi ITC" w:hAnsi="Eras Demi ITC"/>
+                          <w:b/>
+                          <w:bCs/>
+                          <w:color w:val="004A98"/>
+                          <w:sz w:val="96"/>
+                          <w:szCs w:val="96"/>
+                        </w:rPr>
+                      </w:pPr>
+                    </w:p>
+                  </w:txbxContent>
+                </v:textbox>
+              </v:shape>
+            </w:pict>
+          </mc:Fallback>
+        </mc:AlternateContent>
+      </w:r>
     </w:p>
     <w:p>
       <w:pPr>
@@ -324,7 +872,7 @@
         </w:rPr>
         <w:fldChar w:fldCharType="separate"/>
       </w:r>
-      <w:hyperlink w:anchor="_Toc225841482" w:history="1">
+      <w:hyperlink w:anchor="_Toc228744547" w:history="1">
         <w:r>
           <w:rPr>
             <w:rStyle w:val="Hyperlink"/>
@@ -351,7 +899,7 @@
             <w:noProof/>
             <w:webHidden/>
           </w:rPr>
-          <w:instrText xml:space="preserve"> PAGEREF _Toc225841482 \h </w:instrText>
+          <w:instrText xml:space="preserve"> PAGEREF _Toc228744547 \h </w:instrText>
         </w:r>
         <w:r>
           <w:rPr>
@@ -392,7 +940,7 @@
           <w14:ligatures w14:val="standardContextual"/>
         </w:rPr>
       </w:pPr>
-      <w:hyperlink w:anchor="_Toc225841483" w:history="1">
+      <w:hyperlink w:anchor="_Toc228744548" w:history="1">
         <w:r>
           <w:rPr>
             <w:rStyle w:val="Hyperlink"/>
@@ -430,7 +978,7 @@
           <w:rPr>
             <w:webHidden/>
           </w:rPr>
-          <w:instrText xml:space="preserve"> PAGEREF _Toc225841483 \h </w:instrText>
+          <w:instrText xml:space="preserve"> PAGEREF _Toc228744548 \h </w:instrText>
         </w:r>
         <w:r>
           <w:rPr>
@@ -472,7 +1020,7 @@
           <w14:ligatures w14:val="standardContextual"/>
         </w:rPr>
       </w:pPr>
-      <w:hyperlink w:anchor="_Toc225841484" w:history="1">
+      <w:hyperlink w:anchor="_Toc228744549" w:history="1">
         <w:r>
           <w:rPr>
             <w:rStyle w:val="Hyperlink"/>
@@ -495,7 +1043,7 @@
             <w:rStyle w:val="Hyperlink"/>
             <w:noProof/>
           </w:rPr>
-          <w:t>Auftrag</w:t>
+          <w:t>Auftragsbeschreibung</w:t>
         </w:r>
         <w:r>
           <w:rPr>
@@ -516,7 +1064,7 @@
             <w:noProof/>
             <w:webHidden/>
           </w:rPr>
-          <w:instrText xml:space="preserve"> PAGEREF _Toc225841484 \h </w:instrText>
+          <w:instrText xml:space="preserve"> PAGEREF _Toc228744549 \h </w:instrText>
         </w:r>
         <w:r>
           <w:rPr>
@@ -562,7 +1110,7 @@
           <w14:ligatures w14:val="standardContextual"/>
         </w:rPr>
       </w:pPr>
-      <w:hyperlink w:anchor="_Toc225841485" w:history="1">
+      <w:hyperlink w:anchor="_Toc228744550" w:history="1">
         <w:r>
           <w:rPr>
             <w:rStyle w:val="Hyperlink"/>
@@ -606,7 +1154,7 @@
             <w:noProof/>
             <w:webHidden/>
           </w:rPr>
-          <w:instrText xml:space="preserve"> PAGEREF _Toc225841485 \h </w:instrText>
+          <w:instrText xml:space="preserve"> PAGEREF _Toc228744550 \h </w:instrText>
         </w:r>
         <w:r>
           <w:rPr>
@@ -647,7 +1195,7 @@
           <w14:ligatures w14:val="standardContextual"/>
         </w:rPr>
       </w:pPr>
-      <w:hyperlink w:anchor="_Toc225841486" w:history="1">
+      <w:hyperlink w:anchor="_Toc228744551" w:history="1">
         <w:r>
           <w:rPr>
             <w:rStyle w:val="Hyperlink"/>
@@ -667,6 +1215,81 @@
           <w:rPr>
             <w:rStyle w:val="Hyperlink"/>
           </w:rPr>
+          <w:t>Vorgehensweise</w:t>
+        </w:r>
+        <w:r>
+          <w:rPr>
+            <w:webHidden/>
+          </w:rPr>
+          <w:tab/>
+        </w:r>
+        <w:r>
+          <w:rPr>
+            <w:webHidden/>
+          </w:rPr>
+          <w:fldChar w:fldCharType="begin"/>
+        </w:r>
+        <w:r>
+          <w:rPr>
+            <w:webHidden/>
+          </w:rPr>
+          <w:instrText xml:space="preserve"> PAGEREF _Toc228744551 \h </w:instrText>
+        </w:r>
+        <w:r>
+          <w:rPr>
+            <w:webHidden/>
+          </w:rPr>
+        </w:r>
+        <w:r>
+          <w:rPr>
+            <w:webHidden/>
+          </w:rPr>
+          <w:fldChar w:fldCharType="separate"/>
+        </w:r>
+        <w:r>
+          <w:rPr>
+            <w:webHidden/>
+          </w:rPr>
+          <w:t>5</w:t>
+        </w:r>
+        <w:r>
+          <w:rPr>
+            <w:webHidden/>
+          </w:rPr>
+          <w:fldChar w:fldCharType="end"/>
+        </w:r>
+      </w:hyperlink>
+    </w:p>
+    <w:p>
+      <w:pPr>
+        <w:pStyle w:val="Verzeichnis1"/>
+        <w:rPr>
+          <w:rFonts w:asciiTheme="minorHAnsi" w:hAnsiTheme="minorHAnsi"/>
+          <w:kern w:val="2"/>
+          <w:szCs w:val="24"/>
+          <w14:ligatures w14:val="standardContextual"/>
+        </w:rPr>
+      </w:pPr>
+      <w:hyperlink w:anchor="_Toc228744552" w:history="1">
+        <w:r>
+          <w:rPr>
+            <w:rStyle w:val="Hyperlink"/>
+          </w:rPr>
+          <w:t>3</w:t>
+        </w:r>
+        <w:r>
+          <w:rPr>
+            <w:rFonts w:asciiTheme="minorHAnsi" w:hAnsiTheme="minorHAnsi"/>
+            <w:kern w:val="2"/>
+            <w:szCs w:val="24"/>
+            <w14:ligatures w14:val="standardContextual"/>
+          </w:rPr>
+          <w:tab/>
+        </w:r>
+        <w:r>
+          <w:rPr>
+            <w:rStyle w:val="Hyperlink"/>
+          </w:rPr>
           <w:t>Umsetzung</w:t>
         </w:r>
         <w:r>
@@ -685,7 +1308,7 @@
           <w:rPr>
             <w:webHidden/>
           </w:rPr>
-          <w:instrText xml:space="preserve"> PAGEREF _Toc225841486 \h </w:instrText>
+          <w:instrText xml:space="preserve"> PAGEREF _Toc228744552 \h </w:instrText>
         </w:r>
         <w:r>
           <w:rPr>
@@ -702,7 +1325,7 @@
           <w:rPr>
             <w:webHidden/>
           </w:rPr>
-          <w:t>4</w:t>
+          <w:t>6</w:t>
         </w:r>
         <w:r>
           <w:rPr>
@@ -727,13 +1350,13 @@
           <w14:ligatures w14:val="standardContextual"/>
         </w:rPr>
       </w:pPr>
-      <w:hyperlink w:anchor="_Toc225841487" w:history="1">
+      <w:hyperlink w:anchor="_Toc228744553" w:history="1">
         <w:r>
           <w:rPr>
             <w:rStyle w:val="Hyperlink"/>
             <w:noProof/>
           </w:rPr>
-          <w:t>2.1</w:t>
+          <w:t>3.1</w:t>
         </w:r>
         <w:r>
           <w:rPr>
@@ -771,7 +1394,7 @@
             <w:noProof/>
             <w:webHidden/>
           </w:rPr>
-          <w:instrText xml:space="preserve"> PAGEREF _Toc225841487 \h </w:instrText>
+          <w:instrText xml:space="preserve"> PAGEREF _Toc228744553 \h </w:instrText>
         </w:r>
         <w:r>
           <w:rPr>
@@ -791,7 +1414,7 @@
             <w:noProof/>
             <w:webHidden/>
           </w:rPr>
-          <w:t>4</w:t>
+          <w:t>6</w:t>
         </w:r>
         <w:r>
           <w:rPr>
@@ -817,13 +1440,13 @@
           <w14:ligatures w14:val="standardContextual"/>
         </w:rPr>
       </w:pPr>
-      <w:hyperlink w:anchor="_Toc225841488" w:history="1">
+      <w:hyperlink w:anchor="_Toc228744554" w:history="1">
         <w:r>
           <w:rPr>
             <w:rStyle w:val="Hyperlink"/>
             <w:noProof/>
           </w:rPr>
-          <w:t>2.2</w:t>
+          <w:t>3.2</w:t>
         </w:r>
         <w:r>
           <w:rPr>
@@ -840,7 +1463,7 @@
             <w:rStyle w:val="Hyperlink"/>
             <w:noProof/>
           </w:rPr>
-          <w:t>Unser Vorgehen</w:t>
+          <w:t>Error-Handling</w:t>
         </w:r>
         <w:r>
           <w:rPr>
@@ -861,7 +1484,7 @@
             <w:noProof/>
             <w:webHidden/>
           </w:rPr>
-          <w:instrText xml:space="preserve"> PAGEREF _Toc225841488 \h </w:instrText>
+          <w:instrText xml:space="preserve"> PAGEREF _Toc228744554 \h </w:instrText>
         </w:r>
         <w:r>
           <w:rPr>
@@ -881,7 +1504,7 @@
             <w:noProof/>
             <w:webHidden/>
           </w:rPr>
-          <w:t>4</w:t>
+          <w:t>6</w:t>
         </w:r>
         <w:r>
           <w:rPr>
@@ -907,13 +1530,13 @@
           <w14:ligatures w14:val="standardContextual"/>
         </w:rPr>
       </w:pPr>
-      <w:hyperlink w:anchor="_Toc225841489" w:history="1">
+      <w:hyperlink w:anchor="_Toc228744555" w:history="1">
         <w:r>
           <w:rPr>
             <w:rStyle w:val="Hyperlink"/>
             <w:noProof/>
           </w:rPr>
-          <w:t>2.3</w:t>
+          <w:t>3.3</w:t>
         </w:r>
         <w:r>
           <w:rPr>
@@ -930,7 +1553,7 @@
             <w:rStyle w:val="Hyperlink"/>
             <w:noProof/>
           </w:rPr>
-          <w:t>Error-Handling</w:t>
+          <w:t>Tests</w:t>
         </w:r>
         <w:r>
           <w:rPr>
@@ -951,7 +1574,7 @@
             <w:noProof/>
             <w:webHidden/>
           </w:rPr>
-          <w:instrText xml:space="preserve"> PAGEREF _Toc225841489 \h </w:instrText>
+          <w:instrText xml:space="preserve"> PAGEREF _Toc228744555 \h </w:instrText>
         </w:r>
         <w:r>
           <w:rPr>
@@ -971,7 +1594,7 @@
             <w:noProof/>
             <w:webHidden/>
           </w:rPr>
-          <w:t>4</w:t>
+          <w:t>6</w:t>
         </w:r>
         <w:r>
           <w:rPr>
@@ -997,13 +1620,13 @@
           <w14:ligatures w14:val="standardContextual"/>
         </w:rPr>
       </w:pPr>
-      <w:hyperlink w:anchor="_Toc225841490" w:history="1">
+      <w:hyperlink w:anchor="_Toc228744556" w:history="1">
         <w:r>
           <w:rPr>
             <w:rStyle w:val="Hyperlink"/>
             <w:noProof/>
           </w:rPr>
-          <w:t>2.4</w:t>
+          <w:t>3.4</w:t>
         </w:r>
         <w:r>
           <w:rPr>
@@ -1020,7 +1643,7 @@
             <w:rStyle w:val="Hyperlink"/>
             <w:noProof/>
           </w:rPr>
-          <w:t>Tests</w:t>
+          <w:t>Technical Debt</w:t>
         </w:r>
         <w:r>
           <w:rPr>
@@ -1041,7 +1664,7 @@
             <w:noProof/>
             <w:webHidden/>
           </w:rPr>
-          <w:instrText xml:space="preserve"> PAGEREF _Toc225841490 \h </w:instrText>
+          <w:instrText xml:space="preserve"> PAGEREF _Toc228744556 \h </w:instrText>
         </w:r>
         <w:r>
           <w:rPr>
@@ -1061,7 +1684,7 @@
             <w:noProof/>
             <w:webHidden/>
           </w:rPr>
-          <w:t>4</w:t>
+          <w:t>6</w:t>
         </w:r>
         <w:r>
           <w:rPr>
@@ -1082,12 +1705,12 @@
           <w14:ligatures w14:val="standardContextual"/>
         </w:rPr>
       </w:pPr>
-      <w:hyperlink w:anchor="_Toc225841491" w:history="1">
+      <w:hyperlink w:anchor="_Toc228744557" w:history="1">
         <w:r>
           <w:rPr>
             <w:rStyle w:val="Hyperlink"/>
           </w:rPr>
-          <w:t>3</w:t>
+          <w:t>4</w:t>
         </w:r>
         <w:r>
           <w:rPr>
@@ -1120,7 +1743,7 @@
           <w:rPr>
             <w:webHidden/>
           </w:rPr>
-          <w:instrText xml:space="preserve"> PAGEREF _Toc225841491 \h </w:instrText>
+          <w:instrText xml:space="preserve"> PAGEREF _Toc228744557 \h </w:instrText>
         </w:r>
         <w:r>
           <w:rPr>
@@ -1137,7 +1760,7 @@
           <w:rPr>
             <w:webHidden/>
           </w:rPr>
-          <w:t>5</w:t>
+          <w:t>8</w:t>
         </w:r>
         <w:r>
           <w:rPr>
@@ -1162,13 +1785,13 @@
           <w14:ligatures w14:val="standardContextual"/>
         </w:rPr>
       </w:pPr>
-      <w:hyperlink w:anchor="_Toc225841492" w:history="1">
+      <w:hyperlink w:anchor="_Toc228744558" w:history="1">
         <w:r>
           <w:rPr>
             <w:rStyle w:val="Hyperlink"/>
             <w:noProof/>
           </w:rPr>
-          <w:t>3.1</w:t>
+          <w:t>4.1</w:t>
         </w:r>
         <w:r>
           <w:rPr>
@@ -1206,7 +1829,7 @@
             <w:noProof/>
             <w:webHidden/>
           </w:rPr>
-          <w:instrText xml:space="preserve"> PAGEREF _Toc225841492 \h </w:instrText>
+          <w:instrText xml:space="preserve"> PAGEREF _Toc228744558 \h </w:instrText>
         </w:r>
         <w:r>
           <w:rPr>
@@ -1226,7 +1849,7 @@
             <w:noProof/>
             <w:webHidden/>
           </w:rPr>
-          <w:t>5</w:t>
+          <w:t>8</w:t>
         </w:r>
         <w:r>
           <w:rPr>
@@ -1252,13 +1875,13 @@
           <w14:ligatures w14:val="standardContextual"/>
         </w:rPr>
       </w:pPr>
-      <w:hyperlink w:anchor="_Toc225841493" w:history="1">
+      <w:hyperlink w:anchor="_Toc228744559" w:history="1">
         <w:r>
           <w:rPr>
             <w:rStyle w:val="Hyperlink"/>
             <w:noProof/>
           </w:rPr>
-          <w:t>3.2</w:t>
+          <w:t>4.2</w:t>
         </w:r>
         <w:r>
           <w:rPr>
@@ -1296,7 +1919,7 @@
             <w:noProof/>
             <w:webHidden/>
           </w:rPr>
-          <w:instrText xml:space="preserve"> PAGEREF _Toc225841493 \h </w:instrText>
+          <w:instrText xml:space="preserve"> PAGEREF _Toc228744559 \h </w:instrText>
         </w:r>
         <w:r>
           <w:rPr>
@@ -1316,7 +1939,7 @@
             <w:noProof/>
             <w:webHidden/>
           </w:rPr>
-          <w:t>5</w:t>
+          <w:t>8</w:t>
         </w:r>
         <w:r>
           <w:rPr>
@@ -1328,8 +1951,16 @@
       </w:hyperlink>
     </w:p>
     <w:p>
+      <w:pPr>
+        <w:tabs>
+          <w:tab w:val="right" w:pos="9354"/>
+        </w:tabs>
+      </w:pPr>
       <w:r>
         <w:fldChar w:fldCharType="end"/>
+      </w:r>
+      <w:r>
+        <w:tab/>
       </w:r>
     </w:p>
     <w:p>
@@ -1342,7 +1973,7 @@
         <w:ind w:left="576" w:hanging="576"/>
       </w:pPr>
       <w:bookmarkStart w:id="20" w:name="_Toc303332171"/>
-      <w:bookmarkStart w:id="21" w:name="_Toc225841482"/>
+      <w:bookmarkStart w:id="21" w:name="_Toc228744547"/>
       <w:r>
         <w:t>Referenzdokumente</w:t>
       </w:r>
@@ -1367,7 +1998,7 @@
         <w:rPr>
           <w:rFonts w:cs="Arial"/>
         </w:rPr>
-        <w:t>…</w:t>
+        <w:t>backend-structure.drawio</w:t>
       </w:r>
     </w:p>
     <w:p>
@@ -1381,21 +2012,162 @@
         <w:contextualSpacing w:val="0"/>
         <w:rPr>
           <w:rFonts w:cs="Arial"/>
+          <w:lang w:val="en-US"/>
         </w:rPr>
       </w:pPr>
       <w:r>
         <w:rPr>
           <w:rFonts w:cs="Arial"/>
+          <w:lang w:val="en-US"/>
         </w:rPr>
-        <w:t>…</w:t>
+        <w:t>todo-list_concert-ticket-wa</w:t>
+      </w:r>
+      <w:r>
+        <w:rPr>
+          <w:rFonts w:cs="Arial"/>
+          <w:lang w:val="en-US"/>
+        </w:rPr>
+        <w:t>tcher.txt</w:t>
+      </w:r>
+    </w:p>
+    <w:p>
+      <w:pPr>
+        <w:pStyle w:val="Listenabsatz"/>
+        <w:numPr>
+          <w:ilvl w:val="0"/>
+          <w:numId w:val="5"/>
+        </w:numPr>
+        <w:ind w:left="425" w:hanging="425"/>
+        <w:contextualSpacing w:val="0"/>
+        <w:rPr>
+          <w:rFonts w:cs="Arial"/>
+          <w:lang w:val="en-US"/>
+        </w:rPr>
+      </w:pPr>
+      <w:r>
+        <w:rPr>
+          <w:rFonts w:eastAsia="Times New Roman"/>
+          <w:lang w:val="en-US"/>
+        </w:rPr>
+        <w:t>StartNewArtistWatch.</w:t>
+      </w:r>
+      <w:r>
+        <w:rPr>
+          <w:rFonts w:eastAsia="Times New Roman"/>
+          <w:lang w:val="en-US"/>
+        </w:rPr>
+        <w:t>html</w:t>
+      </w:r>
+    </w:p>
+    <w:p>
+      <w:pPr>
+        <w:pStyle w:val="Listenabsatz"/>
+        <w:numPr>
+          <w:ilvl w:val="0"/>
+          <w:numId w:val="5"/>
+        </w:numPr>
+        <w:ind w:left="425" w:hanging="425"/>
+        <w:contextualSpacing w:val="0"/>
+        <w:rPr>
+          <w:rFonts w:cs="Arial"/>
+          <w:lang w:val="en-US"/>
+        </w:rPr>
+      </w:pPr>
+      <w:r>
+        <w:rPr>
+          <w:rFonts w:eastAsia="Times New Roman"/>
+          <w:lang w:val="en-US"/>
+        </w:rPr>
+        <w:t>FillInConcertSettingsForm.</w:t>
+      </w:r>
+      <w:r>
+        <w:rPr>
+          <w:rFonts w:eastAsia="Times New Roman"/>
+          <w:lang w:val="en-US"/>
+        </w:rPr>
+        <w:t>html</w:t>
+      </w:r>
+    </w:p>
+    <w:p>
+      <w:pPr>
+        <w:pStyle w:val="Listenabsatz"/>
+        <w:numPr>
+          <w:ilvl w:val="0"/>
+          <w:numId w:val="5"/>
+        </w:numPr>
+        <w:ind w:left="425" w:hanging="425"/>
+        <w:contextualSpacing w:val="0"/>
+        <w:rPr>
+          <w:rFonts w:cs="Arial"/>
+          <w:lang w:val="en-US"/>
+        </w:rPr>
+      </w:pPr>
+      <w:r>
+        <w:rPr>
+          <w:rFonts w:eastAsia="Times New Roman"/>
+          <w:lang w:val="en-US"/>
+        </w:rPr>
+        <w:t>RespondToInvitation.</w:t>
+      </w:r>
+      <w:r>
+        <w:rPr>
+          <w:rFonts w:eastAsia="Times New Roman"/>
+          <w:lang w:val="en-US"/>
+        </w:rPr>
+        <w:t>html</w:t>
+      </w:r>
+    </w:p>
+    <w:p>
+      <w:pPr>
+        <w:pStyle w:val="Listenabsatz"/>
+        <w:numPr>
+          <w:ilvl w:val="0"/>
+          <w:numId w:val="5"/>
+        </w:numPr>
+        <w:ind w:left="425" w:hanging="425"/>
+        <w:contextualSpacing w:val="0"/>
+        <w:rPr>
+          <w:rFonts w:cs="Arial"/>
+          <w:lang w:val="en-US"/>
+        </w:rPr>
+      </w:pPr>
+      <w:r>
+        <w:rPr>
+          <w:rFonts w:eastAsia="Times New Roman"/>
+        </w:rPr>
+        <w:t>ViewInvitationResults.</w:t>
+      </w:r>
+      <w:r>
+        <w:rPr>
+          <w:rFonts w:eastAsia="Times New Roman"/>
+        </w:rPr>
+        <w:t>html</w:t>
       </w:r>
     </w:p>
     <w:bookmarkEnd w:id="22"/>
     <w:p>
       <w:pPr>
+        <w:rPr>
+          <w:lang w:val="en-US"/>
+        </w:rPr>
+      </w:pPr>
+    </w:p>
+    <w:p>
+      <w:pPr>
+        <w:rPr>
+          <w:lang w:val="en-US"/>
+        </w:rPr>
+      </w:pPr>
+    </w:p>
+    <w:p>
+      <w:pPr>
+        <w:jc w:val="left"/>
+        <w:rPr>
+          <w:lang w:val="en-US"/>
+        </w:rPr>
         <w:sectPr>
-          <w:headerReference w:type="default" r:id="rId14"/>
-          <w:footerReference w:type="default" r:id="rId15"/>
+          <w:headerReference w:type="default" r:id="rId16"/>
+          <w:footerReference w:type="default" r:id="rId17"/>
           <w:pgSz w:w="11906" w:h="16838" w:code="9"/>
           <w:pgMar w:top="2268" w:right="1134" w:bottom="1134" w:left="1418" w:header="397" w:footer="397" w:gutter="0"/>
           <w:cols w:space="708"/>
@@ -1406,33 +2178,401 @@
     <w:p>
       <w:pPr>
         <w:pStyle w:val="berschrift1"/>
+        <w:spacing w:line="276" w:lineRule="auto"/>
       </w:pPr>
       <w:bookmarkStart w:id="23" w:name="_Toc225841218"/>
-      <w:bookmarkStart w:id="24" w:name="_Toc225841483"/>
-      <w:bookmarkStart w:id="25" w:name="_Toc303332170"/>
+      <w:bookmarkStart w:id="24" w:name="_Toc303332170"/>
+      <w:bookmarkStart w:id="25" w:name="_Toc228744548"/>
       <w:r>
         <w:lastRenderedPageBreak/>
         <w:t>Einleitung</w:t>
       </w:r>
       <w:bookmarkEnd w:id="23"/>
-      <w:bookmarkEnd w:id="24"/>
+      <w:bookmarkEnd w:id="25"/>
     </w:p>
     <w:p>
       <w:pPr>
         <w:pStyle w:val="berschrift2"/>
       </w:pPr>
-      <w:bookmarkStart w:id="26" w:name="_Toc225841219"/>
-      <w:bookmarkStart w:id="27" w:name="_Toc225841484"/>
-      <w:bookmarkEnd w:id="25"/>
-      <w:r>
-        <w:t>Einleitung</w:t>
-      </w:r>
+      <w:bookmarkStart w:id="26" w:name="_Toc228744549"/>
+      <w:bookmarkEnd w:id="24"/>
+      <w:r>
+        <w:t>Auftragsbeschreibung</w:t>
+      </w:r>
+      <w:bookmarkEnd w:id="26"/>
     </w:p>
     <w:p>
       <w:r>
-        <w:t>X</w:t>
+        <w:t>Im Rahmen dieses betrieblichen Auftrags wurde eine automatisierte Engine entwickelt, die Nutzer benachrichtigt, sobald Konzerttickets für einen gewünschten Künstler in ihrer Nähe verfügbar sind. Die</w:t>
+      </w:r>
+      <w:r>
+        <w:t xml:space="preserve"> </w:t>
+      </w:r>
+      <w:r>
+        <w:t>Idee entstand aus dem alltäglichen Problem, dass Konzerte oft ausverkauft sind, bevor man von deren</w:t>
+      </w:r>
+      <w:r>
+        <w:t xml:space="preserve"> </w:t>
+      </w:r>
+      <w:r>
+        <w:t>Existenz erfährt. Die Engine übernimmt das kontinuierliche Überwachen und Prüfen vollständig</w:t>
+      </w:r>
+      <w:r>
+        <w:t xml:space="preserve"> </w:t>
+      </w:r>
+      <w:r>
+        <w:t>automatisiert</w:t>
+      </w:r>
+      <w:r>
+        <w:t>.</w:t>
       </w:r>
     </w:p>
+    <w:p>
+      <w:pPr>
+        <w:pStyle w:val="berschrift3"/>
+      </w:pPr>
+      <w:r>
+        <w:t>Zentral Anforderungen</w:t>
+      </w:r>
+    </w:p>
+    <w:tbl>
+      <w:tblPr>
+        <w:tblStyle w:val="Gitternetztabelle4Akzent1"/>
+        <w:tblW w:w="0" w:type="auto"/>
+        <w:tblLook w:val="04A0" w:firstRow="1" w:lastRow="0" w:firstColumn="1" w:lastColumn="0" w:noHBand="0" w:noVBand="1"/>
+      </w:tblPr>
+      <w:tblGrid>
+        <w:gridCol w:w="522"/>
+        <w:gridCol w:w="5053"/>
+        <w:gridCol w:w="3769"/>
+      </w:tblGrid>
+      <w:tr>
+        <w:trPr>
+          <w:cnfStyle w:val="100000000000" w:firstRow="1" w:lastRow="0" w:firstColumn="0" w:lastColumn="0" w:oddVBand="0" w:evenVBand="0" w:oddHBand="0" w:evenHBand="0" w:firstRowFirstColumn="0" w:firstRowLastColumn="0" w:lastRowFirstColumn="0" w:lastRowLastColumn="0"/>
+        </w:trPr>
+        <w:tc>
+          <w:tcPr>
+            <w:cnfStyle w:val="001000000000" w:firstRow="0" w:lastRow="0" w:firstColumn="1" w:lastColumn="0" w:oddVBand="0" w:evenVBand="0" w:oddHBand="0" w:evenHBand="0" w:firstRowFirstColumn="0" w:firstRowLastColumn="0" w:lastRowFirstColumn="0" w:lastRowLastColumn="0"/>
+            <w:tcW w:w="522" w:type="dxa"/>
+          </w:tcPr>
+          <w:p>
+            <w:pPr>
+              <w:spacing w:line="276" w:lineRule="auto"/>
+              <w:jc w:val="left"/>
+            </w:pPr>
+            <w:r>
+              <w:t xml:space="preserve">Nr. </w:t>
+            </w:r>
+          </w:p>
+        </w:tc>
+        <w:tc>
+          <w:tcPr>
+            <w:tcW w:w="5053" w:type="dxa"/>
+          </w:tcPr>
+          <w:p>
+            <w:pPr>
+              <w:spacing w:line="276" w:lineRule="auto"/>
+              <w:jc w:val="left"/>
+              <w:cnfStyle w:val="100000000000" w:firstRow="1" w:lastRow="0" w:firstColumn="0" w:lastColumn="0" w:oddVBand="0" w:evenVBand="0" w:oddHBand="0" w:evenHBand="0" w:firstRowFirstColumn="0" w:firstRowLastColumn="0" w:lastRowFirstColumn="0" w:lastRowLastColumn="0"/>
+            </w:pPr>
+            <w:r>
+              <w:t xml:space="preserve">Anforderungen </w:t>
+            </w:r>
+          </w:p>
+        </w:tc>
+        <w:tc>
+          <w:tcPr>
+            <w:tcW w:w="3769" w:type="dxa"/>
+          </w:tcPr>
+          <w:p>
+            <w:pPr>
+              <w:spacing w:line="276" w:lineRule="auto"/>
+              <w:jc w:val="left"/>
+              <w:cnfStyle w:val="100000000000" w:firstRow="1" w:lastRow="0" w:firstColumn="0" w:lastColumn="0" w:oddVBand="0" w:evenVBand="0" w:oddHBand="0" w:evenHBand="0" w:firstRowFirstColumn="0" w:firstRowLastColumn="0" w:lastRowFirstColumn="0" w:lastRowLastColumn="0"/>
+            </w:pPr>
+            <w:r>
+              <w:t>Umsetzung durch</w:t>
+            </w:r>
+          </w:p>
+        </w:tc>
+      </w:tr>
+      <w:tr>
+        <w:trPr>
+          <w:cnfStyle w:val="000000100000" w:firstRow="0" w:lastRow="0" w:firstColumn="0" w:lastColumn="0" w:oddVBand="0" w:evenVBand="0" w:oddHBand="1" w:evenHBand="0" w:firstRowFirstColumn="0" w:firstRowLastColumn="0" w:lastRowFirstColumn="0" w:lastRowLastColumn="0"/>
+        </w:trPr>
+        <w:tc>
+          <w:tcPr>
+            <w:cnfStyle w:val="001000000000" w:firstRow="0" w:lastRow="0" w:firstColumn="1" w:lastColumn="0" w:oddVBand="0" w:evenVBand="0" w:oddHBand="0" w:evenHBand="0" w:firstRowFirstColumn="0" w:firstRowLastColumn="0" w:lastRowFirstColumn="0" w:lastRowLastColumn="0"/>
+            <w:tcW w:w="522" w:type="dxa"/>
+          </w:tcPr>
+          <w:p>
+            <w:pPr>
+              <w:pStyle w:val="Tabelleninhalt"/>
+            </w:pPr>
+            <w:r>
+              <w:t>1</w:t>
+            </w:r>
+          </w:p>
+        </w:tc>
+        <w:tc>
+          <w:tcPr>
+            <w:tcW w:w="5053" w:type="dxa"/>
+          </w:tcPr>
+          <w:p>
+            <w:pPr>
+              <w:pStyle w:val="Tabelleninhalt"/>
+              <w:cnfStyle w:val="000000100000" w:firstRow="0" w:lastRow="0" w:firstColumn="0" w:lastColumn="0" w:oddVBand="0" w:evenVBand="0" w:oddHBand="1" w:evenHBand="0" w:firstRowFirstColumn="0" w:firstRowLastColumn="0" w:lastRowFirstColumn="0" w:lastRowLastColumn="0"/>
+            </w:pPr>
+            <w:r>
+              <w:t>Standort des Nutzers automatisch ermitteln</w:t>
+            </w:r>
+          </w:p>
+        </w:tc>
+        <w:tc>
+          <w:tcPr>
+            <w:tcW w:w="3769" w:type="dxa"/>
+          </w:tcPr>
+          <w:p>
+            <w:pPr>
+              <w:pStyle w:val="Tabelleninhalt"/>
+              <w:cnfStyle w:val="000000100000" w:firstRow="0" w:lastRow="0" w:firstColumn="0" w:lastColumn="0" w:oddVBand="0" w:evenVBand="0" w:oddHBand="1" w:evenHBand="0" w:firstRowFirstColumn="0" w:firstRowLastColumn="0" w:lastRowFirstColumn="0" w:lastRowLastColumn="0"/>
+            </w:pPr>
+            <w:r>
+              <w:t>GeolocationFetcher (ip-api.com)</w:t>
+            </w:r>
+          </w:p>
+        </w:tc>
+      </w:tr>
+      <w:tr>
+        <w:tc>
+          <w:tcPr>
+            <w:cnfStyle w:val="001000000000" w:firstRow="0" w:lastRow="0" w:firstColumn="1" w:lastColumn="0" w:oddVBand="0" w:evenVBand="0" w:oddHBand="0" w:evenHBand="0" w:firstRowFirstColumn="0" w:firstRowLastColumn="0" w:lastRowFirstColumn="0" w:lastRowLastColumn="0"/>
+            <w:tcW w:w="522" w:type="dxa"/>
+          </w:tcPr>
+          <w:p>
+            <w:pPr>
+              <w:pStyle w:val="Tabelleninhalt"/>
+            </w:pPr>
+            <w:r>
+              <w:t>2</w:t>
+            </w:r>
+          </w:p>
+        </w:tc>
+        <w:tc>
+          <w:tcPr>
+            <w:tcW w:w="5053" w:type="dxa"/>
+          </w:tcPr>
+          <w:p>
+            <w:pPr>
+              <w:pStyle w:val="Tabelleninhalt"/>
+              <w:cnfStyle w:val="000000000000" w:firstRow="0" w:lastRow="0" w:firstColumn="0" w:lastColumn="0" w:oddVBand="0" w:evenVBand="0" w:oddHBand="0" w:evenHBand="0" w:firstRowFirstColumn="0" w:firstRowLastColumn="0" w:lastRowFirstColumn="0" w:lastRowLastColumn="0"/>
+            </w:pPr>
+            <w:r>
+              <w:t>Konzerte eines Künstlers in der Nähe suchen</w:t>
+            </w:r>
+          </w:p>
+        </w:tc>
+        <w:tc>
+          <w:tcPr>
+            <w:tcW w:w="3769" w:type="dxa"/>
+          </w:tcPr>
+          <w:p>
+            <w:pPr>
+              <w:pStyle w:val="Tabelleninhalt"/>
+              <w:cnfStyle w:val="000000000000" w:firstRow="0" w:lastRow="0" w:firstColumn="0" w:lastColumn="0" w:oddVBand="0" w:evenVBand="0" w:oddHBand="0" w:evenHBand="0" w:firstRowFirstColumn="0" w:firstRowLastColumn="0" w:lastRowFirstColumn="0" w:lastRowLastColumn="0"/>
+            </w:pPr>
+            <w:r>
+              <w:t>TicketmasterEventFetcher</w:t>
+            </w:r>
+          </w:p>
+        </w:tc>
+      </w:tr>
+      <w:tr>
+        <w:trPr>
+          <w:cnfStyle w:val="000000100000" w:firstRow="0" w:lastRow="0" w:firstColumn="0" w:lastColumn="0" w:oddVBand="0" w:evenVBand="0" w:oddHBand="1" w:evenHBand="0" w:firstRowFirstColumn="0" w:firstRowLastColumn="0" w:lastRowFirstColumn="0" w:lastRowLastColumn="0"/>
+        </w:trPr>
+        <w:tc>
+          <w:tcPr>
+            <w:cnfStyle w:val="001000000000" w:firstRow="0" w:lastRow="0" w:firstColumn="1" w:lastColumn="0" w:oddVBand="0" w:evenVBand="0" w:oddHBand="0" w:evenHBand="0" w:firstRowFirstColumn="0" w:firstRowLastColumn="0" w:lastRowFirstColumn="0" w:lastRowLastColumn="0"/>
+            <w:tcW w:w="522" w:type="dxa"/>
+          </w:tcPr>
+          <w:p>
+            <w:pPr>
+              <w:pStyle w:val="Tabelleninhalt"/>
+            </w:pPr>
+            <w:r>
+              <w:t>3</w:t>
+            </w:r>
+          </w:p>
+        </w:tc>
+        <w:tc>
+          <w:tcPr>
+            <w:tcW w:w="5053" w:type="dxa"/>
+          </w:tcPr>
+          <w:p>
+            <w:pPr>
+              <w:pStyle w:val="Tabelleninhalt"/>
+              <w:cnfStyle w:val="000000100000" w:firstRow="0" w:lastRow="0" w:firstColumn="0" w:lastColumn="0" w:oddVBand="0" w:evenVBand="0" w:oddHBand="1" w:evenHBand="0" w:firstRowFirstColumn="0" w:firstRowLastColumn="0" w:lastRowFirstColumn="0" w:lastRowLastColumn="0"/>
+            </w:pPr>
+            <w:r>
+              <w:t xml:space="preserve">Eingeladene </w:t>
+            </w:r>
+            <w:r>
+              <w:t>Nutzer validieren</w:t>
+            </w:r>
+          </w:p>
+        </w:tc>
+        <w:tc>
+          <w:tcPr>
+            <w:tcW w:w="3769" w:type="dxa"/>
+          </w:tcPr>
+          <w:p>
+            <w:pPr>
+              <w:pStyle w:val="Tabelleninhalt"/>
+              <w:cnfStyle w:val="000000100000" w:firstRow="0" w:lastRow="0" w:firstColumn="0" w:lastColumn="0" w:oddVBand="0" w:evenVBand="0" w:oddHBand="1" w:evenHBand="0" w:firstRowFirstColumn="0" w:firstRowLastColumn="0" w:lastRowFirstColumn="0" w:lastRowLastColumn="0"/>
+            </w:pPr>
+            <w:r>
+              <w:t>InviteeTaskService</w:t>
+            </w:r>
+          </w:p>
+        </w:tc>
+      </w:tr>
+      <w:tr>
+        <w:tc>
+          <w:tcPr>
+            <w:cnfStyle w:val="001000000000" w:firstRow="0" w:lastRow="0" w:firstColumn="1" w:lastColumn="0" w:oddVBand="0" w:evenVBand="0" w:oddHBand="0" w:evenHBand="0" w:firstRowFirstColumn="0" w:firstRowLastColumn="0" w:lastRowFirstColumn="0" w:lastRowLastColumn="0"/>
+            <w:tcW w:w="522" w:type="dxa"/>
+          </w:tcPr>
+          <w:p>
+            <w:pPr>
+              <w:pStyle w:val="Tabelleninhalt"/>
+            </w:pPr>
+            <w:r>
+              <w:t>4</w:t>
+            </w:r>
+          </w:p>
+        </w:tc>
+        <w:tc>
+          <w:tcPr>
+            <w:tcW w:w="5053" w:type="dxa"/>
+          </w:tcPr>
+          <w:p>
+            <w:pPr>
+              <w:pStyle w:val="Tabelleninhalt"/>
+              <w:cnfStyle w:val="000000000000" w:firstRow="0" w:lastRow="0" w:firstColumn="0" w:lastColumn="0" w:oddVBand="0" w:evenVBand="0" w:oddHBand="0" w:evenHBand="0" w:firstRowFirstColumn="0" w:firstRowLastColumn="0" w:lastRowFirstColumn="0" w:lastRowLastColumn="0"/>
+            </w:pPr>
+            <w:r>
+              <w:t>Ticket-Verfügbarkeit eines Events prüfen</w:t>
+            </w:r>
+          </w:p>
+        </w:tc>
+        <w:tc>
+          <w:tcPr>
+            <w:tcW w:w="3769" w:type="dxa"/>
+          </w:tcPr>
+          <w:p>
+            <w:pPr>
+              <w:pStyle w:val="Tabelleninhalt"/>
+              <w:cnfStyle w:val="000000000000" w:firstRow="0" w:lastRow="0" w:firstColumn="0" w:lastColumn="0" w:oddVBand="0" w:evenVBand="0" w:oddHBand="0" w:evenHBand="0" w:firstRowFirstColumn="0" w:firstRowLastColumn="0" w:lastRowFirstColumn="0" w:lastRowLastColumn="0"/>
+            </w:pPr>
+            <w:r>
+              <w:t>TicketmasterTicketFetcher</w:t>
+            </w:r>
+          </w:p>
+        </w:tc>
+      </w:tr>
+      <w:tr>
+        <w:trPr>
+          <w:cnfStyle w:val="000000100000" w:firstRow="0" w:lastRow="0" w:firstColumn="0" w:lastColumn="0" w:oddVBand="0" w:evenVBand="0" w:oddHBand="1" w:evenHBand="0" w:firstRowFirstColumn="0" w:firstRowLastColumn="0" w:lastRowFirstColumn="0" w:lastRowLastColumn="0"/>
+        </w:trPr>
+        <w:tc>
+          <w:tcPr>
+            <w:cnfStyle w:val="001000000000" w:firstRow="0" w:lastRow="0" w:firstColumn="1" w:lastColumn="0" w:oddVBand="0" w:evenVBand="0" w:oddHBand="0" w:evenHBand="0" w:firstRowFirstColumn="0" w:firstRowLastColumn="0" w:lastRowFirstColumn="0" w:lastRowLastColumn="0"/>
+            <w:tcW w:w="522" w:type="dxa"/>
+          </w:tcPr>
+          <w:p>
+            <w:pPr>
+              <w:pStyle w:val="Tabelleninhalt"/>
+            </w:pPr>
+            <w:r>
+              <w:t>5</w:t>
+            </w:r>
+          </w:p>
+        </w:tc>
+        <w:tc>
+          <w:tcPr>
+            <w:tcW w:w="5053" w:type="dxa"/>
+          </w:tcPr>
+          <w:p>
+            <w:pPr>
+              <w:pStyle w:val="Tabelleninhalt"/>
+              <w:cnfStyle w:val="000000100000" w:firstRow="0" w:lastRow="0" w:firstColumn="0" w:lastColumn="0" w:oddVBand="0" w:evenVBand="0" w:oddHBand="1" w:evenHBand="0" w:firstRowFirstColumn="0" w:firstRowLastColumn="0" w:lastRowFirstColumn="0" w:lastRowLastColumn="0"/>
+            </w:pPr>
+            <w:r>
+              <w:t>Nutzerdaten persistent speichern</w:t>
+            </w:r>
+          </w:p>
+        </w:tc>
+        <w:tc>
+          <w:tcPr>
+            <w:tcW w:w="3769" w:type="dxa"/>
+          </w:tcPr>
+          <w:p>
+            <w:pPr>
+              <w:pStyle w:val="Tabelleninhalt"/>
+              <w:cnfStyle w:val="000000100000" w:firstRow="0" w:lastRow="0" w:firstColumn="0" w:lastColumn="0" w:oddVBand="0" w:evenVBand="0" w:oddHBand="1" w:evenHBand="0" w:firstRowFirstColumn="0" w:firstRowLastColumn="0" w:lastRowFirstColumn="0" w:lastRowLastColumn="0"/>
+            </w:pPr>
+            <w:r>
+              <w:t>UserRepository (PostgreSQL)</w:t>
+            </w:r>
+          </w:p>
+        </w:tc>
+      </w:tr>
+      <w:tr>
+        <w:tc>
+          <w:tcPr>
+            <w:cnfStyle w:val="001000000000" w:firstRow="0" w:lastRow="0" w:firstColumn="1" w:lastColumn="0" w:oddVBand="0" w:evenVBand="0" w:oddHBand="0" w:evenHBand="0" w:firstRowFirstColumn="0" w:firstRowLastColumn="0" w:lastRowFirstColumn="0" w:lastRowLastColumn="0"/>
+            <w:tcW w:w="522" w:type="dxa"/>
+          </w:tcPr>
+          <w:p>
+            <w:pPr>
+              <w:pStyle w:val="Tabelleninhalt"/>
+            </w:pPr>
+            <w:r>
+              <w:t>6</w:t>
+            </w:r>
+          </w:p>
+        </w:tc>
+        <w:tc>
+          <w:tcPr>
+            <w:tcW w:w="5053" w:type="dxa"/>
+          </w:tcPr>
+          <w:p>
+            <w:pPr>
+              <w:pStyle w:val="Tabelleninhalt"/>
+              <w:cnfStyle w:val="000000000000" w:firstRow="0" w:lastRow="0" w:firstColumn="0" w:lastColumn="0" w:oddVBand="0" w:evenVBand="0" w:oddHBand="0" w:evenHBand="0" w:firstRowFirstColumn="0" w:firstRowLastColumn="0" w:lastRowFirstColumn="0" w:lastRowLastColumn="0"/>
+            </w:pPr>
+            <w:r>
+              <w:t>Fehlgeschlagene Aufgaben automatisch wiederholen</w:t>
+            </w:r>
+          </w:p>
+        </w:tc>
+        <w:tc>
+          <w:tcPr>
+            <w:tcW w:w="3769" w:type="dxa"/>
+          </w:tcPr>
+          <w:p>
+            <w:pPr>
+              <w:pStyle w:val="Tabelleninhalt"/>
+              <w:cnfStyle w:val="000000000000" w:firstRow="0" w:lastRow="0" w:firstColumn="0" w:lastColumn="0" w:oddVBand="0" w:evenVBand="0" w:oddHBand="0" w:evenHBand="0" w:firstRowFirstColumn="0" w:firstRowLastColumn="0" w:lastRowFirstColumn="0" w:lastRowLastColumn="0"/>
+            </w:pPr>
+            <w:r>
+              <w:t>Camunda handleFailure()</w:t>
+            </w:r>
+          </w:p>
+        </w:tc>
+      </w:tr>
+    </w:tbl>
     <w:p>
       <w:pPr>
         <w:pStyle w:val="berschrift2"/>
@@ -1440,17 +2580,1086 @@
           <w:ilvl w:val="1"/>
           <w:numId w:val="1"/>
         </w:numPr>
-      </w:pPr>
-      <w:r>
-        <w:t>Auftrag</w:t>
-      </w:r>
-      <w:bookmarkEnd w:id="26"/>
+        <w:spacing w:line="276" w:lineRule="auto"/>
+      </w:pPr>
+      <w:bookmarkStart w:id="27" w:name="_Toc225841220"/>
+      <w:bookmarkStart w:id="28" w:name="_Toc228744550"/>
+      <w:r>
+        <w:t>Setup</w:t>
+      </w:r>
       <w:bookmarkEnd w:id="27"/>
+      <w:bookmarkEnd w:id="28"/>
+    </w:p>
+    <w:tbl>
+      <w:tblPr>
+        <w:tblStyle w:val="Tabellenraster"/>
+        <w:tblW w:w="0" w:type="auto"/>
+        <w:tblInd w:w="0" w:type="dxa"/>
+        <w:tblBorders>
+          <w:top w:val="none" w:sz="0" w:space="0" w:color="auto"/>
+          <w:left w:val="none" w:sz="0" w:space="0" w:color="auto"/>
+          <w:bottom w:val="none" w:sz="0" w:space="0" w:color="auto"/>
+          <w:right w:val="none" w:sz="0" w:space="0" w:color="auto"/>
+          <w:insideH w:val="none" w:sz="0" w:space="0" w:color="auto"/>
+          <w:insideV w:val="none" w:sz="0" w:space="0" w:color="auto"/>
+        </w:tblBorders>
+        <w:tblLook w:val="04A0" w:firstRow="1" w:lastRow="0" w:firstColumn="1" w:lastColumn="0" w:noHBand="0" w:noVBand="1"/>
+      </w:tblPr>
+      <w:tblGrid>
+        <w:gridCol w:w="704"/>
+        <w:gridCol w:w="8533"/>
+      </w:tblGrid>
+      <w:tr>
+        <w:trPr>
+          <w:cnfStyle w:val="100000000000" w:firstRow="1" w:lastRow="0" w:firstColumn="0" w:lastColumn="0" w:oddVBand="0" w:evenVBand="0" w:oddHBand="0" w:evenHBand="0" w:firstRowFirstColumn="0" w:firstRowLastColumn="0" w:lastRowFirstColumn="0" w:lastRowLastColumn="0"/>
+          <w:trHeight w:val="860"/>
+        </w:trPr>
+        <w:tc>
+          <w:tcPr>
+            <w:tcW w:w="704" w:type="dxa"/>
+            <w:shd w:val="clear" w:color="auto" w:fill="548DD4" w:themeFill="text2" w:themeFillTint="99"/>
+          </w:tcPr>
+          <w:p/>
+          <w:p>
+            <w:r>
+              <w:rPr>
+                <w:color w:val="FFFFFF" w:themeColor="background1"/>
+              </w:rPr>
+              <w:t>1</w:t>
+            </w:r>
+          </w:p>
+        </w:tc>
+        <w:tc>
+          <w:tcPr>
+            <w:tcW w:w="8533" w:type="dxa"/>
+            <w:shd w:val="clear" w:color="auto" w:fill="FFFFFF" w:themeFill="background1"/>
+          </w:tcPr>
+          <w:p>
+            <w:pPr>
+              <w:rPr>
+                <w:b/>
+                <w:bCs/>
+              </w:rPr>
+            </w:pPr>
+            <w:r>
+              <w:t xml:space="preserve">                                                                                                                                                   </w:t>
+            </w:r>
+            <w:r>
+              <w:t xml:space="preserve"> </w:t>
+            </w:r>
+            <w:r>
+              <w:t xml:space="preserve"> </w:t>
+            </w:r>
+            <w:r>
+              <w:t xml:space="preserve"> </w:t>
+            </w:r>
+            <w:r>
+              <w:rPr>
+                <w:b/>
+                <w:bCs/>
+              </w:rPr>
+              <w:t>PostgreSQL Container starten</w:t>
+            </w:r>
+          </w:p>
+          <w:p>
+            <w:pPr>
+              <w:pStyle w:val="Code"/>
+            </w:pPr>
+            <w:r>
+              <w:t xml:space="preserve">docker run --name concert-db -e </w:t>
+            </w:r>
+            <w:r>
+              <w:rPr>
+                <w:szCs w:val="20"/>
+              </w:rPr>
+              <w:t>POSTGRES_DB</w:t>
+            </w:r>
+            <w:r>
+              <w:t>=concertdb</w:t>
+            </w:r>
+            <w:r>
+              <w:t xml:space="preserve"> </w:t>
+            </w:r>
+            <w:r>
+              <w:t xml:space="preserve">-e </w:t>
+            </w:r>
+            <w:r>
+              <w:rPr>
+                <w:szCs w:val="20"/>
+              </w:rPr>
+              <w:t>POSTGRES_USER</w:t>
+            </w:r>
+            <w:r>
+              <w:t xml:space="preserve">=admin -e </w:t>
+            </w:r>
+            <w:r>
+              <w:rPr>
+                <w:szCs w:val="20"/>
+              </w:rPr>
+              <w:t>POSTGRES_PASSWORD</w:t>
+            </w:r>
+            <w:r>
+              <w:t>=admin</w:t>
+            </w:r>
+            <w:r>
+              <w:t xml:space="preserve"> </w:t>
+            </w:r>
+            <w:r>
+              <w:t>-p 5432:5432 -d postgres</w:t>
+            </w:r>
+          </w:p>
+        </w:tc>
+      </w:tr>
+    </w:tbl>
+    <w:p/>
+    <w:tbl>
+      <w:tblPr>
+        <w:tblStyle w:val="Tabellenraster"/>
+        <w:tblW w:w="0" w:type="auto"/>
+        <w:tblInd w:w="0" w:type="dxa"/>
+        <w:tblBorders>
+          <w:top w:val="none" w:sz="0" w:space="0" w:color="auto"/>
+          <w:left w:val="none" w:sz="0" w:space="0" w:color="auto"/>
+          <w:bottom w:val="none" w:sz="0" w:space="0" w:color="auto"/>
+          <w:right w:val="none" w:sz="0" w:space="0" w:color="auto"/>
+          <w:insideH w:val="none" w:sz="0" w:space="0" w:color="auto"/>
+          <w:insideV w:val="none" w:sz="0" w:space="0" w:color="auto"/>
+        </w:tblBorders>
+        <w:tblLook w:val="04A0" w:firstRow="1" w:lastRow="0" w:firstColumn="1" w:lastColumn="0" w:noHBand="0" w:noVBand="1"/>
+      </w:tblPr>
+      <w:tblGrid>
+        <w:gridCol w:w="703"/>
+        <w:gridCol w:w="8537"/>
+      </w:tblGrid>
+      <w:tr>
+        <w:trPr>
+          <w:cnfStyle w:val="100000000000" w:firstRow="1" w:lastRow="0" w:firstColumn="0" w:lastColumn="0" w:oddVBand="0" w:evenVBand="0" w:oddHBand="0" w:evenHBand="0" w:firstRowFirstColumn="0" w:firstRowLastColumn="0" w:lastRowFirstColumn="0" w:lastRowLastColumn="0"/>
+          <w:trHeight w:val="333"/>
+        </w:trPr>
+        <w:tc>
+          <w:tcPr>
+            <w:tcW w:w="703" w:type="dxa"/>
+            <w:shd w:val="clear" w:color="auto" w:fill="548DD4" w:themeFill="text2" w:themeFillTint="99"/>
+          </w:tcPr>
+          <w:p/>
+          <w:p>
+            <w:r>
+              <w:rPr>
+                <w:color w:val="FFFFFF" w:themeColor="background1"/>
+                <w:sz w:val="20"/>
+                <w:szCs w:val="20"/>
+              </w:rPr>
+              <w:t>2</w:t>
+            </w:r>
+          </w:p>
+        </w:tc>
+        <w:tc>
+          <w:tcPr>
+            <w:tcW w:w="8537" w:type="dxa"/>
+            <w:shd w:val="clear" w:color="auto" w:fill="FFFFFF" w:themeFill="background1"/>
+          </w:tcPr>
+          <w:p>
+            <w:pPr>
+              <w:rPr>
+                <w:b/>
+                <w:bCs/>
+                <w:sz w:val="28"/>
+                <w:szCs w:val="28"/>
+              </w:rPr>
+            </w:pPr>
+            <w:r>
+              <w:t xml:space="preserve">                                                                                                                                                        </w:t>
+            </w:r>
+            <w:r>
+              <w:t xml:space="preserve"> </w:t>
+            </w:r>
+            <w:r>
+              <w:t xml:space="preserve"> </w:t>
+            </w:r>
+            <w:r>
+              <w:t xml:space="preserve"> </w:t>
+            </w:r>
+            <w:r>
+              <w:rPr>
+                <w:b/>
+                <w:bCs/>
+              </w:rPr>
+              <w:t>Camunda Container starten</w:t>
+            </w:r>
+          </w:p>
+          <w:p>
+            <w:pPr>
+              <w:pStyle w:val="Code"/>
+              <w:rPr>
+                <w:szCs w:val="20"/>
+              </w:rPr>
+            </w:pPr>
+            <w:r>
+              <w:t>docker run --name camunda -p 8080:8080 -d camunda/camunda-bpm</w:t>
+            </w:r>
+            <w:r>
+              <w:t xml:space="preserve"> </w:t>
+            </w:r>
+            <w:r>
+              <w:t>platform:7.20.0</w:t>
+            </w:r>
+          </w:p>
+        </w:tc>
+      </w:tr>
+    </w:tbl>
+    <w:p/>
+    <w:tbl>
+      <w:tblPr>
+        <w:tblStyle w:val="Tabellenraster"/>
+        <w:tblW w:w="0" w:type="auto"/>
+        <w:tblInd w:w="0" w:type="dxa"/>
+        <w:tblBorders>
+          <w:top w:val="none" w:sz="0" w:space="0" w:color="auto"/>
+          <w:left w:val="none" w:sz="0" w:space="0" w:color="auto"/>
+          <w:bottom w:val="none" w:sz="0" w:space="0" w:color="auto"/>
+          <w:right w:val="none" w:sz="0" w:space="0" w:color="auto"/>
+          <w:insideH w:val="none" w:sz="0" w:space="0" w:color="auto"/>
+          <w:insideV w:val="none" w:sz="0" w:space="0" w:color="auto"/>
+        </w:tblBorders>
+        <w:tblLook w:val="04A0" w:firstRow="1" w:lastRow="0" w:firstColumn="1" w:lastColumn="0" w:noHBand="0" w:noVBand="1"/>
+      </w:tblPr>
+      <w:tblGrid>
+        <w:gridCol w:w="704"/>
+        <w:gridCol w:w="8533"/>
+      </w:tblGrid>
+      <w:tr>
+        <w:trPr>
+          <w:cnfStyle w:val="100000000000" w:firstRow="1" w:lastRow="0" w:firstColumn="0" w:lastColumn="0" w:oddVBand="0" w:evenVBand="0" w:oddHBand="0" w:evenHBand="0" w:firstRowFirstColumn="0" w:firstRowLastColumn="0" w:lastRowFirstColumn="0" w:lastRowLastColumn="0"/>
+          <w:trHeight w:val="1046"/>
+        </w:trPr>
+        <w:tc>
+          <w:tcPr>
+            <w:tcW w:w="704" w:type="dxa"/>
+            <w:shd w:val="clear" w:color="auto" w:fill="548DD4" w:themeFill="text2" w:themeFillTint="99"/>
+          </w:tcPr>
+          <w:p/>
+          <w:p>
+            <w:r>
+              <w:rPr>
+                <w:color w:val="FFFFFF" w:themeColor="background1"/>
+                <w:sz w:val="20"/>
+                <w:szCs w:val="20"/>
+              </w:rPr>
+              <w:t>3</w:t>
+            </w:r>
+          </w:p>
+        </w:tc>
+        <w:tc>
+          <w:tcPr>
+            <w:tcW w:w="8533" w:type="dxa"/>
+            <w:shd w:val="clear" w:color="auto" w:fill="FFFFFF" w:themeFill="background1"/>
+          </w:tcPr>
+          <w:p>
+            <w:pPr>
+              <w:rPr>
+                <w:rStyle w:val="berschrift4Zchn"/>
+              </w:rPr>
+            </w:pPr>
+            <w:r>
+              <w:t xml:space="preserve">                                                                                                                                                       </w:t>
+            </w:r>
+            <w:r>
+              <w:t xml:space="preserve">   </w:t>
+            </w:r>
+            <w:r>
+              <w:t xml:space="preserve">  </w:t>
+            </w:r>
+            <w:r>
+              <w:t xml:space="preserve">             </w:t>
+            </w:r>
+            <w:r>
+              <w:rPr>
+                <w:rStyle w:val="berschrift4Zchn"/>
+              </w:rPr>
+              <w:t>Camunda öffnen und einloggen</w:t>
+            </w:r>
+          </w:p>
+          <w:p>
+            <w:pPr>
+              <w:rPr>
+                <w:color w:val="595959" w:themeColor="text1" w:themeTint="A6"/>
+                <w:sz w:val="18"/>
+                <w:szCs w:val="18"/>
+              </w:rPr>
+            </w:pPr>
+            <w:hyperlink r:id="rId18" w:history="1">
+              <w:r>
+                <w:rPr>
+                  <w:i/>
+                  <w:u w:val="single"/>
+                </w:rPr>
+                <w:t>http://localhost:8080/camunda</w:t>
+              </w:r>
+            </w:hyperlink>
+            <w:r>
+              <w:rPr>
+                <w:color w:val="595959" w:themeColor="text1" w:themeTint="A6"/>
+              </w:rPr>
+              <w:t xml:space="preserve"> </w:t>
+            </w:r>
+            <w:r>
+              <w:rPr>
+                <w:color w:val="595959" w:themeColor="text1" w:themeTint="A6"/>
+              </w:rPr>
+              <w:t>(</w:t>
+            </w:r>
+            <w:r>
+              <w:t>Username: demo | Password: demo</w:t>
+            </w:r>
+            <w:r>
+              <w:t>)</w:t>
+            </w:r>
+          </w:p>
+        </w:tc>
+      </w:tr>
+    </w:tbl>
+    <w:p/>
+    <w:tbl>
+      <w:tblPr>
+        <w:tblStyle w:val="Tabellenraster"/>
+        <w:tblW w:w="0" w:type="auto"/>
+        <w:tblInd w:w="0" w:type="dxa"/>
+        <w:tblBorders>
+          <w:top w:val="none" w:sz="0" w:space="0" w:color="auto"/>
+          <w:left w:val="none" w:sz="0" w:space="0" w:color="auto"/>
+          <w:bottom w:val="none" w:sz="0" w:space="0" w:color="auto"/>
+          <w:right w:val="none" w:sz="0" w:space="0" w:color="auto"/>
+          <w:insideH w:val="none" w:sz="0" w:space="0" w:color="auto"/>
+          <w:insideV w:val="none" w:sz="0" w:space="0" w:color="auto"/>
+        </w:tblBorders>
+        <w:tblLook w:val="04A0" w:firstRow="1" w:lastRow="0" w:firstColumn="1" w:lastColumn="0" w:noHBand="0" w:noVBand="1"/>
+      </w:tblPr>
+      <w:tblGrid>
+        <w:gridCol w:w="704"/>
+        <w:gridCol w:w="8533"/>
+      </w:tblGrid>
+      <w:tr>
+        <w:trPr>
+          <w:cnfStyle w:val="100000000000" w:firstRow="1" w:lastRow="0" w:firstColumn="0" w:lastColumn="0" w:oddVBand="0" w:evenVBand="0" w:oddHBand="0" w:evenHBand="0" w:firstRowFirstColumn="0" w:firstRowLastColumn="0" w:lastRowFirstColumn="0" w:lastRowLastColumn="0"/>
+          <w:trHeight w:val="431"/>
+        </w:trPr>
+        <w:tc>
+          <w:tcPr>
+            <w:tcW w:w="704" w:type="dxa"/>
+            <w:shd w:val="clear" w:color="auto" w:fill="548DD4" w:themeFill="text2" w:themeFillTint="99"/>
+          </w:tcPr>
+          <w:p/>
+          <w:p>
+            <w:r>
+              <w:rPr>
+                <w:color w:val="FFFFFF" w:themeColor="background1"/>
+                <w:sz w:val="20"/>
+                <w:szCs w:val="20"/>
+              </w:rPr>
+              <w:t>4</w:t>
+            </w:r>
+          </w:p>
+        </w:tc>
+        <w:tc>
+          <w:tcPr>
+            <w:tcW w:w="8533" w:type="dxa"/>
+            <w:shd w:val="clear" w:color="auto" w:fill="FFFFFF" w:themeFill="background1"/>
+          </w:tcPr>
+          <w:p>
+            <w:pPr>
+              <w:rPr>
+                <w:sz w:val="28"/>
+                <w:szCs w:val="28"/>
+              </w:rPr>
+            </w:pPr>
+            <w:r>
+              <w:t xml:space="preserve">                                                                                                                                                             </w:t>
+            </w:r>
+            <w:r>
+              <w:t xml:space="preserve"> </w:t>
+            </w:r>
+            <w:r>
+              <w:rPr>
+                <w:rStyle w:val="berschrift4Zchn"/>
+              </w:rPr>
+              <w:t>BPMN deployen</w:t>
+            </w:r>
+          </w:p>
+          <w:p>
+            <w:pPr>
+              <w:rPr>
+                <w:sz w:val="18"/>
+                <w:szCs w:val="18"/>
+              </w:rPr>
+            </w:pPr>
+            <w:r>
+              <w:t>Camunda Modeler öffnen, ConcertTicketWatcher.bpmn laden und zusammen mit allen. form-Dateien</w:t>
+            </w:r>
+            <w:r>
+              <w:t xml:space="preserve"> </w:t>
+            </w:r>
+            <w:r>
+              <w:t>a</w:t>
+            </w:r>
+            <w:r>
+              <w:t>uf</w:t>
+            </w:r>
+            <w:r>
+              <w:t xml:space="preserve"> </w:t>
+            </w:r>
+            <w:hyperlink r:id="rId19" w:history="1">
+              <w:r>
+                <w:rPr>
+                  <w:i/>
+                  <w:iCs/>
+                  <w:u w:val="single"/>
+                </w:rPr>
+                <w:t>http://localhost:8080/engine-rest</w:t>
+              </w:r>
+              <w:r>
+                <w:rPr>
+                  <w:rStyle w:val="Hyperlink"/>
+                  <w:i/>
+                  <w:iCs/>
+                  <w:color w:val="5959FF" w:themeColor="hyperlink" w:themeTint="A6"/>
+                  <w:sz w:val="20"/>
+                  <w:szCs w:val="20"/>
+                </w:rPr>
+                <w:t xml:space="preserve"> </w:t>
+              </w:r>
+            </w:hyperlink>
+            <w:r>
+              <w:t>deployen</w:t>
+            </w:r>
+          </w:p>
+        </w:tc>
+      </w:tr>
+    </w:tbl>
+    <w:p/>
+    <w:tbl>
+      <w:tblPr>
+        <w:tblStyle w:val="Tabellenraster"/>
+        <w:tblW w:w="0" w:type="auto"/>
+        <w:tblInd w:w="0" w:type="dxa"/>
+        <w:tblBorders>
+          <w:top w:val="none" w:sz="0" w:space="0" w:color="auto"/>
+          <w:left w:val="none" w:sz="0" w:space="0" w:color="auto"/>
+          <w:bottom w:val="none" w:sz="0" w:space="0" w:color="auto"/>
+          <w:right w:val="none" w:sz="0" w:space="0" w:color="auto"/>
+          <w:insideH w:val="none" w:sz="0" w:space="0" w:color="auto"/>
+          <w:insideV w:val="none" w:sz="0" w:space="0" w:color="auto"/>
+        </w:tblBorders>
+        <w:tblLook w:val="04A0" w:firstRow="1" w:lastRow="0" w:firstColumn="1" w:lastColumn="0" w:noHBand="0" w:noVBand="1"/>
+      </w:tblPr>
+      <w:tblGrid>
+        <w:gridCol w:w="704"/>
+        <w:gridCol w:w="8533"/>
+      </w:tblGrid>
+      <w:tr>
+        <w:trPr>
+          <w:cnfStyle w:val="100000000000" w:firstRow="1" w:lastRow="0" w:firstColumn="0" w:lastColumn="0" w:oddVBand="0" w:evenVBand="0" w:oddHBand="0" w:evenHBand="0" w:firstRowFirstColumn="0" w:firstRowLastColumn="0" w:lastRowFirstColumn="0" w:lastRowLastColumn="0"/>
+          <w:trHeight w:val="982"/>
+        </w:trPr>
+        <w:tc>
+          <w:tcPr>
+            <w:tcW w:w="704" w:type="dxa"/>
+            <w:shd w:val="clear" w:color="auto" w:fill="548DD4" w:themeFill="text2" w:themeFillTint="99"/>
+          </w:tcPr>
+          <w:p/>
+          <w:p>
+            <w:r>
+              <w:rPr>
+                <w:color w:val="FFFFFF" w:themeColor="background1"/>
+                <w:sz w:val="20"/>
+                <w:szCs w:val="20"/>
+              </w:rPr>
+              <w:t>5</w:t>
+            </w:r>
+          </w:p>
+        </w:tc>
+        <w:tc>
+          <w:tcPr>
+            <w:tcW w:w="8533" w:type="dxa"/>
+            <w:shd w:val="clear" w:color="auto" w:fill="FFFFFF" w:themeFill="background1"/>
+          </w:tcPr>
+          <w:p>
+            <w:r>
+              <w:rPr>
+                <w:sz w:val="20"/>
+                <w:szCs w:val="20"/>
+              </w:rPr>
+              <w:t xml:space="preserve">     </w:t>
+            </w:r>
+            <w:r>
+              <w:t xml:space="preserve">                                                                                                                                                   </w:t>
+            </w:r>
+            <w:r>
+              <w:t xml:space="preserve"> </w:t>
+            </w:r>
+            <w:r>
+              <w:t xml:space="preserve">  </w:t>
+            </w:r>
+            <w:r>
+              <w:t xml:space="preserve">   </w:t>
+            </w:r>
+            <w:r>
+              <w:rPr>
+                <w:rStyle w:val="berschrift4Zchn"/>
+              </w:rPr>
+              <w:t>Benutzer anlegen</w:t>
+            </w:r>
+          </w:p>
+          <w:p>
+            <w:r>
+              <w:t>Gehe zu</w:t>
+            </w:r>
+            <w:r>
+              <w:t xml:space="preserve"> </w:t>
+            </w:r>
+            <w:hyperlink r:id="rId20" w:history="1">
+              <w:r>
+                <w:rPr>
+                  <w:i/>
+                  <w:iCs/>
+                  <w:u w:val="single"/>
+                </w:rPr>
+                <w:t>http://localhost:8080/camunda/app/admin</w:t>
+              </w:r>
+            </w:hyperlink>
+            <w:r>
+              <w:t>.</w:t>
+            </w:r>
+            <w:r>
+              <w:t xml:space="preserve"> </w:t>
+            </w:r>
+            <w:r>
+              <w:t>Mindestens zwei Benutzer mit E-Mail-</w:t>
+            </w:r>
+            <w:r>
+              <w:rPr>
+                <w:color w:val="000000" w:themeColor="text1"/>
+              </w:rPr>
+              <w:t>Adresse</w:t>
+            </w:r>
+            <w:r>
+              <w:t xml:space="preserve"> erstellen.</w:t>
+            </w:r>
+            <w:r>
+              <w:t xml:space="preserve"> (Das wird später wichtig, um das Einladungssystem zu benutzen)</w:t>
+            </w:r>
+          </w:p>
+        </w:tc>
+      </w:tr>
+    </w:tbl>
+    <w:p/>
+    <w:tbl>
+      <w:tblPr>
+        <w:tblStyle w:val="Tabellenraster"/>
+        <w:tblW w:w="0" w:type="auto"/>
+        <w:tblInd w:w="0" w:type="dxa"/>
+        <w:tblBorders>
+          <w:top w:val="none" w:sz="0" w:space="0" w:color="auto"/>
+          <w:left w:val="none" w:sz="0" w:space="0" w:color="auto"/>
+          <w:bottom w:val="none" w:sz="0" w:space="0" w:color="auto"/>
+          <w:right w:val="none" w:sz="0" w:space="0" w:color="auto"/>
+          <w:insideH w:val="none" w:sz="0" w:space="0" w:color="auto"/>
+          <w:insideV w:val="none" w:sz="0" w:space="0" w:color="auto"/>
+        </w:tblBorders>
+        <w:tblLook w:val="04A0" w:firstRow="1" w:lastRow="0" w:firstColumn="1" w:lastColumn="0" w:noHBand="0" w:noVBand="1"/>
+      </w:tblPr>
+      <w:tblGrid>
+        <w:gridCol w:w="704"/>
+        <w:gridCol w:w="8533"/>
+      </w:tblGrid>
+      <w:tr>
+        <w:trPr>
+          <w:cnfStyle w:val="100000000000" w:firstRow="1" w:lastRow="0" w:firstColumn="0" w:lastColumn="0" w:oddVBand="0" w:evenVBand="0" w:oddHBand="0" w:evenHBand="0" w:firstRowFirstColumn="0" w:firstRowLastColumn="0" w:lastRowFirstColumn="0" w:lastRowLastColumn="0"/>
+          <w:trHeight w:val="982"/>
+        </w:trPr>
+        <w:tc>
+          <w:tcPr>
+            <w:tcW w:w="704" w:type="dxa"/>
+            <w:shd w:val="clear" w:color="auto" w:fill="548DD4" w:themeFill="text2" w:themeFillTint="99"/>
+          </w:tcPr>
+          <w:p/>
+          <w:p>
+            <w:r>
+              <w:rPr>
+                <w:color w:val="FFFFFF" w:themeColor="background1"/>
+              </w:rPr>
+              <w:t>6</w:t>
+            </w:r>
+          </w:p>
+        </w:tc>
+        <w:tc>
+          <w:tcPr>
+            <w:tcW w:w="8533" w:type="dxa"/>
+            <w:shd w:val="clear" w:color="auto" w:fill="FFFFFF" w:themeFill="background1"/>
+          </w:tcPr>
+          <w:p>
+            <w:r>
+              <w:rPr>
+                <w:sz w:val="20"/>
+                <w:szCs w:val="20"/>
+              </w:rPr>
+              <w:t xml:space="preserve">     </w:t>
+            </w:r>
+            <w:r>
+              <w:t xml:space="preserve">                                                                                                                                                         </w:t>
+            </w:r>
+            <w:r>
+              <w:rPr>
+                <w:rStyle w:val="berschrift4Zchn"/>
+              </w:rPr>
+              <w:t>Java-Projekt Vorbereiten</w:t>
+            </w:r>
+          </w:p>
+          <w:p>
+            <w:r>
+              <w:t>Öffne das projekt mit IntelliJ. Im Projekt hat es eine</w:t>
+            </w:r>
+            <w:r>
+              <w:t xml:space="preserve"> Datei config.example.properties in </w:t>
+            </w:r>
+            <w:r>
+              <w:rPr>
+                <w:i/>
+                <w:iCs/>
+              </w:rPr>
+              <w:t>src/main/resources/</w:t>
+            </w:r>
+            <w:r>
+              <w:t xml:space="preserve">. </w:t>
+            </w:r>
+            <w:r>
+              <w:t>Kopiere diese</w:t>
+            </w:r>
+            <w:r>
+              <w:t xml:space="preserve"> und in</w:t>
+            </w:r>
+            <w:r>
+              <w:t xml:space="preserve"> bennene sie in</w:t>
+            </w:r>
+            <w:r>
+              <w:t xml:space="preserve"> config.properties</w:t>
+            </w:r>
+            <w:r>
+              <w:t xml:space="preserve"> um</w:t>
+            </w:r>
+            <w:r>
+              <w:t xml:space="preserve">. Anschliessend </w:t>
+            </w:r>
+            <w:r>
+              <w:t xml:space="preserve">trage dein </w:t>
+            </w:r>
+            <w:r>
+              <w:t xml:space="preserve">Ticketmaster API-Key sowie die Gmail-Adresse und das Gmail App-Passwort </w:t>
+            </w:r>
+            <w:r>
+              <w:t>ein</w:t>
+            </w:r>
+            <w:r>
+              <w:t>.</w:t>
+            </w:r>
+            <w:r>
+              <w:t xml:space="preserve"> </w:t>
+            </w:r>
+          </w:p>
+          <w:p>
+            <w:pPr>
+              <w:rPr>
+                <w:lang w:val="en-US"/>
+              </w:rPr>
+            </w:pPr>
+            <w:r>
+              <w:rPr>
+                <w:lang w:val="en-US"/>
+              </w:rPr>
+              <w:t xml:space="preserve">API Key: </w:t>
+            </w:r>
+            <w:r>
+              <w:rPr>
+                <w:i/>
+                <w:iCs/>
+                <w:u w:val="single"/>
+                <w:lang w:val="en-US"/>
+              </w:rPr>
+              <w:t>https://developer.ticketmaster.com/products-and-docs/apis/getting-started/</w:t>
+            </w:r>
+          </w:p>
+          <w:p>
+            <w:r>
+              <w:t>Gmail Konto: Dafür kannst d</w:t>
+            </w:r>
+            <w:r>
+              <w:t>u dein eigens verwenden. Jedoch beim Passwort wird der App</w:t>
+            </w:r>
+            <w:r>
+              <w:t>-</w:t>
+            </w:r>
+            <w:r>
+              <w:t>Passwort verlangt</w:t>
+            </w:r>
+            <w:r>
+              <w:t>, den du zuerst in den Einstellungen erstellen must</w:t>
+            </w:r>
+            <w:r>
+              <w:t>. Ebenfalls muss</w:t>
+            </w:r>
+            <w:r>
+              <w:t>t</w:t>
+            </w:r>
+            <w:r>
+              <w:t xml:space="preserve"> du 2-Faktor-Autetifizierung </w:t>
+            </w:r>
+            <w:r>
+              <w:t>aktiviert</w:t>
+            </w:r>
+            <w:r>
+              <w:t xml:space="preserve"> haben.</w:t>
+            </w:r>
+          </w:p>
+        </w:tc>
+      </w:tr>
+    </w:tbl>
+    <w:p/>
+    <w:tbl>
+      <w:tblPr>
+        <w:tblStyle w:val="Tabellenraster"/>
+        <w:tblW w:w="0" w:type="auto"/>
+        <w:tblInd w:w="0" w:type="dxa"/>
+        <w:tblBorders>
+          <w:top w:val="none" w:sz="0" w:space="0" w:color="auto"/>
+          <w:left w:val="none" w:sz="0" w:space="0" w:color="auto"/>
+          <w:bottom w:val="none" w:sz="0" w:space="0" w:color="auto"/>
+          <w:right w:val="none" w:sz="0" w:space="0" w:color="auto"/>
+          <w:insideH w:val="none" w:sz="0" w:space="0" w:color="auto"/>
+          <w:insideV w:val="none" w:sz="0" w:space="0" w:color="auto"/>
+        </w:tblBorders>
+        <w:tblLook w:val="04A0" w:firstRow="1" w:lastRow="0" w:firstColumn="1" w:lastColumn="0" w:noHBand="0" w:noVBand="1"/>
+      </w:tblPr>
+      <w:tblGrid>
+        <w:gridCol w:w="704"/>
+        <w:gridCol w:w="8533"/>
+      </w:tblGrid>
+      <w:tr>
+        <w:trPr>
+          <w:cnfStyle w:val="100000000000" w:firstRow="1" w:lastRow="0" w:firstColumn="0" w:lastColumn="0" w:oddVBand="0" w:evenVBand="0" w:oddHBand="0" w:evenHBand="0" w:firstRowFirstColumn="0" w:firstRowLastColumn="0" w:lastRowFirstColumn="0" w:lastRowLastColumn="0"/>
+          <w:trHeight w:val="409"/>
+        </w:trPr>
+        <w:tc>
+          <w:tcPr>
+            <w:tcW w:w="704" w:type="dxa"/>
+            <w:shd w:val="clear" w:color="auto" w:fill="548DD4" w:themeFill="text2" w:themeFillTint="99"/>
+          </w:tcPr>
+          <w:p/>
+          <w:p>
+            <w:r>
+              <w:rPr>
+                <w:color w:val="FFFFFF" w:themeColor="background1"/>
+              </w:rPr>
+              <w:t>7</w:t>
+            </w:r>
+          </w:p>
+        </w:tc>
+        <w:tc>
+          <w:tcPr>
+            <w:tcW w:w="8533" w:type="dxa"/>
+            <w:shd w:val="clear" w:color="auto" w:fill="FFFFFF" w:themeFill="background1"/>
+          </w:tcPr>
+          <w:p>
+            <w:r>
+              <w:t xml:space="preserve">                                                                                                                                                   </w:t>
+            </w:r>
+            <w:r>
+              <w:t xml:space="preserve">                 </w:t>
+            </w:r>
+            <w:r>
+              <w:t xml:space="preserve">                    </w:t>
+            </w:r>
+            <w:r>
+              <w:rPr>
+                <w:rStyle w:val="berschrift4Zchn"/>
+              </w:rPr>
+              <w:t>Java-Projekt starten</w:t>
+            </w:r>
+          </w:p>
+          <w:p>
+            <w:r>
+              <w:t>IntelliJ öffnen -&gt; Gradle-Dependencies neu laden</w:t>
+            </w:r>
+            <w:r>
+              <w:t xml:space="preserve"> </w:t>
+            </w:r>
+            <w:r>
+              <w:t xml:space="preserve">-&gt; </w:t>
+            </w:r>
+            <w:r>
+              <w:t>X -&gt;</w:t>
+            </w:r>
+            <w:r>
+              <w:t>Main.java ausführen</w:t>
+            </w:r>
+          </w:p>
+        </w:tc>
+      </w:tr>
+    </w:tbl>
+    <w:p/>
+    <w:tbl>
+      <w:tblPr>
+        <w:tblStyle w:val="Tabellenraster"/>
+        <w:tblW w:w="0" w:type="auto"/>
+        <w:tblInd w:w="0" w:type="dxa"/>
+        <w:tblBorders>
+          <w:top w:val="none" w:sz="0" w:space="0" w:color="auto"/>
+          <w:left w:val="none" w:sz="0" w:space="0" w:color="auto"/>
+          <w:bottom w:val="none" w:sz="0" w:space="0" w:color="auto"/>
+          <w:right w:val="none" w:sz="0" w:space="0" w:color="auto"/>
+          <w:insideH w:val="none" w:sz="0" w:space="0" w:color="auto"/>
+          <w:insideV w:val="none" w:sz="0" w:space="0" w:color="auto"/>
+        </w:tblBorders>
+        <w:tblLook w:val="04A0" w:firstRow="1" w:lastRow="0" w:firstColumn="1" w:lastColumn="0" w:noHBand="0" w:noVBand="1"/>
+      </w:tblPr>
+      <w:tblGrid>
+        <w:gridCol w:w="704"/>
+        <w:gridCol w:w="8533"/>
+      </w:tblGrid>
+      <w:tr>
+        <w:trPr>
+          <w:cnfStyle w:val="100000000000" w:firstRow="1" w:lastRow="0" w:firstColumn="0" w:lastColumn="0" w:oddVBand="0" w:evenVBand="0" w:oddHBand="0" w:evenHBand="0" w:firstRowFirstColumn="0" w:firstRowLastColumn="0" w:lastRowFirstColumn="0" w:lastRowLastColumn="0"/>
+          <w:trHeight w:val="503"/>
+        </w:trPr>
+        <w:tc>
+          <w:tcPr>
+            <w:tcW w:w="704" w:type="dxa"/>
+            <w:shd w:val="clear" w:color="auto" w:fill="548DD4" w:themeFill="text2" w:themeFillTint="99"/>
+          </w:tcPr>
+          <w:p/>
+          <w:p>
+            <w:r>
+              <w:rPr>
+                <w:color w:val="FFFFFF" w:themeColor="background1"/>
+              </w:rPr>
+              <w:t>8</w:t>
+            </w:r>
+          </w:p>
+        </w:tc>
+        <w:tc>
+          <w:tcPr>
+            <w:tcW w:w="8533" w:type="dxa"/>
+            <w:shd w:val="clear" w:color="auto" w:fill="FFFFFF" w:themeFill="background1"/>
+          </w:tcPr>
+          <w:p>
+            <w:r>
+              <w:rPr>
+                <w:sz w:val="16"/>
+                <w:szCs w:val="16"/>
+              </w:rPr>
+              <w:t xml:space="preserve">  </w:t>
+            </w:r>
+            <w:r>
+              <w:t xml:space="preserve">                                                                                                                                                   </w:t>
+            </w:r>
+            <w:r>
+              <w:t xml:space="preserve">         </w:t>
+            </w:r>
+            <w:r>
+              <w:t xml:space="preserve">   </w:t>
+            </w:r>
+            <w:r>
+              <w:t xml:space="preserve"> </w:t>
+            </w:r>
+            <w:r>
+              <w:t xml:space="preserve">                 </w:t>
+            </w:r>
+            <w:r>
+              <w:rPr>
+                <w:rStyle w:val="berschrift4Zchn"/>
+              </w:rPr>
+              <w:t>Prozess starten</w:t>
+            </w:r>
+          </w:p>
+          <w:p>
+            <w:pPr>
+              <w:rPr>
+                <w:color w:val="595959" w:themeColor="text1" w:themeTint="A6"/>
+              </w:rPr>
+            </w:pPr>
+            <w:hyperlink r:id="rId21" w:history="1">
+              <w:r>
+                <w:rPr>
+                  <w:i/>
+                  <w:iCs/>
+                  <w:u w:val="single"/>
+                </w:rPr>
+                <w:t>http://localhost:8080/camunda/app/tasklist</w:t>
+              </w:r>
+            </w:hyperlink>
+            <w:r>
+              <w:rPr>
+                <w:color w:val="595959" w:themeColor="text1" w:themeTint="A6"/>
+              </w:rPr>
+              <w:t xml:space="preserve"> </w:t>
+            </w:r>
+            <w:r>
+              <w:t>öffnen und den Prozess starten.</w:t>
+            </w:r>
+          </w:p>
+        </w:tc>
+      </w:tr>
+    </w:tbl>
+    <w:p/>
+    <w:tbl>
+      <w:tblPr>
+        <w:tblStyle w:val="Tabellenraster"/>
+        <w:tblW w:w="0" w:type="auto"/>
+        <w:tblInd w:w="0" w:type="dxa"/>
+        <w:tblBorders>
+          <w:top w:val="none" w:sz="0" w:space="0" w:color="auto"/>
+          <w:left w:val="none" w:sz="0" w:space="0" w:color="auto"/>
+          <w:bottom w:val="none" w:sz="0" w:space="0" w:color="auto"/>
+          <w:right w:val="none" w:sz="0" w:space="0" w:color="auto"/>
+          <w:insideH w:val="none" w:sz="0" w:space="0" w:color="auto"/>
+          <w:insideV w:val="none" w:sz="0" w:space="0" w:color="auto"/>
+        </w:tblBorders>
+        <w:tblLook w:val="04A0" w:firstRow="1" w:lastRow="0" w:firstColumn="1" w:lastColumn="0" w:noHBand="0" w:noVBand="1"/>
+      </w:tblPr>
+      <w:tblGrid>
+        <w:gridCol w:w="704"/>
+        <w:gridCol w:w="8533"/>
+      </w:tblGrid>
+      <w:tr>
+        <w:trPr>
+          <w:cnfStyle w:val="100000000000" w:firstRow="1" w:lastRow="0" w:firstColumn="0" w:lastColumn="0" w:oddVBand="0" w:evenVBand="0" w:oddHBand="0" w:evenHBand="0" w:firstRowFirstColumn="0" w:firstRowLastColumn="0" w:lastRowFirstColumn="0" w:lastRowLastColumn="0"/>
+          <w:trHeight w:val="627"/>
+        </w:trPr>
+        <w:tc>
+          <w:tcPr>
+            <w:tcW w:w="704" w:type="dxa"/>
+            <w:shd w:val="clear" w:color="auto" w:fill="548DD4" w:themeFill="text2" w:themeFillTint="99"/>
+          </w:tcPr>
+          <w:p/>
+          <w:p>
+            <w:r>
+              <w:rPr>
+                <w:color w:val="FFFFFF" w:themeColor="background1"/>
+              </w:rPr>
+              <w:t>9</w:t>
+            </w:r>
+          </w:p>
+        </w:tc>
+        <w:tc>
+          <w:tcPr>
+            <w:tcW w:w="8533" w:type="dxa"/>
+            <w:shd w:val="clear" w:color="auto" w:fill="FFFFFF" w:themeFill="background1"/>
+          </w:tcPr>
+          <w:p>
+            <w:pPr>
+              <w:rPr>
+                <w:sz w:val="28"/>
+                <w:szCs w:val="28"/>
+              </w:rPr>
+            </w:pPr>
+            <w:r>
+              <w:br/>
+            </w:r>
+            <w:r>
+              <w:rPr>
+                <w:rStyle w:val="berschrift4Zchn"/>
+              </w:rPr>
+              <w:t>Fertig</w:t>
+            </w:r>
+          </w:p>
+          <w:p>
+            <w:r>
+              <w:t>Von hier an sollte der Concert Ticket Watcher laufen und selbsterklärend sein.</w:t>
+            </w:r>
+            <w:r>
+              <w:t xml:space="preserve"> Falls nicht, sind noch schönere </w:t>
+            </w:r>
+            <w:r>
+              <w:t>Forum-Designs</w:t>
+            </w:r>
+            <w:r>
+              <w:t xml:space="preserve"> in den Anhängend, die im </w:t>
+            </w:r>
+            <w:r>
+              <w:t>Projekt</w:t>
+            </w:r>
+            <w:r>
+              <w:t xml:space="preserve"> leider nicht implementiert werden konnten, aufgrund de</w:t>
+            </w:r>
+            <w:r>
+              <w:t>s</w:t>
+            </w:r>
+            <w:r>
+              <w:t xml:space="preserve"> Gebrauc</w:t>
+            </w:r>
+            <w:r>
+              <w:t>hs</w:t>
+            </w:r>
+            <w:r>
+              <w:t xml:space="preserve"> einer älteren Camunda Version.</w:t>
+            </w:r>
+          </w:p>
+        </w:tc>
+      </w:tr>
+    </w:tbl>
+    <w:p/>
+    <w:p>
+      <w:r>
+        <w:br w:type="page"/>
+      </w:r>
     </w:p>
     <w:p>
-      <w:r>
-        <w:t>X</w:t>
-      </w:r>
+      <w:pPr>
+        <w:pStyle w:val="berschrift1"/>
+        <w:spacing w:line="276" w:lineRule="auto"/>
+      </w:pPr>
+      <w:bookmarkStart w:id="29" w:name="_Toc228744551"/>
+      <w:r>
+        <w:lastRenderedPageBreak/>
+        <w:t>Vorgehensweise</w:t>
+      </w:r>
+      <w:bookmarkEnd w:id="29"/>
+    </w:p>
+    <w:p>
+      <w:r>
+        <w:t xml:space="preserve">Das Projekt wurde in mehreren Phasen durchgefuehrt. In der ersten Phase wurde die Architektur des Prozesses mit dem Camunda Modeler definiert und iterativ verfeinert. Parallel dazu wurden die Anforderungen an das Java-Backend festgelegt. In der zweiten Phase erfolgte die schrittweise Implementierung, beginnend mit den abstrakten Basisklassen der generischen Schicht, gefolgt von den konkreten Fetchers, </w:t>
+      </w:r>
+      <w:r>
+        <w:t xml:space="preserve">Repositories, </w:t>
+      </w:r>
+      <w:r>
+        <w:t xml:space="preserve">Services und Handlers. In der dritten Phase wurde das Backend mit dem Camunda-Prozess verbunden und end-to-end getestet. Als gemeinsames Planungswerkzeug </w:t>
+      </w:r>
+      <w:r>
+        <w:t>haben wir eine txt Todo-Liste erstellt (im Anhang) und auf gute Kommunikation vertraut</w:t>
+      </w:r>
+      <w:r>
+        <w:t>.</w:t>
+      </w:r>
+      <w:r>
+        <w:t xml:space="preserve"> </w:t>
+      </w:r>
+      <w:r>
+        <w:br w:type="page"/>
+      </w:r>
+    </w:p>
+    <w:p>
+      <w:pPr>
+        <w:pStyle w:val="berschrift1"/>
+        <w:spacing w:line="276" w:lineRule="auto"/>
+      </w:pPr>
+      <w:bookmarkStart w:id="30" w:name="_Toc225841221"/>
+      <w:bookmarkStart w:id="31" w:name="_Toc228744552"/>
+      <w:r>
+        <w:lastRenderedPageBreak/>
+        <w:t>Umsetzung</w:t>
+      </w:r>
+      <w:bookmarkStart w:id="32" w:name="_Toc225841222"/>
+      <w:bookmarkEnd w:id="30"/>
+      <w:bookmarkEnd w:id="31"/>
     </w:p>
     <w:p>
       <w:pPr>
@@ -1459,263 +3668,78 @@
           <w:ilvl w:val="1"/>
           <w:numId w:val="1"/>
         </w:numPr>
-      </w:pPr>
-      <w:bookmarkStart w:id="28" w:name="_Toc225841220"/>
-      <w:bookmarkStart w:id="29" w:name="_Toc225841485"/>
-      <w:r>
-        <w:t>Setup</w:t>
-      </w:r>
-      <w:bookmarkEnd w:id="28"/>
-      <w:bookmarkEnd w:id="29"/>
+        <w:spacing w:line="276" w:lineRule="auto"/>
+      </w:pPr>
+      <w:bookmarkStart w:id="33" w:name="_Toc228744553"/>
+      <w:r>
+        <w:t>Architektur</w:t>
+      </w:r>
+      <w:bookmarkEnd w:id="32"/>
+      <w:bookmarkEnd w:id="33"/>
     </w:p>
     <w:p>
       <w:r>
-        <w:t xml:space="preserve">1. </w:t>
-      </w:r>
-      <w:r>
-        <w:t>PostgreSQL Container starten</w:t>
-      </w:r>
-      <w:r>
-        <w:t>:</w:t>
+        <w:t xml:space="preserve">Das Backend ist nach einem Spring-Boot-inspirierten Schichtmodell aufgebaut, ohne Spring Boot selbst zu verwenden. Es besteht aus vier Schichten: Handlers empfangen Aufgaben von Camunda und delegieren sie an Services. Services enthalten die eigentliche Geschäftslogik und rufen Fetchers auf. Fetchers sind für externe API-Aufrufe zuständig und geben typisierte Modelle zurück. Repositories verwalten den Datenbankzugriff. Die gesamte Verdrahtung der Abhängigkeiten erfolgt manuell in der Setup-Klasse. Eine Übersicht der Architektur ist im Referenzdokument </w:t>
+      </w:r>
+      <w:r>
+        <w:t>backend-architektur.drawio</w:t>
+      </w:r>
+      <w:r>
+        <w:t xml:space="preserve"> zu finden.</w:t>
       </w:r>
     </w:p>
     <w:p>
-      <w:pPr>
-        <w:pStyle w:val="Code"/>
-      </w:pPr>
-      <w:r>
-        <w:t>docker run --name concert-db -e POSTGRES_DB=concertdb -e POSTGRES_USER=admin -e POSTGRES_PASSWORD=admin -p 5432:5432 -d postgres</w:t>
+      <w:r>
+        <w:t xml:space="preserve">Zudem sollten sowohl das BPMN-Diagramm als auch das Backend ausreichend mit kommentaren verseht sein, die weit ins </w:t>
+      </w:r>
+      <w:r>
+        <w:t>Detail</w:t>
+      </w:r>
+      <w:r>
+        <w:t xml:space="preserve"> spezifische Elemente erklären.</w:t>
       </w:r>
     </w:p>
     <w:p>
-      <w:pPr>
+      <w:r>
         <w:rPr>
-          <w:lang w:val="en-US"/>
+          <w:noProof/>
         </w:rPr>
-      </w:pPr>
-      <w:r>
-        <w:rPr>
-          <w:lang w:val="en-US"/>
-        </w:rPr>
-        <w:t xml:space="preserve">2. </w:t>
-      </w:r>
-      <w:r>
-        <w:t>Camunda Container starten</w:t>
-      </w:r>
-      <w:r>
-        <w:rPr>
-          <w:lang w:val="en-US"/>
-        </w:rPr>
-        <w:t>:</w:t>
-      </w:r>
-    </w:p>
-    <w:p>
-      <w:pPr>
-        <w:pStyle w:val="Code"/>
-        <w:rPr>
-          <w:lang w:val="en-US"/>
-        </w:rPr>
-      </w:pPr>
-      <w:r>
-        <w:rPr>
-          <w:lang w:val="en-US"/>
-        </w:rPr>
-        <w:t>docker run --name camunda -p 8080:8080 -d camunda/camunda-bpm-platform:7.20.0</w:t>
-      </w:r>
-    </w:p>
-    <w:p>
-      <w:r>
-        <w:t xml:space="preserve">3. </w:t>
-      </w:r>
-      <w:r>
-        <w:rPr>
-          <w:i/>
-          <w:iCs/>
-          <w:u w:val="single"/>
-        </w:rPr>
-        <w:t>http://localhost:8080/camunda</w:t>
-      </w:r>
-      <w:r>
-        <w:t xml:space="preserve"> </w:t>
-      </w:r>
-      <w:r>
-        <w:t>öffnen u</w:t>
-      </w:r>
-      <w:r>
-        <w:t>nd sich einloggen</w:t>
-      </w:r>
-      <w:r>
-        <w:t>.</w:t>
-      </w:r>
-    </w:p>
-    <w:p>
-      <w:pPr>
-        <w:jc w:val="left"/>
-        <w:rPr>
-          <w:lang w:val="en-US"/>
-        </w:rPr>
-      </w:pPr>
-      <w:r>
-        <w:rPr>
-          <w:lang w:val="en-US"/>
-        </w:rPr>
-        <w:t>Username = demo</w:t>
-      </w:r>
-      <w:r>
-        <w:rPr>
-          <w:lang w:val="en-US"/>
-        </w:rPr>
-        <w:br/>
-        <w:t>Password = demo</w:t>
-      </w:r>
-    </w:p>
-    <w:p>
-      <w:r>
-        <w:t xml:space="preserve">4. </w:t>
-      </w:r>
-      <w:r>
-        <w:t>Camunda Modeler öffnen, ConcertTicketWatcher.bpmn laden und zusammen mit allen .form Files auf</w:t>
-      </w:r>
-      <w:r>
-        <w:t xml:space="preserve"> </w:t>
-      </w:r>
-      <w:r>
-        <w:rPr>
-          <w:i/>
-          <w:iCs/>
-          <w:u w:val="single"/>
-        </w:rPr>
-        <w:t>http://localhost:8080/engine-rest</w:t>
-      </w:r>
-      <w:r>
-        <w:t xml:space="preserve"> </w:t>
-      </w:r>
-      <w:r>
-        <w:t>deployen</w:t>
-      </w:r>
-      <w:r>
-        <w:t>.</w:t>
-      </w:r>
-    </w:p>
-    <w:p>
-      <w:r>
-        <w:t>5.</w:t>
-      </w:r>
-      <w:r>
-        <w:t xml:space="preserve"> </w:t>
-      </w:r>
-      <w:r>
-        <w:rPr>
-          <w:i/>
-          <w:iCs/>
-          <w:u w:val="single"/>
-        </w:rPr>
-        <w:t>http://localhost:8080/camunda/app/admi</w:t>
-      </w:r>
-      <w:r>
-        <w:rPr>
-          <w:i/>
-          <w:iCs/>
-          <w:u w:val="single"/>
-        </w:rPr>
-        <w:t>n</w:t>
-      </w:r>
-      <w:r>
-        <w:t xml:space="preserve">, </w:t>
-      </w:r>
-      <w:r>
-        <w:t xml:space="preserve">öffnen, </w:t>
-      </w:r>
-      <w:r>
-        <w:t>unter User</w:t>
-      </w:r>
-      <w:r>
-        <w:t xml:space="preserve"> mindestens zwei Benutzer erstellen. Dabei darauf achten, dass bei jedem Benutzer eine E-Mail-Adresse hinterlegt ist</w:t>
-      </w:r>
-      <w:r>
-        <w:t>.</w:t>
-      </w:r>
-      <w:r>
-        <w:t xml:space="preserve"> (</w:t>
-      </w:r>
-      <w:r>
-        <w:t>Das</w:t>
-      </w:r>
-      <w:r>
-        <w:t xml:space="preserve"> </w:t>
-      </w:r>
-      <w:r>
-        <w:t>wird später wichtig, um das Einladungssystem zu benutzen</w:t>
-      </w:r>
-      <w:r>
-        <w:t>)</w:t>
-      </w:r>
-    </w:p>
-    <w:p>
-      <w:r>
-        <w:t xml:space="preserve">6. </w:t>
-      </w:r>
-      <w:r>
-        <w:t>Java-Projekt in IntelliJ öffnen, Gradle-Dependencies neu laden und Main.java ausführen</w:t>
-      </w:r>
-      <w:r>
-        <w:t>.</w:t>
-      </w:r>
-    </w:p>
-    <w:p>
-      <w:r>
-        <w:t xml:space="preserve">7. </w:t>
-      </w:r>
-      <w:r>
-        <w:rPr>
-          <w:i/>
-          <w:iCs/>
-          <w:u w:val="single"/>
-        </w:rPr>
-        <w:t>http://localhost:8080/camunda/app/tasklist</w:t>
-      </w:r>
-      <w:r>
-        <w:t xml:space="preserve"> </w:t>
-      </w:r>
-      <w:r>
-        <w:t>öffnen und den Prozess starten.</w:t>
-      </w:r>
-    </w:p>
-    <w:p>
-      <w:r>
-        <w:t>8. Von hier an aus sollte d</w:t>
-      </w:r>
-      <w:r>
-        <w:t xml:space="preserve">er Concert Ticket Watcher </w:t>
-      </w:r>
-      <w:proofErr w:type="gramStart"/>
-      <w:r>
-        <w:t>am rennen</w:t>
-      </w:r>
-      <w:proofErr w:type="gramEnd"/>
-      <w:r>
-        <w:t xml:space="preserve"> sein und auch selbstverständlich verstehbar sein.</w:t>
-      </w:r>
-    </w:p>
-    <w:p>
-      <w:r>
-        <w:br w:type="page"/>
-      </w:r>
-    </w:p>
-    <w:p>
-      <w:pPr>
-        <w:pStyle w:val="berschrift1"/>
-      </w:pPr>
-      <w:bookmarkStart w:id="30" w:name="_Toc225841221"/>
-      <w:bookmarkStart w:id="31" w:name="_Toc225841486"/>
-      <w:r>
-        <w:lastRenderedPageBreak/>
-        <w:t>Umsetzung</w:t>
-      </w:r>
-      <w:bookmarkStart w:id="32" w:name="_Toc225841222"/>
-      <w:bookmarkStart w:id="33" w:name="_Toc225841487"/>
-      <w:bookmarkEnd w:id="30"/>
-      <w:bookmarkEnd w:id="31"/>
+        <w:drawing>
+          <wp:inline distT="0" distB="0" distL="0" distR="0" wp14:anchorId="0E50B614" wp14:editId="2A9CC3CB">
+            <wp:extent cx="1976437" cy="2146503"/>
+            <wp:effectExtent l="0" t="0" r="5080" b="6350"/>
+            <wp:docPr id="1817819318" name="Grafik 1"/>
+            <wp:cNvGraphicFramePr>
+              <a:graphicFrameLocks xmlns:a="http://schemas.openxmlformats.org/drawingml/2006/main" noChangeAspect="1"/>
+            </wp:cNvGraphicFramePr>
+            <a:graphic xmlns:a="http://schemas.openxmlformats.org/drawingml/2006/main">
+              <a:graphicData uri="http://schemas.openxmlformats.org/drawingml/2006/picture">
+                <pic:pic xmlns:pic="http://schemas.openxmlformats.org/drawingml/2006/picture">
+                  <pic:nvPicPr>
+                    <pic:cNvPr id="1817819318" name=""/>
+                    <pic:cNvPicPr/>
+                  </pic:nvPicPr>
+                  <pic:blipFill>
+                    <a:blip r:embed="rId22"/>
+                    <a:stretch>
+                      <a:fillRect/>
+                    </a:stretch>
+                  </pic:blipFill>
+                  <pic:spPr>
+                    <a:xfrm>
+                      <a:off x="0" y="0"/>
+                      <a:ext cx="1979973" cy="2150343"/>
+                    </a:xfrm>
+                    <a:prstGeom prst="rect">
+                      <a:avLst/>
+                    </a:prstGeom>
+                  </pic:spPr>
+                </pic:pic>
+              </a:graphicData>
+            </a:graphic>
+          </wp:inline>
+        </w:drawing>
+      </w:r>
     </w:p>
     <w:p>
       <w:pPr>
@@ -1724,93 +3748,179 @@
           <w:ilvl w:val="1"/>
           <w:numId w:val="1"/>
         </w:numPr>
-      </w:pPr>
-      <w:r>
-        <w:t>Architektur</w:t>
-      </w:r>
-      <w:bookmarkEnd w:id="32"/>
-      <w:bookmarkEnd w:id="33"/>
+        <w:spacing w:line="276" w:lineRule="auto"/>
+      </w:pPr>
+      <w:bookmarkStart w:id="34" w:name="_Toc225841224"/>
+      <w:bookmarkStart w:id="35" w:name="_Toc228744554"/>
+      <w:r>
+        <w:t>Error-Handling</w:t>
+      </w:r>
+      <w:bookmarkEnd w:id="34"/>
+      <w:bookmarkEnd w:id="35"/>
     </w:p>
     <w:p>
-      <w:pPr>
-        <w:rPr>
-          <w:lang w:val="en-US"/>
-        </w:rPr>
-      </w:pPr>
-      <w:r>
-        <w:rPr>
-          <w:lang w:val="en-US"/>
-        </w:rPr>
-        <w:t>((</w:t>
-      </w:r>
-      <w:proofErr w:type="spellStart"/>
-      <w:r>
-        <w:rPr>
-          <w:lang w:val="en-US"/>
-        </w:rPr>
-        <w:t>Springboot</w:t>
-      </w:r>
-      <w:proofErr w:type="spellEnd"/>
-      <w:r>
-        <w:rPr>
-          <w:lang w:val="en-US"/>
-        </w:rPr>
-        <w:t xml:space="preserve"> </w:t>
-      </w:r>
-      <w:proofErr w:type="spellStart"/>
-      <w:r>
-        <w:rPr>
-          <w:lang w:val="en-US"/>
-        </w:rPr>
-        <w:t>inspiriert</w:t>
-      </w:r>
-      <w:r>
-        <w:rPr>
-          <w:lang w:val="en-US"/>
-        </w:rPr>
-        <w:t>es</w:t>
-      </w:r>
-      <w:proofErr w:type="spellEnd"/>
-      <w:r>
-        <w:rPr>
-          <w:lang w:val="en-US"/>
-        </w:rPr>
-        <w:t xml:space="preserve"> Backend</w:t>
-      </w:r>
-      <w:r>
-        <w:rPr>
-          <w:lang w:val="en-US"/>
-        </w:rPr>
-        <w:t>))</w:t>
+      <w:bookmarkStart w:id="36" w:name="_Toc225841225"/>
+      <w:r>
+        <w:t>Das System unterscheidet zwischen fatalen Fehlern und wiederkehrenden Fehlern. Fatale Fehler, wie ein nicht erreichbarer Geolocation-Dienst oder ein Datenbankfehler, führen zu einem sofortigen Abbruch des Prozesses. Wiederkehrende Fehler, wie ein nicht gefundenes Konzert oder noch nicht verfügbare Tickets, werden stillschweigend protokolliert und beim nächsten Zyklus erneut versucht. Der Nutzer wird bei einem Absturz des Prozesses nicht direkt informiert, da kein eigenes Benachrichtigungssystem für Fehler implementiert wurde</w:t>
+      </w:r>
+      <w:r>
+        <w:t xml:space="preserve"> in Camunda</w:t>
+      </w:r>
+      <w:r>
+        <w:t>. J</w:t>
+      </w:r>
+      <w:r>
+        <w:t>edoch das Backend informiert über jeden Error.</w:t>
       </w:r>
     </w:p>
     <w:p>
       <w:pPr>
-        <w:pStyle w:val="Code"/>
-        <w:rPr>
-          <w:lang w:val="en-US"/>
-        </w:rPr>
-      </w:pPr>
-      <w:r>
-        <w:rPr>
-          <w:lang w:val="en-US"/>
-        </w:rPr>
-        <w:t>backend-</w:t>
-      </w:r>
-      <w:proofErr w:type="spellStart"/>
-      <w:r>
-        <w:rPr>
-          <w:lang w:val="en-US"/>
-        </w:rPr>
-        <w:t>architektur.drawio</w:t>
-      </w:r>
-      <w:proofErr w:type="spellEnd"/>
-      <w:r>
-        <w:rPr>
-          <w:lang w:val="en-US"/>
-        </w:rPr>
-        <w:t xml:space="preserve"> file</w:t>
-      </w:r>
+        <w:pStyle w:val="berschrift2"/>
+      </w:pPr>
+      <w:bookmarkStart w:id="37" w:name="_Toc228744555"/>
+      <w:r>
+        <w:t>Tests</w:t>
+      </w:r>
+      <w:bookmarkEnd w:id="36"/>
+      <w:bookmarkEnd w:id="37"/>
+    </w:p>
+    <w:p>
+      <w:r>
+        <w:t>Auf formelle Unit-Tests wurde verzichtet. Das System wurde stattdessen durch wiederholtes manuelles Durchspielen des gesamten Prozesses getestet, einschliesslich gezielter Edge Cases wie ungültige Benutzernamen oder nichtexistierende Künstler. Da die internen Polling-Zyklen des Systems 6 bis 12 Stunden betragen, wurde eine separate Testversion des Systems erstellt, die Konzert- und Ticketdaten sofort zurückgibt, ohne auf echte Ticketmaster-API-Daten zu warten.</w:t>
+      </w:r>
+    </w:p>
+    <w:p>
+      <w:pPr>
+        <w:pStyle w:val="berschrift2"/>
+        <w:spacing w:line="276" w:lineRule="auto"/>
+      </w:pPr>
+      <w:bookmarkStart w:id="38" w:name="_Toc228744556"/>
+      <w:r>
+        <w:t xml:space="preserve">Technical </w:t>
+      </w:r>
+      <w:r>
+        <w:t>D</w:t>
+      </w:r>
+      <w:r>
+        <w:t>ebt</w:t>
+      </w:r>
+      <w:bookmarkEnd w:id="38"/>
+    </w:p>
+    <w:p>
+      <w:r>
+        <w:t>Da es sich um ein Schulprojekt mit begrenztem Zeitrahmen handelt, wurden Technical Debts bewusst in Kauf genommen.</w:t>
+      </w:r>
+    </w:p>
+    <w:p>
+      <w:pPr>
+        <w:pStyle w:val="berschrift3"/>
+        <w:spacing w:line="276" w:lineRule="auto"/>
+      </w:pPr>
+      <w:r>
+        <w:lastRenderedPageBreak/>
+        <w:t>Silent Failure</w:t>
+      </w:r>
+    </w:p>
+    <w:p>
+      <w:r>
+        <w:t>Ungültige oder nicht registrierte Einladungs-Benutzernamen werden stillschweigend ignoriert, ohne den Benutzer zu informieren.</w:t>
+      </w:r>
+      <w:r>
+        <w:t xml:space="preserve"> Der Concert Ticket Watcher wird nicht crashen, dies ist weiterhing robust.</w:t>
+      </w:r>
+    </w:p>
+    <w:p>
+      <w:pPr>
+        <w:pStyle w:val="berschrift3"/>
+        <w:spacing w:line="276" w:lineRule="auto"/>
+      </w:pPr>
+      <w:r>
+        <w:t xml:space="preserve">Alles nur auf einem Computer </w:t>
+      </w:r>
+    </w:p>
+    <w:p>
+      <w:r>
+        <w:t xml:space="preserve">Das gesamte System läuft auf einer einzigen lokalen Maschine. Kommunikation zwischen mehreren Computern wird nicht unterstützt. </w:t>
+      </w:r>
+    </w:p>
+    <w:p>
+      <w:pPr>
+        <w:pStyle w:val="berschrift3"/>
+        <w:spacing w:line="276" w:lineRule="auto"/>
+      </w:pPr>
+      <w:r>
+        <w:t>Nicht das effizienteste Backend</w:t>
+      </w:r>
+    </w:p>
+    <w:p>
+      <w:r>
+        <w:t>Kein Global-Class-Handler</w:t>
+      </w:r>
+      <w:r>
+        <w:t>: A</w:t>
+      </w:r>
+      <w:r>
+        <w:t>lle Klassen müssen in Setup.java manuell instanziiert und injiziert werden. Es gibt kein automatisches Dependency-Injection-System wie in Spring Boot, das Klassen selbstständig erkennt und verdrahtet.</w:t>
+      </w:r>
+    </w:p>
+    <w:p>
+      <w:r>
+        <w:t>Kein DTO-System</w:t>
+      </w:r>
+      <w:r>
+        <w:t xml:space="preserve">: </w:t>
+      </w:r>
+      <w:r>
+        <w:t xml:space="preserve">Input und Output werden als einfache String-Schlüssellisten definiert. Es gibt keine Garantie zur Kompilierzeit, dass die Schlüssel mit den BPMN-Prozessvariablen übereinstimmen. </w:t>
+      </w:r>
+    </w:p>
+    <w:p>
+      <w:r>
+        <w:t>Schlechtes Error-Handling</w:t>
+      </w:r>
+      <w:r>
+        <w:t xml:space="preserve">: </w:t>
+      </w:r>
+      <w:r>
+        <w:t xml:space="preserve">Fast alle Fehler werden als generische RuntimeException weitergegeben. Es wird </w:t>
+      </w:r>
+      <w:r>
+        <w:t xml:space="preserve">ebenfalls </w:t>
+      </w:r>
+      <w:r>
+        <w:t xml:space="preserve">nicht zwischen behebbaren und nicht behebbaren Fehlern unterschieden. </w:t>
+      </w:r>
+    </w:p>
+    <w:p>
+      <w:r>
+        <w:t>Keine Unit-Tests</w:t>
+      </w:r>
+      <w:r>
+        <w:t xml:space="preserve"> wurden geschrieben.</w:t>
+      </w:r>
+    </w:p>
+    <w:p>
+      <w:pPr>
+        <w:spacing w:after="200" w:line="276" w:lineRule="auto"/>
+        <w:jc w:val="left"/>
+      </w:pPr>
+      <w:r>
+        <w:br w:type="page"/>
+      </w:r>
+    </w:p>
+    <w:p>
+      <w:pPr>
+        <w:pStyle w:val="berschrift1"/>
+        <w:spacing w:line="276" w:lineRule="auto"/>
+      </w:pPr>
+      <w:bookmarkStart w:id="39" w:name="_Toc225841226"/>
+      <w:bookmarkStart w:id="40" w:name="_Toc228744557"/>
+      <w:r>
+        <w:lastRenderedPageBreak/>
+        <w:t>Fazit</w:t>
+      </w:r>
+      <w:bookmarkEnd w:id="39"/>
+      <w:bookmarkEnd w:id="40"/>
     </w:p>
     <w:p>
       <w:pPr>
@@ -1819,18 +3929,49 @@
           <w:ilvl w:val="1"/>
           <w:numId w:val="1"/>
         </w:numPr>
-      </w:pPr>
-      <w:bookmarkStart w:id="34" w:name="_Toc225841223"/>
-      <w:bookmarkStart w:id="35" w:name="_Toc225841488"/>
-      <w:r>
-        <w:t>Unser Vorgehen</w:t>
-      </w:r>
-      <w:bookmarkEnd w:id="34"/>
-      <w:bookmarkEnd w:id="35"/>
+        <w:spacing w:line="276" w:lineRule="auto"/>
+      </w:pPr>
+      <w:bookmarkStart w:id="41" w:name="_Toc225841227"/>
+      <w:bookmarkStart w:id="42" w:name="_Toc228744558"/>
+      <w:r>
+        <w:t>Schwierigkeiten</w:t>
+      </w:r>
+      <w:bookmarkEnd w:id="41"/>
+      <w:bookmarkEnd w:id="42"/>
     </w:p>
     <w:p>
       <w:r>
-        <w:t>X</w:t>
+        <w:t>Eine der groessten H</w:t>
+      </w:r>
+      <w:r>
+        <w:t>ü</w:t>
+      </w:r>
+      <w:r>
+        <w:t>rden war das Deployment des BPMN-Prozesses in Camunda 7.20. Verschiedene Formular-Komponenten wie HTML-Felder und Bild-Elemente, die im Camunda Modeler ohne Fehlermeldung erstellt werden k</w:t>
+      </w:r>
+      <w:r>
+        <w:t>ö</w:t>
+      </w:r>
+      <w:r>
+        <w:t>nnen, werden von der Camunda-7.20-Engine zur Laufzeit nicht unterst</w:t>
+      </w:r>
+      <w:r>
+        <w:t>ü</w:t>
+      </w:r>
+      <w:r>
+        <w:t>tzt. Dies f</w:t>
+      </w:r>
+      <w:r>
+        <w:t>ü</w:t>
+      </w:r>
+      <w:r>
+        <w:t xml:space="preserve">hrte zu wiederholten Deployment-Fehlern, die nur durch manuelles Bereinigen der Formulardateien behoben werden konnten. Zudem war das Debugging des Zusammenspiels zwischen dem Java-Backend und der Camunda-Engine aufwendig, da Fehler in Service Tasks den Prozess still stoppen </w:t>
+      </w:r>
+      <w:r>
+        <w:t>kö</w:t>
+      </w:r>
+      <w:r>
+        <w:t>nnen, ohne eine klar sichtbare Fehlermeldung zu erzeugen.</w:t>
       </w:r>
     </w:p>
     <w:p>
@@ -1840,369 +3981,47 @@
           <w:ilvl w:val="1"/>
           <w:numId w:val="1"/>
         </w:numPr>
-      </w:pPr>
-      <w:bookmarkStart w:id="36" w:name="_Toc225841224"/>
-      <w:bookmarkStart w:id="37" w:name="_Toc225841489"/>
-      <w:r>
-        <w:t>Error-Handling</w:t>
-      </w:r>
-      <w:bookmarkEnd w:id="36"/>
-      <w:bookmarkEnd w:id="37"/>
+        <w:spacing w:line="276" w:lineRule="auto"/>
+      </w:pPr>
+      <w:bookmarkStart w:id="43" w:name="_Toc225841228"/>
+      <w:bookmarkStart w:id="44" w:name="_Toc228744559"/>
+      <w:r>
+        <w:t>Reflektion</w:t>
+      </w:r>
+      <w:bookmarkEnd w:id="43"/>
+      <w:bookmarkEnd w:id="44"/>
     </w:p>
     <w:p>
       <w:r>
-        <w:t xml:space="preserve">((Programm kann nicht crashen, alles wird abgefangen. Jedoch </w:t>
-      </w:r>
-      <w:proofErr w:type="spellStart"/>
-      <w:r>
-        <w:t>user</w:t>
-      </w:r>
-      <w:proofErr w:type="spellEnd"/>
-      <w:r>
-        <w:t xml:space="preserve"> wird nicht oder schlecht </w:t>
-      </w:r>
-      <w:proofErr w:type="gramStart"/>
-      <w:r>
-        <w:t>informiert</w:t>
-      </w:r>
-      <w:proofErr w:type="gramEnd"/>
-      <w:r>
-        <w:t xml:space="preserve"> wenn etwas </w:t>
-      </w:r>
-      <w:proofErr w:type="spellStart"/>
-      <w:r>
-        <w:t>crashed</w:t>
-      </w:r>
-      <w:proofErr w:type="spellEnd"/>
-      <w:r>
-        <w:t>))</w:t>
-      </w:r>
-    </w:p>
-    <w:p>
-      <w:pPr>
-        <w:pStyle w:val="berschrift2"/>
-        <w:numPr>
-          <w:ilvl w:val="1"/>
-          <w:numId w:val="1"/>
-        </w:numPr>
-      </w:pPr>
-      <w:bookmarkStart w:id="38" w:name="_Toc225841225"/>
-      <w:bookmarkStart w:id="39" w:name="_Toc225841490"/>
-      <w:r>
-        <w:t>Tests</w:t>
-      </w:r>
-      <w:bookmarkEnd w:id="38"/>
-      <w:bookmarkEnd w:id="39"/>
-    </w:p>
-    <w:p>
-      <w:r>
-        <w:t xml:space="preserve">((Wir haben da jetzt keine Tests gemacht. Halt nur immer </w:t>
-      </w:r>
-      <w:proofErr w:type="spellStart"/>
-      <w:r>
-        <w:t>wieer</w:t>
-      </w:r>
-      <w:proofErr w:type="spellEnd"/>
-      <w:r>
-        <w:t xml:space="preserve"> das </w:t>
-      </w:r>
-      <w:proofErr w:type="spellStart"/>
-      <w:r>
-        <w:t>Program</w:t>
-      </w:r>
-      <w:proofErr w:type="spellEnd"/>
-      <w:r>
-        <w:t xml:space="preserve"> durgespielt und dann </w:t>
-      </w:r>
-      <w:proofErr w:type="spellStart"/>
-      <w:r>
-        <w:t>einbischen</w:t>
-      </w:r>
-      <w:proofErr w:type="spellEnd"/>
-      <w:r>
-        <w:t xml:space="preserve"> </w:t>
-      </w:r>
-      <w:proofErr w:type="spellStart"/>
-      <w:r>
-        <w:t>edge</w:t>
-      </w:r>
-      <w:proofErr w:type="spellEnd"/>
-      <w:r>
-        <w:t xml:space="preserve"> </w:t>
-      </w:r>
-      <w:proofErr w:type="spellStart"/>
-      <w:r>
-        <w:t>cases</w:t>
-      </w:r>
-      <w:proofErr w:type="spellEnd"/>
-      <w:r>
-        <w:t xml:space="preserve"> durchgespielt, aber nichts aufgeschrieben weder </w:t>
-      </w:r>
-      <w:proofErr w:type="spellStart"/>
-      <w:r>
-        <w:t>Strathegie</w:t>
-      </w:r>
-      <w:proofErr w:type="spellEnd"/>
-      <w:r>
-        <w:t xml:space="preserve">. Falls du willst </w:t>
-      </w:r>
-      <w:proofErr w:type="spellStart"/>
-      <w:r>
-        <w:t>elif</w:t>
-      </w:r>
-      <w:proofErr w:type="spellEnd"/>
-      <w:r>
-        <w:t xml:space="preserve"> kannst du noch mehr machen </w:t>
-      </w:r>
-      <w:proofErr w:type="spellStart"/>
-      <w:r>
-        <w:t>wenns</w:t>
-      </w:r>
-      <w:proofErr w:type="spellEnd"/>
-      <w:r>
-        <w:t xml:space="preserve"> Projekt fertig ist, aber ist egal eigentlich.))</w:t>
-      </w:r>
-    </w:p>
-    <w:p>
-      <w:r>
-        <w:t xml:space="preserve">((Erwähnenswert zu sagen ist, dass testen natürlich schlecht gegangen ist, weil man natürlich immer </w:t>
-      </w:r>
-      <w:proofErr w:type="spellStart"/>
-      <w:r>
-        <w:t>mega</w:t>
-      </w:r>
-      <w:proofErr w:type="spellEnd"/>
-      <w:r>
-        <w:t xml:space="preserve"> lange warten </w:t>
-      </w:r>
-      <w:proofErr w:type="gramStart"/>
-      <w:r>
-        <w:t>muss</w:t>
-      </w:r>
-      <w:proofErr w:type="gramEnd"/>
-      <w:r>
-        <w:t xml:space="preserve"> bis ein sich </w:t>
-      </w:r>
-      <w:proofErr w:type="spellStart"/>
-      <w:r>
-        <w:t>irgend was</w:t>
-      </w:r>
-      <w:proofErr w:type="spellEnd"/>
-      <w:r>
-        <w:t xml:space="preserve"> in Schwunge setzt. Deswegen habe ich eine komplette </w:t>
-      </w:r>
-      <w:proofErr w:type="spellStart"/>
-      <w:r>
-        <w:t>test</w:t>
-      </w:r>
-      <w:proofErr w:type="spellEnd"/>
-      <w:r>
-        <w:t xml:space="preserve"> </w:t>
-      </w:r>
-      <w:proofErr w:type="spellStart"/>
-      <w:r>
-        <w:t>version</w:t>
-      </w:r>
-      <w:proofErr w:type="spellEnd"/>
-      <w:r>
-        <w:t xml:space="preserve"> gemacht von dem System, was halt Ticket und Konzert Daten sofort rüberschickt.))</w:t>
-      </w:r>
-    </w:p>
-    <w:p>
-      <w:pPr>
-        <w:pStyle w:val="berschrift2"/>
-      </w:pPr>
-      <w:r>
-        <w:t xml:space="preserve">Technical </w:t>
-      </w:r>
-      <w:proofErr w:type="spellStart"/>
-      <w:r>
-        <w:t>D</w:t>
-      </w:r>
-      <w:r>
-        <w:t>ebt</w:t>
-      </w:r>
-      <w:proofErr w:type="spellEnd"/>
-    </w:p>
-    <w:p>
-      <w:r>
-        <w:t xml:space="preserve">Da es sich um ein Schulprojekt mit begrenztem Zeitrahmen handelt, wurden Technical </w:t>
-      </w:r>
-      <w:proofErr w:type="spellStart"/>
-      <w:r>
-        <w:t>Debts</w:t>
-      </w:r>
-      <w:proofErr w:type="spellEnd"/>
-      <w:r>
-        <w:t xml:space="preserve"> bewusst in Kauf genommen.</w:t>
-      </w:r>
-    </w:p>
-    <w:p>
-      <w:pPr>
-        <w:pStyle w:val="berschrift3"/>
-      </w:pPr>
-      <w:r>
-        <w:t xml:space="preserve">Silent </w:t>
-      </w:r>
-      <w:proofErr w:type="spellStart"/>
-      <w:r>
-        <w:t>Failure</w:t>
-      </w:r>
-      <w:proofErr w:type="spellEnd"/>
-    </w:p>
-    <w:p>
-      <w:r>
-        <w:t xml:space="preserve">Ungültige oder nicht registrierte Einladungs-Benutzernamen werden </w:t>
-      </w:r>
-      <w:proofErr w:type="gramStart"/>
-      <w:r>
-        <w:t>stillschweigend</w:t>
-      </w:r>
-      <w:proofErr w:type="gramEnd"/>
-      <w:r>
-        <w:t xml:space="preserve"> ignoriert, ohne den Benutzer zu informieren.</w:t>
-      </w:r>
-      <w:r>
-        <w:t xml:space="preserve"> Der Concert Ticket Watcher wird nicht crashen, dies ist weiterhing robust.</w:t>
-      </w:r>
-    </w:p>
-    <w:p>
-      <w:pPr>
-        <w:pStyle w:val="berschrift3"/>
-      </w:pPr>
-      <w:r>
-        <w:t xml:space="preserve">Alles nur auf einem Computer </w:t>
-      </w:r>
-    </w:p>
-    <w:p>
-      <w:r>
-        <w:t xml:space="preserve">Das gesamte System läuft auf einer einzigen lokalen Maschine. Kommunikation zwischen mehreren Computern wird nicht unterstützt. </w:t>
-      </w:r>
-    </w:p>
-    <w:p>
-      <w:pPr>
-        <w:pStyle w:val="berschrift3"/>
-      </w:pPr>
-      <w:r>
-        <w:t>Nicht das effizienteste Backend</w:t>
-      </w:r>
-    </w:p>
-    <w:p>
-      <w:r>
-        <w:t>Kein Global-Class-Handler</w:t>
-      </w:r>
-      <w:r>
-        <w:t>: A</w:t>
-      </w:r>
-      <w:r>
-        <w:t>lle Klassen müssen in Setup.java manuell instanziiert und injiziert werden. Es gibt kein automatisches Dependency-Injection-System wie in Spring Boot, das Klassen selbstständig erkennt und verdrahtet.</w:t>
-      </w:r>
-    </w:p>
-    <w:p>
-      <w:r>
-        <w:t>Kein DTO-System</w:t>
-      </w:r>
-      <w:r>
-        <w:t xml:space="preserve">: </w:t>
-      </w:r>
-      <w:r>
-        <w:t xml:space="preserve">Input und Output werden als einfache String-Schlüssellisten definiert. Es gibt keine Garantie zur Kompilierzeit, dass die Schlüssel mit den BPMN-Prozessvariablen übereinstimmen. </w:t>
-      </w:r>
-    </w:p>
-    <w:p>
-      <w:r>
-        <w:t>Schlechtes Error-Handling</w:t>
-      </w:r>
-      <w:r>
-        <w:t xml:space="preserve">: </w:t>
-      </w:r>
-      <w:r>
-        <w:t xml:space="preserve">Fast alle Fehler werden als generische RuntimeException weitergegeben. Es wird </w:t>
-      </w:r>
-      <w:r>
-        <w:t xml:space="preserve">ebenfalls </w:t>
-      </w:r>
-      <w:r>
-        <w:t xml:space="preserve">nicht zwischen behebbaren und nicht behebbaren Fehlern unterschieden. </w:t>
-      </w:r>
-    </w:p>
-    <w:p>
-      <w:r>
-        <w:lastRenderedPageBreak/>
-        <w:t>Keine Unit-Tests</w:t>
-      </w:r>
-      <w:r>
-        <w:t xml:space="preserve"> wurden geschrieben.</w:t>
-      </w:r>
-    </w:p>
-    <w:p/>
-    <w:p>
-      <w:r>
-        <w:br w:type="page"/>
-      </w:r>
-    </w:p>
-    <w:p>
-      <w:pPr>
-        <w:pStyle w:val="berschrift1"/>
-      </w:pPr>
-      <w:bookmarkStart w:id="40" w:name="_Toc225841226"/>
-      <w:bookmarkStart w:id="41" w:name="_Toc225841491"/>
-      <w:r>
-        <w:lastRenderedPageBreak/>
-        <w:t>Fazit</w:t>
-      </w:r>
-      <w:bookmarkEnd w:id="40"/>
-      <w:bookmarkEnd w:id="41"/>
-    </w:p>
-    <w:p>
-      <w:r>
-        <w:t>Beschreibung der gewonnenen Erkenntnisse/Fazit</w:t>
-      </w:r>
-    </w:p>
-    <w:p>
-      <w:pPr>
-        <w:pStyle w:val="berschrift2"/>
-        <w:numPr>
-          <w:ilvl w:val="1"/>
-          <w:numId w:val="1"/>
-        </w:numPr>
-      </w:pPr>
-      <w:bookmarkStart w:id="42" w:name="_Toc225841227"/>
-      <w:bookmarkStart w:id="43" w:name="_Toc225841492"/>
-      <w:r>
-        <w:t>Schwierigkeiten</w:t>
-      </w:r>
-      <w:bookmarkEnd w:id="42"/>
-      <w:bookmarkEnd w:id="43"/>
-    </w:p>
-    <w:p>
-      <w:r>
-        <w:t>X</w:t>
-      </w:r>
-    </w:p>
-    <w:p>
-      <w:pPr>
-        <w:pStyle w:val="berschrift2"/>
-        <w:numPr>
-          <w:ilvl w:val="1"/>
-          <w:numId w:val="1"/>
-        </w:numPr>
-      </w:pPr>
-      <w:bookmarkStart w:id="44" w:name="_Toc225841228"/>
-      <w:bookmarkStart w:id="45" w:name="_Toc225841493"/>
-      <w:r>
-        <w:t>Reflektion</w:t>
-      </w:r>
-      <w:bookmarkEnd w:id="44"/>
-      <w:bookmarkEnd w:id="45"/>
-    </w:p>
-    <w:p>
-      <w:r>
-        <w:t>X</w:t>
+        <w:t>Das Projekt hat gezeigt, dass Camunda eine leistungsfähige Plattform f</w:t>
+      </w:r>
+      <w:r>
+        <w:t>ü</w:t>
+      </w:r>
+      <w:r>
+        <w:t>r die Automatisierung von Gesch</w:t>
+      </w:r>
+      <w:r>
+        <w:t>ä</w:t>
+      </w:r>
+      <w:r>
+        <w:t>ftsprozessen ist, die jedoch eine steile Lernkurve mit sich bringt. Die Kombination aus BPMN-Prozessmodellierung und externem Java-Backend hat sich als sinnvoll erwiesen, da beide Teile unabh</w:t>
+      </w:r>
+      <w:r>
+        <w:t>ä</w:t>
+      </w:r>
+      <w:r>
+        <w:t>ngig voneinander entwickelt und getestet werden konnten. Besonders wertvoll war die Erkenntnis, dass ein klar strukturiertes Backend mit definierten Schichten die Entwicklung erheblich erleichtert und sp</w:t>
+      </w:r>
+      <w:r>
+        <w:t>ä</w:t>
+      </w:r>
+      <w:r>
+        <w:t>tere Erweiterungen vereinfacht. Insgesamt war das Projekt trotz der technischen Schwierigkeiten eine lehrreiche Erfahrung im Umgang mit prozessgetriebenen Systemen.</w:t>
       </w:r>
     </w:p>
     <w:sectPr>
-      <w:footerReference w:type="default" r:id="rId16"/>
+      <w:footerReference w:type="default" r:id="rId23"/>
       <w:pgSz w:w="11906" w:h="16838" w:code="9"/>
       <w:pgMar w:top="2268" w:right="1134" w:bottom="1134" w:left="1418" w:header="397" w:footer="397" w:gutter="0"/>
       <w:cols w:space="708"/>
@@ -3015,27 +4834,7 @@
             <w:sz w:val="20"/>
             <w:szCs w:val="20"/>
           </w:rPr>
-          <w:t xml:space="preserve">Geschäftsprozesse mit </w:t>
-        </w:r>
-        <w:proofErr w:type="spellStart"/>
-        <w:r>
-          <w:rPr>
-            <w:rFonts w:cs="Arial"/>
-            <w:b/>
-            <w:sz w:val="20"/>
-            <w:szCs w:val="20"/>
-          </w:rPr>
-          <w:t>Caumunda</w:t>
-        </w:r>
-        <w:proofErr w:type="spellEnd"/>
-        <w:r>
-          <w:rPr>
-            <w:rFonts w:cs="Arial"/>
-            <w:b/>
-            <w:sz w:val="20"/>
-            <w:szCs w:val="20"/>
-          </w:rPr>
-          <w:t>-Plattform</w:t>
+          <w:t>Geschäftsprozesse mit Camunda-Plattform</w:t>
         </w:r>
       </w:p>
     </w:sdtContent>
@@ -3277,27 +5076,7 @@
             <w:sz w:val="20"/>
             <w:szCs w:val="20"/>
           </w:rPr>
-          <w:t xml:space="preserve">Geschäftsprozesse mit </w:t>
-        </w:r>
-        <w:proofErr w:type="spellStart"/>
-        <w:r>
-          <w:rPr>
-            <w:rFonts w:cs="Arial"/>
-            <w:b/>
-            <w:sz w:val="20"/>
-            <w:szCs w:val="20"/>
-          </w:rPr>
-          <w:t>Caumunda</w:t>
-        </w:r>
-        <w:proofErr w:type="spellEnd"/>
-        <w:r>
-          <w:rPr>
-            <w:rFonts w:cs="Arial"/>
-            <w:b/>
-            <w:sz w:val="20"/>
-            <w:szCs w:val="20"/>
-          </w:rPr>
-          <w:t>-Plattform</w:t>
+          <w:t>Geschäftsprozesse mit Camunda-Plattform</w:t>
         </w:r>
       </w:p>
     </w:sdtContent>
@@ -3835,6 +5614,84 @@
     </w:lvl>
   </w:abstractNum>
   <w:abstractNum w:abstractNumId="5" w15:restartNumberingAfterBreak="0">
+    <w:nsid w:val="44DD11C3"/>
+    <w:multiLevelType w:val="hybridMultilevel"/>
+    <w:tmpl w:val="53B6BF18"/>
+    <w:lvl w:ilvl="0" w:tplc="AC663502">
+      <w:start w:val="1"/>
+      <w:numFmt w:val="decimal"/>
+      <w:lvlText w:val="%1."/>
+      <w:lvlJc w:val="left"/>
+      <w:pPr>
+        <w:ind w:left="720" w:hanging="360"/>
+      </w:pPr>
+    </w:lvl>
+    <w:lvl w:ilvl="1" w:tplc="DC5E89FC">
+      <w:numFmt w:val="decimal"/>
+      <w:lvlText w:val=""/>
+      <w:lvlJc w:val="left"/>
+      <w:pPr>
+        <w:ind w:left="0" w:firstLine="0"/>
+      </w:pPr>
+    </w:lvl>
+    <w:lvl w:ilvl="2" w:tplc="0F0A3770">
+      <w:numFmt w:val="decimal"/>
+      <w:lvlText w:val=""/>
+      <w:lvlJc w:val="left"/>
+      <w:pPr>
+        <w:ind w:left="0" w:firstLine="0"/>
+      </w:pPr>
+    </w:lvl>
+    <w:lvl w:ilvl="3" w:tplc="49989EA8">
+      <w:numFmt w:val="decimal"/>
+      <w:lvlText w:val=""/>
+      <w:lvlJc w:val="left"/>
+      <w:pPr>
+        <w:ind w:left="0" w:firstLine="0"/>
+      </w:pPr>
+    </w:lvl>
+    <w:lvl w:ilvl="4" w:tplc="10BA079A">
+      <w:numFmt w:val="decimal"/>
+      <w:lvlText w:val=""/>
+      <w:lvlJc w:val="left"/>
+      <w:pPr>
+        <w:ind w:left="0" w:firstLine="0"/>
+      </w:pPr>
+    </w:lvl>
+    <w:lvl w:ilvl="5" w:tplc="016C0E6E">
+      <w:numFmt w:val="decimal"/>
+      <w:lvlText w:val=""/>
+      <w:lvlJc w:val="left"/>
+      <w:pPr>
+        <w:ind w:left="0" w:firstLine="0"/>
+      </w:pPr>
+    </w:lvl>
+    <w:lvl w:ilvl="6" w:tplc="016CD5C0">
+      <w:numFmt w:val="decimal"/>
+      <w:lvlText w:val=""/>
+      <w:lvlJc w:val="left"/>
+      <w:pPr>
+        <w:ind w:left="0" w:firstLine="0"/>
+      </w:pPr>
+    </w:lvl>
+    <w:lvl w:ilvl="7" w:tplc="B9EE90EC">
+      <w:numFmt w:val="decimal"/>
+      <w:lvlText w:val=""/>
+      <w:lvlJc w:val="left"/>
+      <w:pPr>
+        <w:ind w:left="0" w:firstLine="0"/>
+      </w:pPr>
+    </w:lvl>
+    <w:lvl w:ilvl="8" w:tplc="52141F58">
+      <w:numFmt w:val="decimal"/>
+      <w:lvlText w:val=""/>
+      <w:lvlJc w:val="left"/>
+      <w:pPr>
+        <w:ind w:left="0" w:firstLine="0"/>
+      </w:pPr>
+    </w:lvl>
+  </w:abstractNum>
+  <w:abstractNum w:abstractNumId="6" w15:restartNumberingAfterBreak="0">
     <w:nsid w:val="480123CF"/>
     <w:multiLevelType w:val="hybridMultilevel"/>
     <w:tmpl w:val="49C8D896"/>
@@ -3923,7 +5780,7 @@
       </w:pPr>
     </w:lvl>
   </w:abstractNum>
-  <w:abstractNum w:abstractNumId="6" w15:restartNumberingAfterBreak="0">
+  <w:abstractNum w:abstractNumId="7" w15:restartNumberingAfterBreak="0">
     <w:nsid w:val="48E969D4"/>
     <w:multiLevelType w:val="multilevel"/>
     <w:tmpl w:val="7DDE29BE"/>
@@ -4036,7 +5893,7 @@
       </w:pPr>
     </w:lvl>
   </w:abstractNum>
-  <w:abstractNum w:abstractNumId="7" w15:restartNumberingAfterBreak="0">
+  <w:abstractNum w:abstractNumId="8" w15:restartNumberingAfterBreak="0">
     <w:nsid w:val="57883665"/>
     <w:multiLevelType w:val="hybridMultilevel"/>
     <w:tmpl w:val="89B2F2DA"/>
@@ -4125,7 +5982,7 @@
       </w:pPr>
     </w:lvl>
   </w:abstractNum>
-  <w:abstractNum w:abstractNumId="8" w15:restartNumberingAfterBreak="0">
+  <w:abstractNum w:abstractNumId="9" w15:restartNumberingAfterBreak="0">
     <w:nsid w:val="5EC9065C"/>
     <w:multiLevelType w:val="hybridMultilevel"/>
     <w:tmpl w:val="4E20A2EE"/>
@@ -4238,7 +6095,7 @@
       </w:rPr>
     </w:lvl>
   </w:abstractNum>
-  <w:abstractNum w:abstractNumId="9" w15:restartNumberingAfterBreak="0">
+  <w:abstractNum w:abstractNumId="10" w15:restartNumberingAfterBreak="0">
     <w:nsid w:val="62827382"/>
     <w:multiLevelType w:val="hybridMultilevel"/>
     <w:tmpl w:val="3E88506A"/>
@@ -4324,7 +6181,7 @@
       </w:pPr>
     </w:lvl>
   </w:abstractNum>
-  <w:abstractNum w:abstractNumId="10" w15:restartNumberingAfterBreak="0">
+  <w:abstractNum w:abstractNumId="11" w15:restartNumberingAfterBreak="0">
     <w:nsid w:val="71B508FE"/>
     <w:multiLevelType w:val="multilevel"/>
     <w:tmpl w:val="40846DB8"/>
@@ -4437,7 +6294,7 @@
       </w:pPr>
     </w:lvl>
   </w:abstractNum>
-  <w:abstractNum w:abstractNumId="11" w15:restartNumberingAfterBreak="0">
+  <w:abstractNum w:abstractNumId="12" w15:restartNumberingAfterBreak="0">
     <w:nsid w:val="72D82024"/>
     <w:multiLevelType w:val="hybridMultilevel"/>
     <w:tmpl w:val="E5465136"/>
@@ -4557,19 +6414,19 @@
     <w:abstractNumId w:val="2"/>
   </w:num>
   <w:num w:numId="3" w16cid:durableId="1161968520">
-    <w:abstractNumId w:val="9"/>
+    <w:abstractNumId w:val="10"/>
   </w:num>
   <w:num w:numId="4" w16cid:durableId="1349483546">
     <w:abstractNumId w:val="3"/>
   </w:num>
   <w:num w:numId="5" w16cid:durableId="974798610">
-    <w:abstractNumId w:val="7"/>
+    <w:abstractNumId w:val="8"/>
   </w:num>
   <w:num w:numId="6" w16cid:durableId="21710598">
-    <w:abstractNumId w:val="8"/>
+    <w:abstractNumId w:val="9"/>
   </w:num>
   <w:num w:numId="7" w16cid:durableId="443036039">
-    <w:abstractNumId w:val="11"/>
+    <w:abstractNumId w:val="12"/>
   </w:num>
   <w:num w:numId="8" w16cid:durableId="1682514158">
     <w:abstractNumId w:val="1"/>
@@ -4578,16 +6435,30 @@
     <w:abstractNumId w:val="4"/>
   </w:num>
   <w:num w:numId="10" w16cid:durableId="685860668">
-    <w:abstractNumId w:val="5"/>
+    <w:abstractNumId w:val="6"/>
   </w:num>
   <w:num w:numId="11" w16cid:durableId="1978560418">
-    <w:abstractNumId w:val="6"/>
+    <w:abstractNumId w:val="7"/>
   </w:num>
   <w:num w:numId="12" w16cid:durableId="1638950882">
-    <w:abstractNumId w:val="10"/>
+    <w:abstractNumId w:val="11"/>
   </w:num>
   <w:num w:numId="13" w16cid:durableId="867334196">
     <w:abstractNumId w:val="0"/>
+  </w:num>
+  <w:num w:numId="14" w16cid:durableId="1697804625">
+    <w:abstractNumId w:val="5"/>
+    <w:lvlOverride w:ilvl="0">
+      <w:startOverride w:val="1"/>
+    </w:lvlOverride>
+    <w:lvlOverride w:ilvl="1"/>
+    <w:lvlOverride w:ilvl="2"/>
+    <w:lvlOverride w:ilvl="3"/>
+    <w:lvlOverride w:ilvl="4"/>
+    <w:lvlOverride w:ilvl="5"/>
+    <w:lvlOverride w:ilvl="6"/>
+    <w:lvlOverride w:ilvl="7"/>
+    <w:lvlOverride w:ilvl="8"/>
   </w:num>
 </w:numbering>
 </file>
@@ -4990,7 +6861,7 @@
   <w:style w:type="paragraph" w:default="1" w:styleId="Standard">
     <w:name w:val="Normal"/>
     <w:qFormat/>
-    <w:rsid w:val="00A84743"/>
+    <w:rsid w:val="00D9293A"/>
     <w:pPr>
       <w:spacing w:after="120" w:line="240" w:lineRule="auto"/>
       <w:jc w:val="both"/>
@@ -5240,6 +7111,7 @@
   <w:style w:type="character" w:default="1" w:styleId="Absatz-Standardschriftart">
     <w:name w:val="Default Paragraph Font"/>
     <w:uiPriority w:val="1"/>
+    <w:semiHidden/>
     <w:unhideWhenUsed/>
   </w:style>
   <w:style w:type="table" w:default="1" w:styleId="NormaleTabelle">
@@ -5639,7 +7511,6 @@
   <w:style w:type="paragraph" w:styleId="KeinLeerraum">
     <w:name w:val="No Spacing"/>
     <w:uiPriority w:val="1"/>
-    <w:semiHidden/>
     <w:qFormat/>
     <w:rsid w:val="00AF2D2C"/>
     <w:pPr>
@@ -5817,6 +7688,82 @@
       <w:szCs w:val="20"/>
     </w:rPr>
   </w:style>
+  <w:style w:type="table" w:styleId="Gitternetztabelle4Akzent1">
+    <w:name w:val="Grid Table 4 Accent 1"/>
+    <w:basedOn w:val="NormaleTabelle"/>
+    <w:uiPriority w:val="49"/>
+    <w:rsid w:val="004134A9"/>
+    <w:pPr>
+      <w:spacing w:after="0" w:line="240" w:lineRule="auto"/>
+    </w:pPr>
+    <w:tblPr>
+      <w:tblStyleRowBandSize w:val="1"/>
+      <w:tblStyleColBandSize w:val="1"/>
+      <w:tblBorders>
+        <w:top w:val="single" w:sz="4" w:space="0" w:color="95B3D7" w:themeColor="accent1" w:themeTint="99"/>
+        <w:left w:val="single" w:sz="4" w:space="0" w:color="95B3D7" w:themeColor="accent1" w:themeTint="99"/>
+        <w:bottom w:val="single" w:sz="4" w:space="0" w:color="95B3D7" w:themeColor="accent1" w:themeTint="99"/>
+        <w:right w:val="single" w:sz="4" w:space="0" w:color="95B3D7" w:themeColor="accent1" w:themeTint="99"/>
+        <w:insideH w:val="single" w:sz="4" w:space="0" w:color="95B3D7" w:themeColor="accent1" w:themeTint="99"/>
+        <w:insideV w:val="single" w:sz="4" w:space="0" w:color="95B3D7" w:themeColor="accent1" w:themeTint="99"/>
+      </w:tblBorders>
+    </w:tblPr>
+    <w:tblStylePr w:type="firstRow">
+      <w:rPr>
+        <w:b/>
+        <w:bCs/>
+        <w:color w:val="FFFFFF" w:themeColor="background1"/>
+      </w:rPr>
+      <w:tblPr/>
+      <w:tcPr>
+        <w:tcBorders>
+          <w:top w:val="single" w:sz="4" w:space="0" w:color="4F81BD" w:themeColor="accent1"/>
+          <w:left w:val="single" w:sz="4" w:space="0" w:color="4F81BD" w:themeColor="accent1"/>
+          <w:bottom w:val="single" w:sz="4" w:space="0" w:color="4F81BD" w:themeColor="accent1"/>
+          <w:right w:val="single" w:sz="4" w:space="0" w:color="4F81BD" w:themeColor="accent1"/>
+          <w:insideH w:val="nil"/>
+          <w:insideV w:val="nil"/>
+        </w:tcBorders>
+        <w:shd w:val="clear" w:color="auto" w:fill="4F81BD" w:themeFill="accent1"/>
+      </w:tcPr>
+    </w:tblStylePr>
+    <w:tblStylePr w:type="lastRow">
+      <w:rPr>
+        <w:b/>
+        <w:bCs/>
+      </w:rPr>
+      <w:tblPr/>
+      <w:tcPr>
+        <w:tcBorders>
+          <w:top w:val="double" w:sz="4" w:space="0" w:color="4F81BD" w:themeColor="accent1"/>
+        </w:tcBorders>
+      </w:tcPr>
+    </w:tblStylePr>
+    <w:tblStylePr w:type="firstCol">
+      <w:rPr>
+        <w:b/>
+        <w:bCs/>
+      </w:rPr>
+    </w:tblStylePr>
+    <w:tblStylePr w:type="lastCol">
+      <w:rPr>
+        <w:b/>
+        <w:bCs/>
+      </w:rPr>
+    </w:tblStylePr>
+    <w:tblStylePr w:type="band1Vert">
+      <w:tblPr/>
+      <w:tcPr>
+        <w:shd w:val="clear" w:color="auto" w:fill="DBE5F1" w:themeFill="accent1" w:themeFillTint="33"/>
+      </w:tcPr>
+    </w:tblStylePr>
+    <w:tblStylePr w:type="band1Horz">
+      <w:tblPr/>
+      <w:tcPr>
+        <w:shd w:val="clear" w:color="auto" w:fill="DBE5F1" w:themeFill="accent1" w:themeFillTint="33"/>
+      </w:tcPr>
+    </w:tblStylePr>
+  </w:style>
 </w:styles>
 </file>
 
@@ -5825,7 +7772,7 @@
   <w:docParts>
     <w:docPart>
       <w:docPartPr>
-        <w:name w:val="C5304EA0CA654A5986347505373CA065"/>
+        <w:name w:val="31D0E08FBBED47499BDA367AC219F700"/>
         <w:category>
           <w:name w:val="Allgemein"/>
           <w:gallery w:val="placeholder"/>
@@ -5836,105 +7783,18 @@
         <w:behaviors>
           <w:behavior w:val="content"/>
         </w:behaviors>
-        <w:guid w:val="{4F78C7DD-DA69-4C90-91B7-C26409E28FB0}"/>
+        <w:guid w:val="{B0051581-C8CB-47BC-87A1-F4E5023F8F03}"/>
       </w:docPartPr>
       <w:docPartBody>
         <w:p>
           <w:pPr>
-            <w:pStyle w:val="C5304EA0CA654A5986347505373CA065"/>
-          </w:pPr>
-          <w:r>
-            <w:rPr>
-              <w:rStyle w:val="Platzhaltertext"/>
-            </w:rPr>
-            <w:t>[Titel]</w:t>
-          </w:r>
-        </w:p>
-      </w:docPartBody>
-    </w:docPart>
-    <w:docPart>
-      <w:docPartPr>
-        <w:name w:val="D51AD77C775644BAB5DB722052C415C6"/>
-        <w:category>
-          <w:name w:val="Allgemein"/>
-          <w:gallery w:val="placeholder"/>
-        </w:category>
-        <w:types>
-          <w:type w:val="bbPlcHdr"/>
-        </w:types>
-        <w:behaviors>
-          <w:behavior w:val="content"/>
-        </w:behaviors>
-        <w:guid w:val="{5C51507E-8FDB-45AD-A26A-D72EE585EEA7}"/>
-      </w:docPartPr>
-      <w:docPartBody>
-        <w:p>
-          <w:pPr>
-            <w:pStyle w:val="D51AD77C775644BAB5DB722052C415C6"/>
+            <w:pStyle w:val="31D0E08FBBED47499BDA367AC219F700"/>
           </w:pPr>
           <w:r>
             <w:rPr>
               <w:rStyle w:val="Platzhaltertext"/>
             </w:rPr>
             <w:t>[Betreff]</w:t>
-          </w:r>
-        </w:p>
-      </w:docPartBody>
-    </w:docPart>
-    <w:docPart>
-      <w:docPartPr>
-        <w:name w:val="190E91473F86429896951F5616D59CD5"/>
-        <w:category>
-          <w:name w:val="Allgemein"/>
-          <w:gallery w:val="placeholder"/>
-        </w:category>
-        <w:types>
-          <w:type w:val="bbPlcHdr"/>
-        </w:types>
-        <w:behaviors>
-          <w:behavior w:val="content"/>
-        </w:behaviors>
-        <w:guid w:val="{11B47CD3-A6FA-4A8F-AA3E-5B50F6D79CD1}"/>
-      </w:docPartPr>
-      <w:docPartBody>
-        <w:p>
-          <w:pPr>
-            <w:pStyle w:val="190E91473F86429896951F5616D59CD5"/>
-          </w:pPr>
-          <w:r>
-            <w:rPr>
-              <w:rStyle w:val="Platzhaltertext"/>
-            </w:rPr>
-            <w:t>[Autor]</w:t>
-          </w:r>
-        </w:p>
-      </w:docPartBody>
-    </w:docPart>
-    <w:docPart>
-      <w:docPartPr>
-        <w:name w:val="4C60AFF0BB7841C189B9723E28273B32"/>
-        <w:category>
-          <w:name w:val="Allgemein"/>
-          <w:gallery w:val="placeholder"/>
-        </w:category>
-        <w:types>
-          <w:type w:val="bbPlcHdr"/>
-        </w:types>
-        <w:behaviors>
-          <w:behavior w:val="content"/>
-        </w:behaviors>
-        <w:guid w:val="{F88B41B5-1DC5-4F23-8412-B65D1C175DFC}"/>
-      </w:docPartPr>
-      <w:docPartBody>
-        <w:p>
-          <w:pPr>
-            <w:pStyle w:val="4C60AFF0BB7841C189B9723E28273B32"/>
-          </w:pPr>
-          <w:r>
-            <w:rPr>
-              <w:rStyle w:val="Platzhaltertext"/>
-            </w:rPr>
-            <w:t>[Firmen-E-Mail-Adresse]</w:t>
           </w:r>
         </w:p>
       </w:docPartBody>
@@ -6001,6 +7861,13 @@
     <w:pitch w:val="variable"/>
     <w:sig w:usb0="E1002EFF" w:usb1="C000605B" w:usb2="00000029" w:usb3="00000000" w:csb0="000101FF" w:csb1="00000000"/>
   </w:font>
+  <w:font w:name="Eras Demi ITC">
+    <w:panose1 w:val="020B0805030504020804"/>
+    <w:charset w:val="00"/>
+    <w:family w:val="swiss"/>
+    <w:pitch w:val="variable"/>
+    <w:sig w:usb0="00000003" w:usb1="00000000" w:usb2="00000000" w:usb3="00000000" w:csb0="00000001" w:csb1="00000000"/>
+  </w:font>
   <w:font w:name="Aptos">
     <w:charset w:val="00"/>
     <w:family w:val="swiss"/>
@@ -6033,11 +7900,18 @@
   </w:compat>
   <w:rsids>
     <w:rsidRoot w:val="00876153"/>
+    <w:rsid w:val="000F3AAB"/>
     <w:rsid w:val="00181D17"/>
     <w:rsid w:val="00232454"/>
+    <w:rsid w:val="00237D2A"/>
+    <w:rsid w:val="00246786"/>
     <w:rsid w:val="00391460"/>
+    <w:rsid w:val="0073289D"/>
     <w:rsid w:val="00876153"/>
     <w:rsid w:val="00877AD1"/>
+    <w:rsid w:val="008E058B"/>
+    <w:rsid w:val="0096784D"/>
+    <w:rsid w:val="00983AE7"/>
     <w:rsid w:val="00AE0E7F"/>
     <w:rsid w:val="00B7639F"/>
     <w:rsid w:val="00BC5649"/>
@@ -6049,6 +7923,7 @@
     <w:rsid w:val="00DF201F"/>
     <w:rsid w:val="00E7682E"/>
     <w:rsid w:val="00F63841"/>
+    <w:rsid w:val="00F84112"/>
   </w:rsids>
   <m:mathPr>
     <m:mathFont m:val="Cambria Math"/>
@@ -6504,21 +8379,11 @@
     <w:basedOn w:val="Absatz-Standardschriftart"/>
     <w:uiPriority w:val="99"/>
     <w:semiHidden/>
-    <w:rPr>
-      <w:color w:val="808080"/>
-    </w:rPr>
+    <w:rsid w:val="000F3AAB"/>
   </w:style>
-  <w:style w:type="paragraph" w:customStyle="1" w:styleId="C5304EA0CA654A5986347505373CA065">
-    <w:name w:val="C5304EA0CA654A5986347505373CA065"/>
-  </w:style>
-  <w:style w:type="paragraph" w:customStyle="1" w:styleId="D51AD77C775644BAB5DB722052C415C6">
-    <w:name w:val="D51AD77C775644BAB5DB722052C415C6"/>
-  </w:style>
-  <w:style w:type="paragraph" w:customStyle="1" w:styleId="190E91473F86429896951F5616D59CD5">
-    <w:name w:val="190E91473F86429896951F5616D59CD5"/>
-  </w:style>
-  <w:style w:type="paragraph" w:customStyle="1" w:styleId="4C60AFF0BB7841C189B9723E28273B32">
-    <w:name w:val="4C60AFF0BB7841C189B9723E28273B32"/>
+  <w:style w:type="paragraph" w:customStyle="1" w:styleId="31D0E08FBBED47499BDA367AC219F700">
+    <w:name w:val="31D0E08FBBED47499BDA367AC219F700"/>
+    <w:rsid w:val="000F3AAB"/>
   </w:style>
 </w:styles>
 </file>
@@ -6829,26 +8694,6 @@
 </file>
 
 <file path=customXml/item3.xml><?xml version="1.0" encoding="utf-8"?>
-<p:properties xmlns:p="http://schemas.microsoft.com/office/2006/metadata/properties" xmlns:xsi="http://www.w3.org/2001/XMLSchema-instance" xmlns:pc="http://schemas.microsoft.com/office/infopath/2007/PartnerControls">
-  <documentManagement>
-    <lcf76f155ced4ddcb4097134ff3c332f xmlns="1206c148-b44b-4150-a48e-c9e11c6384dc">
-      <Terms xmlns="http://schemas.microsoft.com/office/infopath/2007/PartnerControls"/>
-    </lcf76f155ced4ddcb4097134ff3c332f>
-    <TaxCatchAll xmlns="b0d3a2a8-69d8-448b-8133-055c8e1aa511" xsi:nil="true"/>
-  </documentManagement>
-</p:properties>
-</file>
-
-<file path=customXml/item4.xml><?xml version="1.0" encoding="utf-8"?>
-<?mso-contentType ?>
-<FormTemplates xmlns="http://schemas.microsoft.com/sharepoint/v3/contenttype/forms">
-  <Display>DocumentLibraryForm</Display>
-  <Edit>DocumentLibraryForm</Edit>
-  <New>DocumentLibraryForm</New>
-</FormTemplates>
-</file>
-
-<file path=customXml/item5.xml><?xml version="1.0" encoding="utf-8"?>
 <ct:contentTypeSchema xmlns:ct="http://schemas.microsoft.com/office/2006/metadata/contentType" xmlns:ma="http://schemas.microsoft.com/office/2006/metadata/properties/metaAttributes" ct:_="" ma:_="" ma:contentTypeName="Dokument" ma:contentTypeID="0x0101005021337BFA3C9E4D82574699F8ED984B" ma:contentTypeVersion="11" ma:contentTypeDescription="Ein neues Dokument erstellen." ma:contentTypeScope="" ma:versionID="d0065e7575a3665724e33cb7742e8d7d">
   <xsd:schema xmlns:xsd="http://www.w3.org/2001/XMLSchema" xmlns:xs="http://www.w3.org/2001/XMLSchema" xmlns:p="http://schemas.microsoft.com/office/2006/metadata/properties" xmlns:ns2="1206c148-b44b-4150-a48e-c9e11c6384dc" xmlns:ns3="b0d3a2a8-69d8-448b-8133-055c8e1aa511" targetNamespace="http://schemas.microsoft.com/office/2006/metadata/properties" ma:root="true" ma:fieldsID="5c97e36ac8f8a572f9504f173cd6a73c" ns2:_="" ns3:_="">
     <xsd:import namespace="1206c148-b44b-4150-a48e-c9e11c6384dc"/>
@@ -7043,6 +8888,26 @@
 </ct:contentTypeSchema>
 </file>
 
+<file path=customXml/item4.xml><?xml version="1.0" encoding="utf-8"?>
+<?mso-contentType ?>
+<FormTemplates xmlns="http://schemas.microsoft.com/sharepoint/v3/contenttype/forms">
+  <Display>DocumentLibraryForm</Display>
+  <Edit>DocumentLibraryForm</Edit>
+  <New>DocumentLibraryForm</New>
+</FormTemplates>
+</file>
+
+<file path=customXml/item5.xml><?xml version="1.0" encoding="utf-8"?>
+<p:properties xmlns:p="http://schemas.microsoft.com/office/2006/metadata/properties" xmlns:xsi="http://www.w3.org/2001/XMLSchema-instance" xmlns:pc="http://schemas.microsoft.com/office/infopath/2007/PartnerControls">
+  <documentManagement>
+    <lcf76f155ced4ddcb4097134ff3c332f xmlns="1206c148-b44b-4150-a48e-c9e11c6384dc">
+      <Terms xmlns="http://schemas.microsoft.com/office/infopath/2007/PartnerControls"/>
+    </lcf76f155ced4ddcb4097134ff3c332f>
+    <TaxCatchAll xmlns="b0d3a2a8-69d8-448b-8133-055c8e1aa511" xsi:nil="true"/>
+  </documentManagement>
+</p:properties>
+</file>
+
 <file path=customXml/itemProps1.xml><?xml version="1.0" encoding="utf-8"?>
 <ds:datastoreItem xmlns:ds="http://schemas.openxmlformats.org/officeDocument/2006/customXml" ds:itemID="{55AF091B-3C7A-41E3-B477-F2FDAA23CFDA}">
   <ds:schemaRefs>
@@ -7060,25 +8925,6 @@
 </file>
 
 <file path=customXml/itemProps3.xml><?xml version="1.0" encoding="utf-8"?>
-<ds:datastoreItem xmlns:ds="http://schemas.openxmlformats.org/officeDocument/2006/customXml" ds:itemID="{D6AF9132-AF58-4CBB-B245-7968075BCDDA}">
-  <ds:schemaRefs>
-    <ds:schemaRef ds:uri="http://schemas.microsoft.com/office/2006/metadata/properties"/>
-    <ds:schemaRef ds:uri="http://schemas.microsoft.com/office/infopath/2007/PartnerControls"/>
-    <ds:schemaRef ds:uri="1206c148-b44b-4150-a48e-c9e11c6384dc"/>
-    <ds:schemaRef ds:uri="b0d3a2a8-69d8-448b-8133-055c8e1aa511"/>
-  </ds:schemaRefs>
-</ds:datastoreItem>
-</file>
-
-<file path=customXml/itemProps4.xml><?xml version="1.0" encoding="utf-8"?>
-<ds:datastoreItem xmlns:ds="http://schemas.openxmlformats.org/officeDocument/2006/customXml" ds:itemID="{80D0A754-D62F-41B0-A8F1-4B8929ECBD2C}">
-  <ds:schemaRefs>
-    <ds:schemaRef ds:uri="http://schemas.microsoft.com/sharepoint/v3/contenttype/forms"/>
-  </ds:schemaRefs>
-</ds:datastoreItem>
-</file>
-
-<file path=customXml/itemProps5.xml><?xml version="1.0" encoding="utf-8"?>
 <ds:datastoreItem xmlns:ds="http://schemas.openxmlformats.org/officeDocument/2006/customXml" ds:itemID="{855C8AC7-49AC-4DE4-99DA-A2BE3BB78502}">
   <ds:schemaRefs>
     <ds:schemaRef ds:uri="http://schemas.microsoft.com/office/2006/metadata/contentType"/>
@@ -7095,4 +8941,23 @@
     <ds:schemaRef ds:uri="http://schemas.microsoft.com/internal/obd"/>
   </ds:schemaRefs>
 </ds:datastoreItem>
+</file>
+
+<file path=customXml/itemProps4.xml><?xml version="1.0" encoding="utf-8"?>
+<ds:datastoreItem xmlns:ds="http://schemas.openxmlformats.org/officeDocument/2006/customXml" ds:itemID="{80D0A754-D62F-41B0-A8F1-4B8929ECBD2C}">
+  <ds:schemaRefs>
+    <ds:schemaRef ds:uri="http://schemas.microsoft.com/sharepoint/v3/contenttype/forms"/>
+  </ds:schemaRefs>
+</ds:datastoreItem>
+</file>
+
+<file path=customXml/itemProps5.xml><?xml version="1.0" encoding="utf-8"?>
+<ds:datastoreItem xmlns:ds="http://schemas.openxmlformats.org/officeDocument/2006/customXml" ds:itemID="{D6AF9132-AF58-4CBB-B245-7968075BCDDA}">
+  <ds:schemaRefs>
+    <ds:schemaRef ds:uri="http://schemas.microsoft.com/office/2006/metadata/properties"/>
+    <ds:schemaRef ds:uri="http://schemas.microsoft.com/office/infopath/2007/PartnerControls"/>
+    <ds:schemaRef ds:uri="1206c148-b44b-4150-a48e-c9e11c6384dc"/>
+    <ds:schemaRef ds:uri="b0d3a2a8-69d8-448b-8133-055c8e1aa511"/>
+  </ds:schemaRefs>
+</ds:datastoreItem>
 </file>
</xml_diff>